<commit_message>
fix: temporary commit to force staging
</commit_message>
<xml_diff>
--- a/output/DigComp3_digcomp3_nl.docx
+++ b/output/DigComp3_digcomp3_nl.docx
@@ -28,7 +28,42 @@
             <w:tcW w:type="dxa" w:w="3627"/>
             <w:vMerge w:val="restart"/>
           </w:tcPr>
-          <w:p/>
+          <w:p>
+            <w:r>
+              <w:drawing>
+                <wp:inline xmlns:a="http://schemas.openxmlformats.org/drawingml/2006/main" xmlns:pic="http://schemas.openxmlformats.org/drawingml/2006/picture">
+                  <wp:extent cx="1368000" cy="1313629"/>
+                  <wp:docPr id="1" name="Picture 1"/>
+                  <wp:cNvGraphicFramePr>
+                    <a:graphicFrameLocks noChangeAspect="1"/>
+                  </wp:cNvGraphicFramePr>
+                  <a:graphic>
+                    <a:graphicData uri="http://schemas.openxmlformats.org/drawingml/2006/picture">
+                      <pic:pic>
+                        <pic:nvPicPr>
+                          <pic:cNvPr id="0" name="DC3_1p1.png"/>
+                          <pic:cNvPicPr/>
+                        </pic:nvPicPr>
+                        <pic:blipFill>
+                          <a:blip r:embed="rId9"/>
+                          <a:stretch>
+                            <a:fillRect/>
+                          </a:stretch>
+                        </pic:blipFill>
+                        <pic:spPr>
+                          <a:xfrm>
+                            <a:off x="0" y="0"/>
+                            <a:ext cx="1368000" cy="1313629"/>
+                          </a:xfrm>
+                          <a:prstGeom prst="rect"/>
+                        </pic:spPr>
+                      </pic:pic>
+                    </a:graphicData>
+                  </a:graphic>
+                </wp:inline>
+              </w:drawing>
+            </w:r>
+          </w:p>
           <w:p>
             <w:r>
               <w:rPr>
@@ -62,7 +97,7 @@
                 <w:color w:val="000000"/>
                 <w:sz w:val="17"/>
               </w:rPr>
-              <w:t>Het verwoorden van informatiebehoeften, weten hoe en waar te zoeken naar informatie en content in digitale omgevingen, en hiertoe toegang verkrijgen en ertussen navigeren. Het selecteren van geschikte digitale tools om zoekopdrachten in digitale omgevingen te creëren, uit te voeren en bij te werken, en in staat zijn om onderscheid te maken tussen relevante en irrelevante informatie en content.</w:t>
+              <w:t>Het formuleren van informatiebehoeften, weten hoe en waar te zoeken naar informatie en inhoud in digitale omgevingen, en hiertoe toegang verkrijgen en ertussen navigeren. Geschikte digitale middelen selecteren om zoekopdrachten in digitale omgevingen te creëren, uit te voeren en bij te werken, en in staat zijn om onderscheid te maken tussen relevante en irrelevante informatie en inhoud.</w:t>
             </w:r>
           </w:p>
         </w:tc>
@@ -108,7 +143,7 @@
                 <w:color w:val="000000"/>
                 <w:sz w:val="18"/>
               </w:rPr>
-              <w:t xml:space="preserve">De voordelen inzien van het gebruik van verschillende digitale zoekmachines en -methoden, afhankelijk van het doel. </w:t>
+              <w:t xml:space="preserve">De voordelen inzien van het gebruik van verschillende digitale zoekhulpmiddelen en -methoden, afhankelijk van het doel. </w:t>
             </w:r>
             <w:r>
               <w:rPr>
@@ -140,7 +175,7 @@
                 <w:color w:val="000000"/>
                 <w:sz w:val="18"/>
               </w:rPr>
-              <w:t xml:space="preserve">De belangrijkste functies van veelgebruikte AI-gestuurde en traditionele zoekmachines herkennen. </w:t>
+              <w:t xml:space="preserve">De belangrijkste kenmerken identificeren van veelgebruikte AI-gestuurde en traditionele zoekhulpmiddelen. </w:t>
             </w:r>
             <w:r>
               <w:rPr>
@@ -172,7 +207,7 @@
                 <w:color w:val="000000"/>
                 <w:sz w:val="18"/>
               </w:rPr>
-              <w:t xml:space="preserve">Erkennen dat digitale zoekresultaten of output informatie kunnen bevatten die mogelijk niet relevant is, en dat deze afhankelijk zijn van de gebruikte digitale zoekmachine en de wijze waarop de zoekopdracht is gespecificeerd. </w:t>
+              <w:t xml:space="preserve">Herkennen dat digitale zoekresultaten of outputs informatie kunnen bevatten die mogelijk niet relevant is, en dat deze afhankelijk zijn van het gebruikte zoekhulpmiddel en de wijze waarop de zoekopdracht is gespecificeerd. </w:t>
             </w:r>
             <w:r>
               <w:rPr>
@@ -204,7 +239,7 @@
                 <w:color w:val="000000"/>
                 <w:sz w:val="18"/>
               </w:rPr>
-              <w:t xml:space="preserve">Digitale zoekmachines gebruiken om eenvoudige informatiezoekopdrachten uit te voeren, te verfijnen en bij te werken. </w:t>
+              <w:t xml:space="preserve">Digitale zoekhulpmiddelen gebruiken om eenvoudige informatiezoekopdrachten uit te voeren, te verfijnen en bij te werken. </w:t>
             </w:r>
             <w:r>
               <w:rPr>
@@ -241,7 +276,7 @@
                 <w:color w:val="000000"/>
                 <w:sz w:val="18"/>
               </w:rPr>
-              <w:t>Op intermediairniveau kunnen individuen</w:t>
+              <w:t>Op gemiddeldniveau kunnen individuen</w:t>
             </w:r>
           </w:p>
         </w:tc>
@@ -269,7 +304,7 @@
                 <w:color w:val="000000"/>
                 <w:sz w:val="18"/>
               </w:rPr>
-              <w:t xml:space="preserve">Doelgericht nieuwe digitale zoekmachines en -strategieën verkennen. </w:t>
+              <w:t xml:space="preserve">Doelgericht nieuwe digitale zoekhulpmiddelen en strategieën verkennen. </w:t>
             </w:r>
             <w:r>
               <w:rPr>
@@ -301,7 +336,7 @@
                 <w:color w:val="000000"/>
                 <w:sz w:val="18"/>
               </w:rPr>
-              <w:t xml:space="preserve">Passende digitale zoekmachines op basis van informatiebehoeften selecteren. </w:t>
+              <w:t xml:space="preserve">Passende digitale zoekhulpmiddelen selecteren op basis van informatiebehoeften. </w:t>
             </w:r>
             <w:r>
               <w:rPr>
@@ -333,7 +368,7 @@
                 <w:color w:val="000000"/>
                 <w:sz w:val="18"/>
               </w:rPr>
-              <w:t xml:space="preserve">Onderscheid maken tussen meer en minder relevante digitale zoekresultaten of output. </w:t>
+              <w:t xml:space="preserve">Onderscheid maken tussen meer en minder relevante digitale zoekresultaten of outputs. </w:t>
             </w:r>
             <w:r>
               <w:rPr>
@@ -365,7 +400,7 @@
                 <w:color w:val="000000"/>
                 <w:sz w:val="18"/>
               </w:rPr>
-              <w:t xml:space="preserve">Informatiebehoeften vertalen naar effectieve digitale zoekopdrachten, commando's of prompts, en geschikte strategieën toepassen om resultaten te verfijnen of te filteren. </w:t>
+              <w:t xml:space="preserve">Informatiebehoeften vertalen naar effectieve digitale zoekopdrachten, commando's of verklaringen, en passende strategieën toepassen om resultaten te verfijnen of te filteren. </w:t>
             </w:r>
             <w:r>
               <w:rPr>
@@ -402,7 +437,7 @@
                 <w:color w:val="000000"/>
                 <w:sz w:val="18"/>
               </w:rPr>
-              <w:t>Op gevorderdniveau kunnen individuen</w:t>
+              <w:t>Op geavanceerdniveau kunnen individuen</w:t>
             </w:r>
           </w:p>
         </w:tc>
@@ -430,7 +465,7 @@
                 <w:color w:val="000000"/>
                 <w:sz w:val="18"/>
               </w:rPr>
-              <w:t xml:space="preserve">Voortdurend functies en kenmerken van bekende en nieuwe digitale zoekmachines verkennen om competenties te verdiepen. </w:t>
+              <w:t xml:space="preserve">Voortdurend functies en kenmerken van bekende en nieuwe digitale zoekhulpmiddelen verkennen om vaardigheden te verdiepen. </w:t>
             </w:r>
             <w:r>
               <w:rPr>
@@ -462,7 +497,7 @@
                 <w:color w:val="000000"/>
                 <w:sz w:val="18"/>
               </w:rPr>
-              <w:t xml:space="preserve">Een verscheidenheid aan digitale zoekmachines en -strategieën combineren om aan complexe informatiebehoeften te voldoen. </w:t>
+              <w:t xml:space="preserve">Een verscheidenheid aan digitale zoekhulpmiddelen en strategieën combineren om aan complexe informatiebehoeften te voldoen. </w:t>
             </w:r>
             <w:r>
               <w:rPr>
@@ -494,7 +529,7 @@
                 <w:color w:val="000000"/>
                 <w:sz w:val="18"/>
               </w:rPr>
-              <w:t xml:space="preserve">Anderen helpen bij het ontwikkelen van hun digitale zoekcompetenties. </w:t>
+              <w:t xml:space="preserve">Anderen helpen bij het ontwikkelen van hun digitale zoekvaardigheden. </w:t>
             </w:r>
             <w:r>
               <w:rPr>
@@ -531,7 +566,7 @@
                 <w:color w:val="000000"/>
                 <w:sz w:val="18"/>
               </w:rPr>
-              <w:t>Op zeer gevorderdniveau kunnen individuen</w:t>
+              <w:t>Op zeer geavanceerdniveau kunnen individuen</w:t>
             </w:r>
           </w:p>
         </w:tc>
@@ -559,7 +594,7 @@
                 <w:color w:val="000000"/>
                 <w:sz w:val="18"/>
               </w:rPr>
-              <w:t xml:space="preserve">Op de hoogte blijven van ontwikkelingen in digitale zoektechnologie. </w:t>
+              <w:t xml:space="preserve">Op de hoogte blijven van ontwikkelingen in digitale zoektechnologieën. </w:t>
             </w:r>
             <w:r>
               <w:rPr>
@@ -591,7 +626,7 @@
                 <w:color w:val="000000"/>
                 <w:sz w:val="18"/>
               </w:rPr>
-              <w:t xml:space="preserve">Een verscheidenheid aan digitale zoekmachines en -strategieën combineren om aan zeer complexe of gespecialiseerde informatiebehoeften te voldoen. </w:t>
+              <w:t xml:space="preserve">Een verscheidenheid aan digitale zoekhulpmiddelen en strategieën combineren om aan zeer complexe of gespecialiseerde informatiebehoeften te voldoen. </w:t>
             </w:r>
             <w:r>
               <w:rPr>
@@ -698,7 +733,42 @@
             <w:tcW w:type="dxa" w:w="3627"/>
             <w:vMerge w:val="restart"/>
           </w:tcPr>
-          <w:p/>
+          <w:p>
+            <w:r>
+              <w:drawing>
+                <wp:inline xmlns:a="http://schemas.openxmlformats.org/drawingml/2006/main" xmlns:pic="http://schemas.openxmlformats.org/drawingml/2006/picture">
+                  <wp:extent cx="1368000" cy="1315803"/>
+                  <wp:docPr id="2" name="Picture 2"/>
+                  <wp:cNvGraphicFramePr>
+                    <a:graphicFrameLocks noChangeAspect="1"/>
+                  </wp:cNvGraphicFramePr>
+                  <a:graphic>
+                    <a:graphicData uri="http://schemas.openxmlformats.org/drawingml/2006/picture">
+                      <pic:pic>
+                        <pic:nvPicPr>
+                          <pic:cNvPr id="0" name="DC3_1p2.png"/>
+                          <pic:cNvPicPr/>
+                        </pic:nvPicPr>
+                        <pic:blipFill>
+                          <a:blip r:embed="rId10"/>
+                          <a:stretch>
+                            <a:fillRect/>
+                          </a:stretch>
+                        </pic:blipFill>
+                        <pic:spPr>
+                          <a:xfrm>
+                            <a:off x="0" y="0"/>
+                            <a:ext cx="1368000" cy="1315803"/>
+                          </a:xfrm>
+                          <a:prstGeom prst="rect"/>
+                        </pic:spPr>
+                      </pic:pic>
+                    </a:graphicData>
+                  </a:graphic>
+                </wp:inline>
+              </w:drawing>
+            </w:r>
+          </w:p>
           <w:p>
             <w:r>
               <w:rPr>
@@ -720,7 +790,7 @@
                 <w:color w:val="000000"/>
                 <w:sz w:val="22"/>
               </w:rPr>
-              <w:t>1.2 Evalueren van informatie</w:t>
+              <w:t>1.2 Informatie evalueren</w:t>
             </w:r>
           </w:p>
           <w:p>
@@ -732,7 +802,7 @@
                 <w:color w:val="000000"/>
                 <w:sz w:val="17"/>
               </w:rPr>
-              <w:t>Het beoordelen en vergelijken van de geloofwaardigheid en betrouwbaarheid van bronnen van informatie en content in digitale omgevingen. Het interpreteren en kritisch beoordelen van informatie en content in digitale omgevingen en de processen die worden gebruikt om deze te genereren.</w:t>
+              <w:t>De geloofwaardigheid en betrouwbaarheid van informatiebronnen en inhoud in digitale omgevingen beoordelen en vergelijken. Informatie en inhoud in digitale omgevingen, en de processen die worden gebruikt om deze te genereren, interpreteren en kritisch evalueren.</w:t>
             </w:r>
           </w:p>
         </w:tc>
@@ -778,7 +848,7 @@
                 <w:color w:val="000000"/>
                 <w:sz w:val="18"/>
               </w:rPr>
-              <w:t xml:space="preserve">De voordelen inzien van een voorzichtige aanpak bij het interpreteren van informatie en content in digitale omgevingen. </w:t>
+              <w:t xml:space="preserve">De voordelen inzien van een voorzichtige aanpak bij het interpreteren van informatie en inhoud in digitale omgevingen. </w:t>
             </w:r>
             <w:r>
               <w:rPr>
@@ -810,7 +880,7 @@
                 <w:color w:val="000000"/>
                 <w:sz w:val="18"/>
               </w:rPr>
-              <w:t xml:space="preserve">Erkennen dat sommige digitale informatiebronnen en -systemen mogelijk niet betrouwbaar zijn. </w:t>
+              <w:t xml:space="preserve">Herkennen dat sommige digitale informatiebronnen en systemen mogelijk niet betrouwbaar zijn. </w:t>
             </w:r>
             <w:r>
               <w:rPr>
@@ -842,7 +912,7 @@
                 <w:color w:val="000000"/>
                 <w:sz w:val="18"/>
               </w:rPr>
-              <w:t xml:space="preserve">Erkennen dat het moeilijk kan zijn om onderscheid te maken tussen informatie en content gegenereerd door mensen en door AI-systemen. </w:t>
+              <w:t xml:space="preserve">Herkennen dat het moeilijk kan zijn om onderscheid te maken tussen informatie en inhoud gegenereerd door mensen en door AI-systemen. </w:t>
             </w:r>
             <w:r>
               <w:rPr>
@@ -874,7 +944,7 @@
                 <w:color w:val="000000"/>
                 <w:sz w:val="18"/>
               </w:rPr>
-              <w:t xml:space="preserve">Voorbeelden herkennen van misinformatie, desinformatie en bronnen van vooroordelen. </w:t>
+              <w:t xml:space="preserve">Voorbeelden herkennen van misinformatie, desinformatie en bronnen van vooringenomenheid (bias). </w:t>
             </w:r>
             <w:r>
               <w:rPr>
@@ -938,7 +1008,7 @@
                 <w:color w:val="000000"/>
                 <w:sz w:val="18"/>
               </w:rPr>
-              <w:t xml:space="preserve">Een basale inschatting maken van de betrouwbaarheid en geloofwaardigheid van digitale informatiebronnen en content. </w:t>
+              <w:t xml:space="preserve">Een basisbeoordeling maken van de betrouwbaarheid en geloofwaardigheid van digitale informatiebronnen en inhoud. </w:t>
             </w:r>
             <w:r>
               <w:rPr>
@@ -975,7 +1045,7 @@
                 <w:color w:val="000000"/>
                 <w:sz w:val="18"/>
               </w:rPr>
-              <w:t>Op intermediairniveau kunnen individuen</w:t>
+              <w:t>Op gemiddeldniveau kunnen individuen</w:t>
             </w:r>
           </w:p>
         </w:tc>
@@ -1003,7 +1073,7 @@
                 <w:color w:val="000000"/>
                 <w:sz w:val="18"/>
               </w:rPr>
-              <w:t xml:space="preserve">De bron van online informatie en de doelen van factcheck-diensten om pre-bunking- en debunkingcompetenties te ontwikkelen herkennen. </w:t>
+              <w:t xml:space="preserve">De bron van online informatie en de doelen van factcheck-diensten identificeren om pre-bunking- en de-bunkingvaardigheden te ontwikkelen. </w:t>
             </w:r>
             <w:r>
               <w:rPr>
@@ -1035,7 +1105,7 @@
                 <w:color w:val="000000"/>
                 <w:sz w:val="18"/>
               </w:rPr>
-              <w:t xml:space="preserve">Erkennen dat de data die gebruikt worden bij het trainen van AI-systemen en de manier waarop ze getraind worden van invloed zijn op de betrouwbaarheid van de informatie die zij leveren. </w:t>
+              <w:t xml:space="preserve">Besef dat de data die gebruikt wordt bij het trainen van AI-systemen en de manier waarop ze getraind worden van invloed zijn op de betrouwbaarheid van de informatie die zij leveren. </w:t>
             </w:r>
             <w:r>
               <w:rPr>
@@ -1067,7 +1137,7 @@
                 <w:color w:val="000000"/>
                 <w:sz w:val="18"/>
               </w:rPr>
-              <w:t xml:space="preserve">Erkennen dat sommige digitale technologieën, zoals AI-systemen, kunnen functioneren als een 'black box', waardoor het moeilijk is om uit te leggen waarom of hoe een resultaat is geproduceerd. </w:t>
+              <w:t xml:space="preserve">Herkennen dat sommige digitale technologieën, zoals AI-systemen, kunnen functioneren als een 'black box', waardoor het moeilijk is om uit te leggen waarom of hoe een output is geproduceerd. </w:t>
             </w:r>
             <w:r>
               <w:rPr>
@@ -1099,7 +1169,7 @@
                 <w:color w:val="000000"/>
                 <w:sz w:val="18"/>
               </w:rPr>
-              <w:t xml:space="preserve">Erkennen dat AI-systemen output kunnen produceren die onnauwkeurig is, zelfs als deze aannemelijk lijkt, en dat de mens die het AI-systeem gebruikt verantwoordelijk is voor het controleren van de kwaliteit en validiteit van de gegenereerde informatie. </w:t>
+              <w:t xml:space="preserve">Herkennen dat AI-systemen output kunnen produceren die onnauwkeurig is, zelfs als deze aannemelijk lijkt, en dat de mens die het AI-systeem gebruikt verantwoordelijk is voor het controleren van de kwaliteit en geldigheid van de gegenereerde informatie. </w:t>
             </w:r>
             <w:r>
               <w:rPr>
@@ -1131,7 +1201,7 @@
                 <w:color w:val="000000"/>
                 <w:sz w:val="18"/>
               </w:rPr>
-              <w:t xml:space="preserve">Erkennen dat individuele (cognitieve en affectieve) vooroordelen en AI-systeemvooroordelen een rol spelen bij het genereren en interpreteren van informatie. </w:t>
+              <w:t xml:space="preserve">Herkennen dat individuele (cognitieve en affectieve) vooroordelen en AI-systeemvooroordelen een rol spelen bij het genereren en interpreteren van informatie. </w:t>
             </w:r>
             <w:r>
               <w:rPr>
@@ -1163,7 +1233,7 @@
                 <w:color w:val="000000"/>
                 <w:sz w:val="18"/>
               </w:rPr>
-              <w:t xml:space="preserve">Strategieën in digitale omgevingen die gebruikers kunnen sturen, zoals clickbait, nudging en gamificatie, herkennen en er effectief op reageren. </w:t>
+              <w:t xml:space="preserve">Gebruikerssturende strategieën in digitale omgevingen, zoals clickbait, nudging en gamificatie, herkennen en er effectief op reageren. </w:t>
             </w:r>
             <w:r>
               <w:rPr>
@@ -1195,7 +1265,7 @@
                 <w:color w:val="000000"/>
                 <w:sz w:val="18"/>
               </w:rPr>
-              <w:t xml:space="preserve">De betrouwbaarheid van bronnen, informatie en content in digitale omgevingen kritisch beoordelen, rekening houdend met de rol van AI-systemen, personalisatie-effecten en commerciële of andere belangen. </w:t>
+              <w:t xml:space="preserve">Kritisch de betrouwbaarheid beoordelen van bronnen, informatie en inhoud in digitale omgevingen, rekening houdend met de rol van AI-systemen, personalisatie-effecten en commerciële of andere belangen. </w:t>
             </w:r>
             <w:r>
               <w:rPr>
@@ -1232,7 +1302,7 @@
                 <w:color w:val="000000"/>
                 <w:sz w:val="18"/>
               </w:rPr>
-              <w:t>Op gevorderdniveau kunnen individuen</w:t>
+              <w:t>Op geavanceerdniveau kunnen individuen</w:t>
             </w:r>
           </w:p>
         </w:tc>
@@ -1260,7 +1330,7 @@
                 <w:color w:val="000000"/>
                 <w:sz w:val="18"/>
               </w:rPr>
-              <w:t xml:space="preserve">Voortdurend onderzoeken hoe AI-systemen, vooroordelen en verschillende belangen het genereren, de presentatie en interpretatie van informatie in digitale omgevingen vormgeven. </w:t>
+              <w:t xml:space="preserve">Voortdurend onderzoeken hoe AI-systemen, vooroordelen en verschillende belangen de generatie, presentatie en interpretatie van informatie in digitale omgevingen vormgeven. </w:t>
             </w:r>
             <w:r>
               <w:rPr>
@@ -1292,7 +1362,7 @@
                 <w:color w:val="000000"/>
                 <w:sz w:val="18"/>
               </w:rPr>
-              <w:t xml:space="preserve">Functies van betrouwbare digitale technologie, zoals AI-systemen, beschrijven. </w:t>
+              <w:t xml:space="preserve">Kenmerken van betrouwbare digitale technologieën, zoals AI-systemen, beschrijven. </w:t>
             </w:r>
             <w:r>
               <w:rPr>
@@ -1324,7 +1394,7 @@
                 <w:color w:val="000000"/>
                 <w:sz w:val="18"/>
               </w:rPr>
-              <w:t xml:space="preserve">Persoonlijke, sociale en politieke gevolgen van misinformatie, desinformatie, bronnen van vooroordelen en beïnvloeding via sociale media en filterbubbels beschrijven. </w:t>
+              <w:t xml:space="preserve">Persoonlijke, sociale en politieke gevolgen beschrijven van misinformatie, desinformatie, bronnen van bias, beïnvloeding via sociale media en filterbubbels. </w:t>
             </w:r>
             <w:r>
               <w:rPr>
@@ -1356,7 +1426,7 @@
                 <w:color w:val="000000"/>
                 <w:sz w:val="18"/>
               </w:rPr>
-              <w:t xml:space="preserve">De betrouwbaarheid en nauwkeurigheid van een diversiteit aan digitale bronnen, informatie en content grondig beoordelen, rekening houdend met een reeks mogelijke beïnvloedende factoren. </w:t>
+              <w:t xml:space="preserve">Grondig de betrouwbaarheid en nauwkeurigheid beoordelen van een diversiteit aan digitale bronnen, informatie en inhoud, rekening houdend met een reeks mogelijke beïnvloedende factoren. </w:t>
             </w:r>
             <w:r>
               <w:rPr>
@@ -1388,7 +1458,7 @@
                 <w:color w:val="000000"/>
                 <w:sz w:val="18"/>
               </w:rPr>
-              <w:t xml:space="preserve">Anderen ondersteunen bij het ontwikkelen van competenties om de geloofwaardigheid en betrouwbaarheid van digitale bronnen, informatie en content te beoordelen. </w:t>
+              <w:t xml:space="preserve">Anderen ondersteunen bij het ontwikkelen van vaardigheden om de geloofwaardigheid en betrouwbaarheid van digitale bronnen, informatie en inhoud te beoordelen. </w:t>
             </w:r>
             <w:r>
               <w:rPr>
@@ -1425,7 +1495,7 @@
                 <w:color w:val="000000"/>
                 <w:sz w:val="18"/>
               </w:rPr>
-              <w:t>Op zeer gevorderdniveau kunnen individuen</w:t>
+              <w:t>Op zeer geavanceerdniveau kunnen individuen</w:t>
             </w:r>
           </w:p>
         </w:tc>
@@ -1453,7 +1523,7 @@
                 <w:color w:val="000000"/>
                 <w:sz w:val="18"/>
               </w:rPr>
-              <w:t xml:space="preserve">Beoordelen en evalueren digitale bronnen, informatie en content systematisch ter ondersteuning van complexe besluitvorming. </w:t>
+              <w:t xml:space="preserve">Systematisch digitale bronnen, informatie en inhoud beoordelen en evalueren ter ondersteuning van complexe besluitvorming. </w:t>
             </w:r>
             <w:r>
               <w:rPr>
@@ -1485,7 +1555,7 @@
                 <w:color w:val="000000"/>
                 <w:sz w:val="18"/>
               </w:rPr>
-              <w:t xml:space="preserve">Anderen helpen bij het ontwikkelen van competenties om informatie en content kritisch te evalueren, en bij het opbouwen van veerkracht tegen misinformatie en desinformatie in digitale omgevingen. </w:t>
+              <w:t xml:space="preserve">Anderen helpen bij het ontwikkelen van vaardigheden om informatie en inhoud kritisch te evalueren, en veerkracht op te bouwen tegen misinformatie en desinformatie in digitale omgevingen. </w:t>
             </w:r>
             <w:r>
               <w:rPr>
@@ -1517,7 +1587,7 @@
                 <w:color w:val="000000"/>
                 <w:sz w:val="18"/>
               </w:rPr>
-              <w:t xml:space="preserve">Initiatieven die een nauwkeurige interpretatie van informatie in digitale omgevingen ondersteunen, leiden of hieraan bijdragen. </w:t>
+              <w:t xml:space="preserve">Leiding geven aan of bijdragen aan initiatieven die een nauwkeurige interpretatie van informatie in digitale omgevingen ondersteunen. </w:t>
             </w:r>
             <w:r>
               <w:rPr>
@@ -1560,7 +1630,42 @@
             <w:tcW w:type="dxa" w:w="3627"/>
             <w:vMerge w:val="restart"/>
           </w:tcPr>
-          <w:p/>
+          <w:p>
+            <w:r>
+              <w:drawing>
+                <wp:inline xmlns:a="http://schemas.openxmlformats.org/drawingml/2006/main" xmlns:pic="http://schemas.openxmlformats.org/drawingml/2006/picture">
+                  <wp:extent cx="1368000" cy="1315803"/>
+                  <wp:docPr id="3" name="Picture 3"/>
+                  <wp:cNvGraphicFramePr>
+                    <a:graphicFrameLocks noChangeAspect="1"/>
+                  </wp:cNvGraphicFramePr>
+                  <a:graphic>
+                    <a:graphicData uri="http://schemas.openxmlformats.org/drawingml/2006/picture">
+                      <pic:pic>
+                        <pic:nvPicPr>
+                          <pic:cNvPr id="0" name="DC3_1p3.png"/>
+                          <pic:cNvPicPr/>
+                        </pic:nvPicPr>
+                        <pic:blipFill>
+                          <a:blip r:embed="rId11"/>
+                          <a:stretch>
+                            <a:fillRect/>
+                          </a:stretch>
+                        </pic:blipFill>
+                        <pic:spPr>
+                          <a:xfrm>
+                            <a:off x="0" y="0"/>
+                            <a:ext cx="1368000" cy="1315803"/>
+                          </a:xfrm>
+                          <a:prstGeom prst="rect"/>
+                        </pic:spPr>
+                      </pic:pic>
+                    </a:graphicData>
+                  </a:graphic>
+                </wp:inline>
+              </w:drawing>
+            </w:r>
+          </w:p>
           <w:p>
             <w:r>
               <w:rPr>
@@ -1582,7 +1687,7 @@
                 <w:color w:val="000000"/>
                 <w:sz w:val="22"/>
               </w:rPr>
-              <w:t>1.3 Beheren van informatie</w:t>
+              <w:t>1.3 Informatie beheren</w:t>
             </w:r>
           </w:p>
           <w:p>
@@ -1594,7 +1699,7 @@
                 <w:color w:val="000000"/>
                 <w:sz w:val="17"/>
               </w:rPr>
-              <w:t>Het ordenen, opslaan en opvragen van informatie en data in digitale omgevingen. Het verzamelen, verwerken en analyseren van informatie en data in gestructureerde digitale omgevingen.</w:t>
+              <w:t>Het organiseren, opslaan en ophalen van informatie en gegevens in digitale omgevingen. Het verzamelen, verwerken en analyseren van informatie en gegevens in gestructureerde digitale omgevingen.</w:t>
             </w:r>
           </w:p>
         </w:tc>
@@ -1640,7 +1745,7 @@
                 <w:color w:val="000000"/>
                 <w:sz w:val="18"/>
               </w:rPr>
-              <w:t xml:space="preserve">De voordelen inzien van het beheren en ordenen van informatie in digitale omgevingen. </w:t>
+              <w:t xml:space="preserve">De voordelen inzien van het beheren en organiseren van informatie in digitale omgevingen. </w:t>
             </w:r>
             <w:r>
               <w:rPr>
@@ -1704,7 +1809,7 @@
                 <w:color w:val="000000"/>
                 <w:sz w:val="18"/>
               </w:rPr>
-              <w:t xml:space="preserve">Digitale bestanden downloaden, opslaan, opvragen, verplaatsen en verwijderen. </w:t>
+              <w:t xml:space="preserve">Digitale bestanden downloaden, opslaan, ophalen, verplaatsen en verwijderen. </w:t>
             </w:r>
             <w:r>
               <w:rPr>
@@ -1736,7 +1841,7 @@
                 <w:color w:val="000000"/>
                 <w:sz w:val="18"/>
               </w:rPr>
-              <w:t xml:space="preserve">Eenvoudige data in een gestructureerde digitale omgeving ordenen en formatteren, zoals in spreadsheets. </w:t>
+              <w:t xml:space="preserve">Eenvoudige data organiseren en formatteren in een gestructureerde digitale omgeving, zoals in spreadsheets. </w:t>
             </w:r>
             <w:r>
               <w:rPr>
@@ -1768,7 +1873,7 @@
                 <w:color w:val="000000"/>
                 <w:sz w:val="18"/>
               </w:rPr>
-              <w:t xml:space="preserve">Contacten bijwerken, zoals op de telefoon, in e-mail of op sociale media. </w:t>
+              <w:t xml:space="preserve">Eigen contacten bijwerken, bijvoorbeeld op de telefoon, in e-mail of op sociale media. </w:t>
             </w:r>
             <w:r>
               <w:rPr>
@@ -1805,7 +1910,7 @@
                 <w:color w:val="000000"/>
                 <w:sz w:val="18"/>
               </w:rPr>
-              <w:t>Op intermediairniveau kunnen individuen</w:t>
+              <w:t>Op gemiddeldniveau kunnen individuen</w:t>
             </w:r>
           </w:p>
         </w:tc>
@@ -1865,7 +1970,7 @@
                 <w:color w:val="000000"/>
                 <w:sz w:val="18"/>
               </w:rPr>
-              <w:t xml:space="preserve">Naamgevingsconventies toepassen op digitale bestanden en hiërarchieën toepassen op digitale mappen. </w:t>
+              <w:t xml:space="preserve">Naamgevingsconventies toepassen op digitale bestanden en hiërarchieën op digitale mappen. </w:t>
             </w:r>
             <w:r>
               <w:rPr>
@@ -1897,7 +2002,7 @@
                 <w:color w:val="000000"/>
                 <w:sz w:val="18"/>
               </w:rPr>
-              <w:t xml:space="preserve">Mappen ordenen en bestanden beheren, opslaan en verwijderen op digitale apparaten, externe opslagmedia en clouddiensten. </w:t>
+              <w:t xml:space="preserve">Mappen organiseren, en bestanden beheren, opslaan en verwijderen op digitale apparaten, externe opslag en clouddiensten. </w:t>
             </w:r>
             <w:r>
               <w:rPr>
@@ -1929,7 +2034,7 @@
                 <w:color w:val="000000"/>
                 <w:sz w:val="18"/>
               </w:rPr>
-              <w:t xml:space="preserve">Veelvoorkomende soorten data en hun formats herkennen en tools voor dataverzameling voor eenvoudige dataverwerking gebruiken. </w:t>
+              <w:t xml:space="preserve">Veelvoorkomende soorten data en hun formaten identificeren, en hulpmiddelen voor gegevensverzameling gebruiken voor eenvoudige gegevensverwerking. </w:t>
             </w:r>
             <w:r>
               <w:rPr>
@@ -1961,7 +2066,7 @@
                 <w:color w:val="000000"/>
                 <w:sz w:val="18"/>
               </w:rPr>
-              <w:t xml:space="preserve">Informatie in eigen digitale accounts beheren, zoals e-mail. </w:t>
+              <w:t xml:space="preserve">Informatie beheren in de eigen digitale accounts, zoals e-mail. </w:t>
             </w:r>
             <w:r>
               <w:rPr>
@@ -1993,7 +2098,7 @@
                 <w:color w:val="000000"/>
                 <w:sz w:val="18"/>
               </w:rPr>
-              <w:t xml:space="preserve">Data ordenen en formatteren en eenvoudige formules in een gestructureerde digitale omgeving toepassen, zoals in spreadsheets. </w:t>
+              <w:t xml:space="preserve">Data organiseren en formatteren en eenvoudige formules toepassen in een gestructureerde digitale omgeving, zoals in spreadsheets. </w:t>
             </w:r>
             <w:r>
               <w:rPr>
@@ -2030,7 +2135,7 @@
                 <w:color w:val="000000"/>
                 <w:sz w:val="18"/>
               </w:rPr>
-              <w:t>Op gevorderdniveau kunnen individuen</w:t>
+              <w:t>Op geavanceerdniveau kunnen individuen</w:t>
             </w:r>
           </w:p>
         </w:tc>
@@ -2154,7 +2259,7 @@
                 <w:color w:val="000000"/>
                 <w:sz w:val="18"/>
               </w:rPr>
-              <w:t xml:space="preserve">Een reeks digitale tools en methoden gebruiken om een verscheidenheid aan data en informatie te verzamelen en verwerken. </w:t>
+              <w:t xml:space="preserve">Een reeks digitale hulpmiddelen en methoden gebruiken om een verscheidenheid aan data en informatie te verzamelen en te verwerken. </w:t>
             </w:r>
             <w:r>
               <w:rPr>
@@ -2186,7 +2291,7 @@
                 <w:color w:val="000000"/>
                 <w:sz w:val="18"/>
               </w:rPr>
-              <w:t xml:space="preserve">Geschikte analyses toepassen op informatie en data in digitale omgevingen om bij te dragen aan complexe besluitvorming. </w:t>
+              <w:t xml:space="preserve">Passende analyses toepassen op informatie en data in digitale omgevingen om bij te dragen aan complexe besluitvorming. </w:t>
             </w:r>
             <w:r>
               <w:rPr>
@@ -2255,7 +2360,7 @@
                 <w:color w:val="000000"/>
                 <w:sz w:val="18"/>
               </w:rPr>
-              <w:t>Op zeer gevorderdniveau kunnen individuen</w:t>
+              <w:t>Op zeer geavanceerdniveau kunnen individuen</w:t>
             </w:r>
           </w:p>
         </w:tc>
@@ -2347,7 +2452,7 @@
                 <w:color w:val="000000"/>
                 <w:sz w:val="18"/>
               </w:rPr>
-              <w:t xml:space="preserve">Een verscheidenheid aan digitale tools en methoden gebruiken om complexe data of grote hoeveelheden informatie te verwerken, beheren of analyseren. </w:t>
+              <w:t xml:space="preserve">Verschillende digitale hulpmiddelen en methoden gebruiken om complexe data of grote hoeveelheden informatie te verwerken, te beheren of te analyseren. </w:t>
             </w:r>
             <w:r>
               <w:rPr>
@@ -2379,7 +2484,7 @@
                 <w:color w:val="000000"/>
                 <w:sz w:val="18"/>
               </w:rPr>
-              <w:t xml:space="preserve">Initiatieven die anderen ondersteunen bij geavanceerd informatie- en databeheer, -verwerking en -analyse in digitale omgevingen leiden of hieraan bijdragen. </w:t>
+              <w:t xml:space="preserve">Leiding geven aan of bijdragen aan initiatieven die anderen ondersteunen bij geavanceerd informatie- en databeheer, -verwerking en -analyse in digitale omgevingen. </w:t>
             </w:r>
             <w:r>
               <w:rPr>
@@ -2454,7 +2559,42 @@
             <w:tcW w:type="dxa" w:w="3627"/>
             <w:vMerge w:val="restart"/>
           </w:tcPr>
-          <w:p/>
+          <w:p>
+            <w:r>
+              <w:drawing>
+                <wp:inline xmlns:a="http://schemas.openxmlformats.org/drawingml/2006/main" xmlns:pic="http://schemas.openxmlformats.org/drawingml/2006/picture">
+                  <wp:extent cx="1368000" cy="1315803"/>
+                  <wp:docPr id="4" name="Picture 4"/>
+                  <wp:cNvGraphicFramePr>
+                    <a:graphicFrameLocks noChangeAspect="1"/>
+                  </wp:cNvGraphicFramePr>
+                  <a:graphic>
+                    <a:graphicData uri="http://schemas.openxmlformats.org/drawingml/2006/picture">
+                      <pic:pic>
+                        <pic:nvPicPr>
+                          <pic:cNvPr id="0" name="DC3_2p1.png"/>
+                          <pic:cNvPicPr/>
+                        </pic:nvPicPr>
+                        <pic:blipFill>
+                          <a:blip r:embed="rId12"/>
+                          <a:stretch>
+                            <a:fillRect/>
+                          </a:stretch>
+                        </pic:blipFill>
+                        <pic:spPr>
+                          <a:xfrm>
+                            <a:off x="0" y="0"/>
+                            <a:ext cx="1368000" cy="1315803"/>
+                          </a:xfrm>
+                          <a:prstGeom prst="rect"/>
+                        </pic:spPr>
+                      </pic:pic>
+                    </a:graphicData>
+                  </a:graphic>
+                </wp:inline>
+              </w:drawing>
+            </w:r>
+          </w:p>
           <w:p>
             <w:r>
               <w:rPr>
@@ -2476,7 +2616,7 @@
                 <w:color w:val="000000"/>
                 <w:sz w:val="22"/>
               </w:rPr>
-              <w:t>2.1 Interactie via en met digitale technologie</w:t>
+              <w:t>2.1 Interacteren via en met digitale technologieën</w:t>
             </w:r>
           </w:p>
           <w:p>
@@ -2488,7 +2628,7 @@
                 <w:color w:val="000000"/>
                 <w:sz w:val="17"/>
               </w:rPr>
-              <w:t>Interacteren via en met een verscheidenheid aan digitale technologieën, en passende digitale communicatietools gebruiken voor een bepaalde context.</w:t>
+              <w:t>Interacteren via en met een verscheidenheid aan digitale technologieën, en passende digitale communicatie gebruiken voor een gegeven context.</w:t>
             </w:r>
           </w:p>
         </w:tc>
@@ -2534,7 +2674,7 @@
                 <w:color w:val="000000"/>
                 <w:sz w:val="18"/>
               </w:rPr>
-              <w:t xml:space="preserve">Basale functies van digitale communicatietools voor de interactie met individuen en groepen herkennen en gebruiken. </w:t>
+              <w:t xml:space="preserve">Basiskenmerken van digitale communicatiehulpmiddelen identificeren en gebruiken om te interageren met individuen en groepen. </w:t>
             </w:r>
             <w:r>
               <w:rPr>
@@ -2630,7 +2770,7 @@
                 <w:color w:val="000000"/>
                 <w:sz w:val="18"/>
               </w:rPr>
-              <w:t xml:space="preserve">Basale functies van virtuele assistenten (chatbots) en belangrijke verschillen tussen mens-machine-interacties en mens-tot-mens-interacties herkennen. </w:t>
+              <w:t xml:space="preserve">Basiskenmerken identificeren van virtuele assistenten (chatbots) en belangrijke verschillen herkennen tussen mens-machine interacties en mens-tot-mens interacties. </w:t>
             </w:r>
             <w:r>
               <w:rPr>
@@ -2662,7 +2802,7 @@
                 <w:color w:val="000000"/>
                 <w:sz w:val="18"/>
               </w:rPr>
-              <w:t xml:space="preserve">In grote lijnen erkennen wat een robot is, de niet-menselijke aard ervan, en dat mensen interacteren met robots om taken uit te voeren. </w:t>
+              <w:t xml:space="preserve">In algemene termen herkennen wat een robot is, de niet-menselijke aard ervan, en dat mensen interageren met robots om taken uit te voeren. </w:t>
             </w:r>
             <w:r>
               <w:rPr>
@@ -2699,7 +2839,7 @@
                 <w:color w:val="000000"/>
                 <w:sz w:val="18"/>
               </w:rPr>
-              <w:t>Op intermediairniveau kunnen individuen</w:t>
+              <w:t>Op gemiddeldniveau kunnen individuen</w:t>
             </w:r>
           </w:p>
         </w:tc>
@@ -2759,7 +2899,7 @@
                 <w:color w:val="000000"/>
                 <w:sz w:val="18"/>
               </w:rPr>
-              <w:t xml:space="preserve">Erkennen dat er in digitale omgevingen een continuüm bestaat tussen realiteit en virtualiteit. </w:t>
+              <w:t xml:space="preserve">Herkennen dat er een realiteit-virtualiteit-continuüm bestaat in digitale omgevingen. </w:t>
             </w:r>
             <w:r>
               <w:rPr>
@@ -2791,7 +2931,7 @@
                 <w:color w:val="000000"/>
                 <w:sz w:val="18"/>
               </w:rPr>
-              <w:t xml:space="preserve">Een geschikt communicatiemiddel voor een bepaalde context of bepaald doel aanwijzen. </w:t>
+              <w:t xml:space="preserve">Een geschikt communicatiemiddel identificeren voor een gegeven context of doel. </w:t>
             </w:r>
             <w:r>
               <w:rPr>
@@ -2823,7 +2963,7 @@
                 <w:color w:val="000000"/>
                 <w:sz w:val="18"/>
               </w:rPr>
-              <w:t xml:space="preserve">De diverse functies van verschillende digitale communicatiemiddelen gebruiken om te communiceren met en leiding te geven aan individuen, groepen en kanalen. </w:t>
+              <w:t xml:space="preserve">Meerdere kenmerken van verschillende digitale communicatiehulpmiddelen gebruiken om te interageren met en het beheren van individuen, groepen en kanalen. </w:t>
             </w:r>
             <w:r>
               <w:rPr>
@@ -2855,7 +2995,7 @@
                 <w:color w:val="000000"/>
                 <w:sz w:val="18"/>
               </w:rPr>
-              <w:t xml:space="preserve">Vragen, commando's of prompts voor virtuele assistenten (chatbots) en AI-systemen ontwikkelen en verfijnen om niet-complexe interacties af te handelen. </w:t>
+              <w:t xml:space="preserve">Vragen, commando's of verklaringen (prompts) ontwikkelen en verfijnen voor virtuele assistenten (chatbots) en AI-systemen om niet-complexe interacties af te handelen. </w:t>
             </w:r>
             <w:r>
               <w:rPr>
@@ -2887,7 +3027,7 @@
                 <w:color w:val="000000"/>
                 <w:sz w:val="18"/>
               </w:rPr>
-              <w:t xml:space="preserve">Beschrijven hoe mensen kunnen interacteren met robots, hun belangrijkste functies herkennen (zoals sensoren, software, bewegingsregelaars en menselijke interface), en herkennen dat ze kunnen werken met variërende mate van autonomie. </w:t>
+              <w:t xml:space="preserve">Definiëren hoe mensen kunnen interageren met robots, hun belangrijkste kenmerken identificeren (zoals sensoren, software, bewegingsregelaars en menselijke interface), en herkennen dat ze kunnen werken met verschillende mate van autonomie. </w:t>
             </w:r>
             <w:r>
               <w:rPr>
@@ -2924,7 +3064,7 @@
                 <w:color w:val="FFFFFF"/>
                 <w:sz w:val="18"/>
               </w:rPr>
-              <w:t>Op gevorderdniveau kunnen individuen</w:t>
+              <w:t>Op geavanceerdniveau kunnen individuen</w:t>
             </w:r>
           </w:p>
         </w:tc>
@@ -2984,7 +3124,7 @@
                 <w:color w:val="000000"/>
                 <w:sz w:val="18"/>
               </w:rPr>
-              <w:t xml:space="preserve">Digitale communicatietools en -methoden voor complexe communicatie- en interactietaken combineren. </w:t>
+              <w:t xml:space="preserve">Digitale communicatiehulpmiddelen en -methoden combineren voor complexe communicatie- en interactietaken. </w:t>
             </w:r>
             <w:r>
               <w:rPr>
@@ -3016,7 +3156,7 @@
                 <w:color w:val="000000"/>
                 <w:sz w:val="18"/>
               </w:rPr>
-              <w:t xml:space="preserve">Vragen, commando's of prompts voor AI-systemen systematisch ontwikkelen en deze geleidelijk verfijnen om complexe interacties af te handelen. </w:t>
+              <w:t xml:space="preserve">Systematisch vragen, commando's of verklaringen (prompts) voor AI-systemen ontwikkelen en geleidelijk verfijnen om complexe interacties af te handelen. </w:t>
             </w:r>
             <w:r>
               <w:rPr>
@@ -3048,7 +3188,7 @@
                 <w:color w:val="000000"/>
                 <w:sz w:val="18"/>
               </w:rPr>
-              <w:t xml:space="preserve">Anderen helpen bij het beoordelen en selecteren van geschikte digitale communicatietools voor een bepaald doel. </w:t>
+              <w:t xml:space="preserve">Anderen helpen bij het beoordelen en selecteren van geschikte digitale communicatiehulpmiddelen voor een bepaald doel. </w:t>
             </w:r>
             <w:r>
               <w:rPr>
@@ -3080,7 +3220,7 @@
                 <w:color w:val="000000"/>
                 <w:sz w:val="18"/>
               </w:rPr>
-              <w:t xml:space="preserve">Complexe digitale evenementen organiseren en/of modereren. </w:t>
+              <w:t xml:space="preserve">Organiseren en/of modereren van complexe digitale evenementen. </w:t>
             </w:r>
             <w:r>
               <w:rPr>
@@ -3112,7 +3252,7 @@
                 <w:color w:val="000000"/>
                 <w:sz w:val="18"/>
               </w:rPr>
-              <w:t xml:space="preserve">Voor- en nadelen van robottoepassingen in een specifieke context beoordelen. </w:t>
+              <w:t xml:space="preserve">Voordelen en nadelen van robottoepassingen in een specifieke context beoordelen. </w:t>
             </w:r>
             <w:r>
               <w:rPr>
@@ -3149,7 +3289,7 @@
                 <w:color w:val="FFFFFF"/>
                 <w:sz w:val="18"/>
               </w:rPr>
-              <w:t>Op zeer gevorderdniveau kunnen individuen</w:t>
+              <w:t>Op zeer geavanceerdniveau kunnen individuen</w:t>
             </w:r>
           </w:p>
         </w:tc>
@@ -3177,7 +3317,7 @@
                 <w:color w:val="000000"/>
                 <w:sz w:val="18"/>
               </w:rPr>
-              <w:t xml:space="preserve">Op de hoogte blijven van ontwikkelingen in tools en methoden voor digitale communicatie en interactie. </w:t>
+              <w:t xml:space="preserve">Op de hoogte blijven van ontwikkelingen in hulpmiddelen en methoden voor digitale communicatie en interactie. </w:t>
             </w:r>
             <w:r>
               <w:rPr>
@@ -3209,7 +3349,7 @@
                 <w:color w:val="000000"/>
                 <w:sz w:val="18"/>
               </w:rPr>
-              <w:t xml:space="preserve">Digitale communicatie- en interactietools beoordelen en combineren voor zeer complexe of nieuwe taken. </w:t>
+              <w:t xml:space="preserve">Digitale communicatie- en interactiehulpmiddelen beoordelen en combineren voor zeer complexe of nieuwe taken. </w:t>
             </w:r>
             <w:r>
               <w:rPr>
@@ -3241,7 +3381,7 @@
                 <w:color w:val="000000"/>
                 <w:sz w:val="18"/>
               </w:rPr>
-              <w:t xml:space="preserve">Begeleiding, ondersteuning of leiderschap bieden bij het gevorderde gebruik van communicatie- en interactietools. </w:t>
+              <w:t xml:space="preserve">Begeleiding, ondersteuning of leiderschap bieden bij het geavanceerde gebruik van communicatie- en interactiehulpmiddelen. </w:t>
             </w:r>
             <w:r>
               <w:rPr>
@@ -3273,7 +3413,7 @@
                 <w:color w:val="000000"/>
                 <w:sz w:val="18"/>
               </w:rPr>
-              <w:t xml:space="preserve">Verbeteringen in of nieuwe oplossingen voor digitale communicatie of mens-machine-interactie leiden of hieraan bijdragen. </w:t>
+              <w:t xml:space="preserve">Leiden van of bijdragen aan verbeteringen in of nieuwe oplossingen voor digitale communicatie of mens-machine interactie. </w:t>
             </w:r>
             <w:r>
               <w:rPr>
@@ -3316,7 +3456,42 @@
             <w:tcW w:type="dxa" w:w="3627"/>
             <w:vMerge w:val="restart"/>
           </w:tcPr>
-          <w:p/>
+          <w:p>
+            <w:r>
+              <w:drawing>
+                <wp:inline xmlns:a="http://schemas.openxmlformats.org/drawingml/2006/main" xmlns:pic="http://schemas.openxmlformats.org/drawingml/2006/picture">
+                  <wp:extent cx="1368000" cy="1315803"/>
+                  <wp:docPr id="5" name="Picture 5"/>
+                  <wp:cNvGraphicFramePr>
+                    <a:graphicFrameLocks noChangeAspect="1"/>
+                  </wp:cNvGraphicFramePr>
+                  <a:graphic>
+                    <a:graphicData uri="http://schemas.openxmlformats.org/drawingml/2006/picture">
+                      <pic:pic>
+                        <pic:nvPicPr>
+                          <pic:cNvPr id="0" name="DC3_2p2.png"/>
+                          <pic:cNvPicPr/>
+                        </pic:nvPicPr>
+                        <pic:blipFill>
+                          <a:blip r:embed="rId13"/>
+                          <a:stretch>
+                            <a:fillRect/>
+                          </a:stretch>
+                        </pic:blipFill>
+                        <pic:spPr>
+                          <a:xfrm>
+                            <a:off x="0" y="0"/>
+                            <a:ext cx="1368000" cy="1315803"/>
+                          </a:xfrm>
+                          <a:prstGeom prst="rect"/>
+                        </pic:spPr>
+                      </pic:pic>
+                    </a:graphicData>
+                  </a:graphic>
+                </wp:inline>
+              </w:drawing>
+            </w:r>
+          </w:p>
           <w:p>
             <w:r>
               <w:rPr>
@@ -3338,7 +3513,7 @@
                 <w:color w:val="000000"/>
                 <w:sz w:val="22"/>
               </w:rPr>
-              <w:t>2.2 Delen via digitale technologie</w:t>
+              <w:t>2.2 Delen via digitale technologieën</w:t>
             </w:r>
           </w:p>
           <w:p>
@@ -3350,7 +3525,7 @@
                 <w:color w:val="000000"/>
                 <w:sz w:val="17"/>
               </w:rPr>
-              <w:t>Het delen van informatie en content met anderen op een ethische en verantwoorde manier met behulp van geschikte digitale technologie.</w:t>
+              <w:t>Informatie en inhoud op een ethische en verantwoorde manier delen met anderen via passende digitale technologieën.</w:t>
             </w:r>
           </w:p>
         </w:tc>
@@ -3396,7 +3571,7 @@
                 <w:color w:val="000000"/>
                 <w:sz w:val="18"/>
               </w:rPr>
-              <w:t xml:space="preserve">Het belang inzien van het ethisch en verantwoord delen van informatie en content. </w:t>
+              <w:t xml:space="preserve">Het belang inzien van ethisch en verantwoord delen van informatie en inhoud. </w:t>
             </w:r>
             <w:r>
               <w:rPr>
@@ -3428,7 +3603,7 @@
                 <w:color w:val="000000"/>
                 <w:sz w:val="18"/>
               </w:rPr>
-              <w:t xml:space="preserve">Functies en toepassingen van sociale media herkennen, evenals voorbeelden van veelvoorkomende sociale mediaplatforms. </w:t>
+              <w:t xml:space="preserve">Functies en toepassingen van sociale media identificeren, evenals voorbeelden van veelvoorkomende sociale mediaplatforms. </w:t>
             </w:r>
             <w:r>
               <w:rPr>
@@ -3460,7 +3635,7 @@
                 <w:color w:val="000000"/>
                 <w:sz w:val="18"/>
               </w:rPr>
-              <w:t xml:space="preserve">Voordelen en risico's van het delen van informatie en content in digitale omgevingen herkennen, en erkennen dat individuen zelf kunnen kiezen hoe en wat ze delen. </w:t>
+              <w:t xml:space="preserve">Voordelen en risico's herkennen van het delen van informatie en inhoud in digitale omgevingen, en dat individuen kunnen kiezen hoe en wat ze delen. </w:t>
             </w:r>
             <w:r>
               <w:rPr>
@@ -3492,7 +3667,7 @@
                 <w:color w:val="000000"/>
                 <w:sz w:val="18"/>
               </w:rPr>
-              <w:t xml:space="preserve">Erkennen dat content op verschillende manieren kan worden gedeeld door zowel AI-systemen als mensen. </w:t>
+              <w:t xml:space="preserve">Herkennen dat inhoud op verschillende manieren kan worden gedeeld door zowel AI-systemen als mensen. </w:t>
             </w:r>
             <w:r>
               <w:rPr>
@@ -3524,7 +3699,7 @@
                 <w:color w:val="000000"/>
                 <w:sz w:val="18"/>
               </w:rPr>
-              <w:t xml:space="preserve">Doel en doelgroep van informatie en content herkennen die gedeeld gaat worden in digitale omgevingen. </w:t>
+              <w:t xml:space="preserve">Doel en doelgroep identificeren van informatie en inhoud die gedeeld gaat worden in digitale omgevingen. </w:t>
             </w:r>
             <w:r>
               <w:rPr>
@@ -3556,7 +3731,7 @@
                 <w:color w:val="000000"/>
                 <w:sz w:val="18"/>
               </w:rPr>
-              <w:t xml:space="preserve">Eenvoudige processen inzetten om informatie en content op een passende manier en doelgericht te delen in digitale omgevingen. </w:t>
+              <w:t xml:space="preserve">Eenvoudige processen gebruiken om informatie en inhoud op een passende manier en in overeenstemming met de doelen te delen in digitale omgevingen. </w:t>
             </w:r>
             <w:r>
               <w:rPr>
@@ -3593,7 +3768,7 @@
                 <w:color w:val="000000"/>
                 <w:sz w:val="18"/>
               </w:rPr>
-              <w:t>Op intermediairniveau kunnen individuen</w:t>
+              <w:t>Op gemiddeldniveau kunnen individuen</w:t>
             </w:r>
           </w:p>
         </w:tc>
@@ -3621,7 +3796,7 @@
                 <w:color w:val="000000"/>
                 <w:sz w:val="18"/>
               </w:rPr>
-              <w:t xml:space="preserve">Het belang inzien van het beoordelen van de waarde en nauwkeurigheid van informatie en content voordat deze in digitale omgevingen worden gedeeld. </w:t>
+              <w:t xml:space="preserve">Het belang inzien van het beoordelen van de waarde en nauwkeurigheid van informatie en inhoud voordat deze in digitale omgevingen wordt gedeeld. </w:t>
             </w:r>
             <w:r>
               <w:rPr>
@@ -3653,7 +3828,7 @@
                 <w:color w:val="000000"/>
                 <w:sz w:val="18"/>
               </w:rPr>
-              <w:t xml:space="preserve">Verantwoordelijkheden beschrijven die horen bij het delen van informatie en content in digitale omgevingen. </w:t>
+              <w:t xml:space="preserve">Verantwoordelijkheden definiëren die verbonden zijn aan het delen van informatie en inhoud in digitale omgevingen. </w:t>
             </w:r>
             <w:r>
               <w:rPr>
@@ -3685,7 +3860,7 @@
                 <w:color w:val="000000"/>
                 <w:sz w:val="18"/>
               </w:rPr>
-              <w:t xml:space="preserve">Effectieve en ethische manieren beschrijven en implementeren om informatie en content te delen in verschillende digitale omgevingen. </w:t>
+              <w:t xml:space="preserve">Effectieve en ethische manieren beschrijven en implementeren om informatie en inhoud te delen in verschillende digitale omgevingen. </w:t>
             </w:r>
             <w:r>
               <w:rPr>
@@ -3754,7 +3929,7 @@
                 <w:color w:val="FFFFFF"/>
                 <w:sz w:val="18"/>
               </w:rPr>
-              <w:t>Op gevorderdniveau kunnen individuen</w:t>
+              <w:t>Op geavanceerdniveau kunnen individuen</w:t>
             </w:r>
           </w:p>
         </w:tc>
@@ -3782,7 +3957,7 @@
                 <w:color w:val="000000"/>
                 <w:sz w:val="18"/>
               </w:rPr>
-              <w:t xml:space="preserve">De waarde inzien van het delen van informatie en content in digitale omgevingen om anderen te helpen. </w:t>
+              <w:t xml:space="preserve">De waarde inzien van het delen van informatie en inhoud in digitale omgevingen om anderen te helpen. </w:t>
             </w:r>
             <w:r>
               <w:rPr>
@@ -3814,7 +3989,7 @@
                 <w:color w:val="000000"/>
                 <w:sz w:val="18"/>
               </w:rPr>
-              <w:t xml:space="preserve">Informatie en content in digitale omgevingen delen om persoonlijke, leer- of professionele doelen van zichzelf en anderen te faciliteren. </w:t>
+              <w:t xml:space="preserve">Informatie en inhoud delen in digitale omgevingen ter ondersteuning van persoonlijke, leer- of professionele doelen van zichzelf en anderen. </w:t>
             </w:r>
             <w:r>
               <w:rPr>
@@ -3846,7 +4021,7 @@
                 <w:color w:val="000000"/>
                 <w:sz w:val="18"/>
               </w:rPr>
-              <w:t xml:space="preserve">Anderen adviseren over effectieve en ethische manieren om informatie en content te delen in digitale omgevingen. </w:t>
+              <w:t xml:space="preserve">Anderen adviseren over effectieve en ethische manieren om informatie en inhoud te delen in digitale omgevingen. </w:t>
             </w:r>
             <w:r>
               <w:rPr>
@@ -3883,7 +4058,7 @@
                 <w:color w:val="FFFFFF"/>
                 <w:sz w:val="18"/>
               </w:rPr>
-              <w:t>Op zeer gevorderdniveau kunnen individuen</w:t>
+              <w:t>Op zeer geavanceerdniveau kunnen individuen</w:t>
             </w:r>
           </w:p>
         </w:tc>
@@ -3911,7 +4086,7 @@
                 <w:color w:val="000000"/>
                 <w:sz w:val="18"/>
               </w:rPr>
-              <w:t xml:space="preserve">Complexe uitwisseling van informatie tussen verschillende digitale technologieën faciliteren, en daarbij waar nodig nieuwe en alternatieve manieren verkennen. </w:t>
+              <w:t xml:space="preserve">Complex delen van informatie over verschillende digitale technologieën heen faciliteren, indien nodig nieuwe en alternatieve middelen verkennend. </w:t>
             </w:r>
             <w:r>
               <w:rPr>
@@ -3943,7 +4118,7 @@
                 <w:color w:val="000000"/>
                 <w:sz w:val="18"/>
               </w:rPr>
-              <w:t xml:space="preserve">Bijdragen aan complexe of gespecialiseerde initiatieven voor het delen van informatie en content in digitale omgevingen. </w:t>
+              <w:t xml:space="preserve">Bijdragen aan complexe of gespecialiseerde initiatieven voor het delen van informatie en inhoud in digitale omgevingen. </w:t>
             </w:r>
             <w:r>
               <w:rPr>
@@ -3975,7 +4150,7 @@
                 <w:color w:val="000000"/>
                 <w:sz w:val="18"/>
               </w:rPr>
-              <w:t xml:space="preserve">Verbeteringen in of nieuwe oplossingen voor het delen van informatie en content in digitale omgevingen leiden of hieraan bijdragen. </w:t>
+              <w:t xml:space="preserve">Leiding geven aan of bijdragen aan verbeteringen in of nieuwe oplossingen voor het delen van informatie en inhoud in digitale omgevingen. </w:t>
             </w:r>
             <w:r>
               <w:rPr>
@@ -4018,7 +4193,42 @@
             <w:tcW w:type="dxa" w:w="3627"/>
             <w:vMerge w:val="restart"/>
           </w:tcPr>
-          <w:p/>
+          <w:p>
+            <w:r>
+              <w:drawing>
+                <wp:inline xmlns:a="http://schemas.openxmlformats.org/drawingml/2006/main" xmlns:pic="http://schemas.openxmlformats.org/drawingml/2006/picture">
+                  <wp:extent cx="1368000" cy="1315803"/>
+                  <wp:docPr id="6" name="Picture 6"/>
+                  <wp:cNvGraphicFramePr>
+                    <a:graphicFrameLocks noChangeAspect="1"/>
+                  </wp:cNvGraphicFramePr>
+                  <a:graphic>
+                    <a:graphicData uri="http://schemas.openxmlformats.org/drawingml/2006/picture">
+                      <pic:pic>
+                        <pic:nvPicPr>
+                          <pic:cNvPr id="0" name="DC3_2p3.png"/>
+                          <pic:cNvPicPr/>
+                        </pic:nvPicPr>
+                        <pic:blipFill>
+                          <a:blip r:embed="rId14"/>
+                          <a:stretch>
+                            <a:fillRect/>
+                          </a:stretch>
+                        </pic:blipFill>
+                        <pic:spPr>
+                          <a:xfrm>
+                            <a:off x="0" y="0"/>
+                            <a:ext cx="1368000" cy="1315803"/>
+                          </a:xfrm>
+                          <a:prstGeom prst="rect"/>
+                        </pic:spPr>
+                      </pic:pic>
+                    </a:graphicData>
+                  </a:graphic>
+                </wp:inline>
+              </w:drawing>
+            </w:r>
+          </w:p>
           <w:p>
             <w:r>
               <w:rPr>
@@ -4040,7 +4250,7 @@
                 <w:color w:val="000000"/>
                 <w:sz w:val="22"/>
               </w:rPr>
-              <w:t>2.3 Actief burgerschap met behulp van digitale technologie</w:t>
+              <w:t>2.3 Betrokkenheid bij burgerschap via digitale technologieën</w:t>
             </w:r>
           </w:p>
           <w:p>
@@ -4052,7 +4262,7 @@
                 <w:color w:val="000000"/>
                 <w:sz w:val="17"/>
               </w:rPr>
-              <w:t>Het deelnemen aan de samenleving door middel van het ethisch en verantwoord gebruik van digitale platforms en diensten. Het zoeken naar mogelijkheden tot het vergroten van zelfredzaamheid en participatie met behulp van daarvoor geschikte digitale technologie. Het bewust zijn van rechten en deze opeisen en het maken van keuzes in digitale omgevingen.</w:t>
+              <w:t>Deelnemen aan de samenleving door het ethisch en verantwoord gebruik van digitale platforms en diensten. Mogelijkheden zoeken voor zelfontplooiing en participatie via passende digitale technologieën. Je bewust zijn van je rechten en deze opeisen, en keuzes maken in digitale omgevingen.</w:t>
             </w:r>
           </w:p>
         </w:tc>
@@ -4098,7 +4308,7 @@
                 <w:color w:val="000000"/>
                 <w:sz w:val="18"/>
               </w:rPr>
-              <w:t xml:space="preserve">De belangrijkste doelen en functies van digitale platforms en diensten herkennen en waar nodig met hulp gebruiken. </w:t>
+              <w:t xml:space="preserve">De belangrijkste doelen en functies van digitale platforms en diensten identificeren, deze gebruiken met hulp indien nodig. </w:t>
             </w:r>
             <w:r>
               <w:rPr>
@@ -4130,7 +4340,7 @@
                 <w:color w:val="000000"/>
                 <w:sz w:val="18"/>
               </w:rPr>
-              <w:t xml:space="preserve">De potentie van digitale technologie voor participatie en empowerment – en uitsluiting – van zichzelf en specifieke groepen en gemeenschappen herkennen. </w:t>
+              <w:t xml:space="preserve">Het potentieel van digitale technologieën herkennen voor participatie en empowerment – en uitsluiting – van zichzelf en specifieke groepen en gemeenschappen. </w:t>
             </w:r>
             <w:r>
               <w:rPr>
@@ -4162,7 +4372,7 @@
                 <w:color w:val="000000"/>
                 <w:sz w:val="18"/>
               </w:rPr>
-              <w:t xml:space="preserve">Erkennen dat er wetten en regels zijn om de rechten van gebruikers van digitale platforms en diensten te beschermen. </w:t>
+              <w:t xml:space="preserve">Herkennen dat er wetten en regels zijn om de rechten van gebruikers van digitale platforms en diensten te beschermen. </w:t>
             </w:r>
             <w:r>
               <w:rPr>
@@ -4194,7 +4404,7 @@
                 <w:color w:val="000000"/>
                 <w:sz w:val="18"/>
               </w:rPr>
-              <w:t xml:space="preserve">Digitale tools gebruiken om gemeenschappen te zoeken en te vinden voor burgerparticipatie rond onderwerpen van interesse. </w:t>
+              <w:t xml:space="preserve">Digitale hulpmiddelen gebruiken om te zoeken naar en het vinden van gemeenschappen voor maatschappelijke participatie over onderwerpen van belang. </w:t>
             </w:r>
             <w:r>
               <w:rPr>
@@ -4231,7 +4441,7 @@
                 <w:color w:val="000000"/>
                 <w:sz w:val="18"/>
               </w:rPr>
-              <w:t>Op intermediairniveau kunnen individuen</w:t>
+              <w:t>Op gemiddeldniveau kunnen individuen</w:t>
             </w:r>
           </w:p>
         </w:tc>
@@ -4291,7 +4501,7 @@
                 <w:color w:val="000000"/>
                 <w:sz w:val="18"/>
               </w:rPr>
-              <w:t xml:space="preserve">Prioriteit geven aan het verkennen van manieren waarop digitale technologie de eigen maatschappelijke participatie kunnen versterken. </w:t>
+              <w:t xml:space="preserve">Prioriteit geven aan het verkennen van manieren waarop digitale technologieën de eigen maatschappelijke participatie kunnen versterken. </w:t>
             </w:r>
             <w:r>
               <w:rPr>
@@ -4323,7 +4533,7 @@
                 <w:color w:val="000000"/>
                 <w:sz w:val="18"/>
               </w:rPr>
-              <w:t xml:space="preserve">De potentiële voordelen van veelvoorkomende vormen van digitale participatie beschrijven, en daarbij erkennen dat maatschappelijke participatie plaatsvindt op een continuüm. </w:t>
+              <w:t xml:space="preserve">De potentiële voordelen beschrijven van veelvoorkomende vormen van digitale participatie, erkennend dat maatschappelijke participatie plaatsvindt op een continuüm. </w:t>
             </w:r>
             <w:r>
               <w:rPr>
@@ -4355,7 +4565,7 @@
                 <w:color w:val="000000"/>
                 <w:sz w:val="18"/>
               </w:rPr>
-              <w:t xml:space="preserve">Belangrijke rechten bij relevante digitale wetten en regels herkennen en bepalen hoe deze uit te oefenen. </w:t>
+              <w:t xml:space="preserve">Belangrijke rechten onder relevante digitale wetten en regels herkennen, en definiëren hoe deze uit te oefenen. </w:t>
             </w:r>
             <w:r>
               <w:rPr>
@@ -4387,7 +4597,7 @@
                 <w:color w:val="000000"/>
                 <w:sz w:val="18"/>
               </w:rPr>
-              <w:t xml:space="preserve">Beschrijven hoe digitale technologie zoals sociale mediaplatforms bepaalde aspecten van de democratie kunnen beïnvloeden (bijvoorbeeld door beïnvloeding van het verkiezingsproces). </w:t>
+              <w:t xml:space="preserve">Beschrijven hoe digitale technologieën zoals sociale mediaplatforms bepaalde aspecten van de basisdemocratie kunnen beïnvloeden (bijvoorbeeld door beïnvloeding van het verkiezingsproces). </w:t>
             </w:r>
             <w:r>
               <w:rPr>
@@ -4419,7 +4629,7 @@
                 <w:color w:val="000000"/>
                 <w:sz w:val="18"/>
               </w:rPr>
-              <w:t xml:space="preserve">Het concept van de platformeconomie beschrijven, inclusief kansen, risico's en sociale en ethische implicaties. </w:t>
+              <w:t xml:space="preserve">Het concept van de platformeconomie beschrijven, inclusief kansen, risico's, sociale en ethische implicaties. </w:t>
             </w:r>
             <w:r>
               <w:rPr>
@@ -4483,7 +4693,7 @@
                 <w:color w:val="000000"/>
                 <w:sz w:val="18"/>
               </w:rPr>
-              <w:t xml:space="preserve">Zelfstandig en effectief interacteren met digitale platforms en diensten. </w:t>
+              <w:t xml:space="preserve">Autonoom en effectief interageren met digitale platforms en diensten. </w:t>
             </w:r>
             <w:r>
               <w:rPr>
@@ -4520,7 +4730,7 @@
                 <w:color w:val="FFFFFF"/>
                 <w:sz w:val="18"/>
               </w:rPr>
-              <w:t>Op gevorderdniveau kunnen individuen</w:t>
+              <w:t>Op geavanceerdniveau kunnen individuen</w:t>
             </w:r>
           </w:p>
         </w:tc>
@@ -4548,7 +4758,7 @@
                 <w:color w:val="000000"/>
                 <w:sz w:val="18"/>
               </w:rPr>
-              <w:t xml:space="preserve">Deelnemen aan discussies over de ethische, politieke en sociale implicaties van digitale technologie en prioriteit geven aan het voortdurend verkennen van manieren waarop digitale technologie empowerment en maatschappelijke participatie kan versterken. </w:t>
+              <w:t xml:space="preserve">Deelnemen aan discussies over de ethische, politieke en sociale implicaties van digitale technologieën, met prioriteit voor het voortdurend verkennen van manieren waarop digitale technologieën empowerment en maatschappelijke participatie kunnen ondersteunen. </w:t>
             </w:r>
             <w:r>
               <w:rPr>
@@ -4580,7 +4790,7 @@
                 <w:color w:val="000000"/>
                 <w:sz w:val="18"/>
               </w:rPr>
-              <w:t xml:space="preserve">De potentie van digitale technologie voor inclusie, uitsluiting en maatschappelijke interventie beoordelen. </w:t>
+              <w:t xml:space="preserve">Het potentieel van digitale technologieën voor inclusie, uitsluiting en maatschappelijke interventie beoordelen. </w:t>
             </w:r>
             <w:r>
               <w:rPr>
@@ -4612,7 +4822,7 @@
                 <w:color w:val="000000"/>
                 <w:sz w:val="18"/>
               </w:rPr>
-              <w:t xml:space="preserve">Verschillende implicaties van digitale technologie beoordelen, zoals sociale mediaplatforms in democratische processen. </w:t>
+              <w:t xml:space="preserve">Verschillende implicaties van digitale technologieën zoals sociale mediaplatforms in democratische processen beoordelen. </w:t>
             </w:r>
             <w:r>
               <w:rPr>
@@ -4644,7 +4854,7 @@
                 <w:color w:val="000000"/>
                 <w:sz w:val="18"/>
               </w:rPr>
-              <w:t xml:space="preserve">Onderscheid maken tussen risicovol en verboden AI-systemen (volgens wetgeving) en hun potentiële maatschappelijke, politieke of economische effecten. </w:t>
+              <w:t xml:space="preserve">Onderscheid maken tussen hoogrisico en verboden AI-systemen (volgens wetgeving) en hun potentiële maatschappelijke, politieke of economische effecten. </w:t>
             </w:r>
             <w:r>
               <w:rPr>
@@ -4676,7 +4886,7 @@
                 <w:color w:val="000000"/>
                 <w:sz w:val="18"/>
               </w:rPr>
-              <w:t xml:space="preserve">Anderen helpen bij het herkennen van kansen en bij het participeren in digitale omgevingen voor empowerment en maatschappelijke participatie (van zichzelf of de gemeenschap). </w:t>
+              <w:t xml:space="preserve">Anderen helpen bij het identificeren van kansen en het participeren in digitale omgevingen voor empowerment en maatschappelijke participatie (van zichzelf of de gemeenschap). </w:t>
             </w:r>
             <w:r>
               <w:rPr>
@@ -4745,7 +4955,7 @@
                 <w:color w:val="FFFFFF"/>
                 <w:sz w:val="18"/>
               </w:rPr>
-              <w:t>Op zeer gevorderdniveau kunnen individuen</w:t>
+              <w:t>Op zeer geavanceerdniveau kunnen individuen</w:t>
             </w:r>
           </w:p>
         </w:tc>
@@ -4773,7 +4983,7 @@
                 <w:color w:val="000000"/>
                 <w:sz w:val="18"/>
               </w:rPr>
-              <w:t xml:space="preserve">Actuele kennis van digitale technologie en wetsontwikkelingen gebruiken om de effecten van digitale technologie op de samenleving, politieke processen of de economie te evalueren, vanuit verschillende perspectieven. </w:t>
+              <w:t xml:space="preserve">Actuele kennis van digitale technologieën en wetsontwikkelingen gebruiken om de effecten van digitale technologieën op de samenleving, politieke processen of de economie te evalueren, vanuit verschillende perspectieven. </w:t>
             </w:r>
             <w:r>
               <w:rPr>
@@ -4805,7 +5015,7 @@
                 <w:color w:val="000000"/>
                 <w:sz w:val="18"/>
               </w:rPr>
-              <w:t xml:space="preserve">Anderen helpen de belangrijkste bepalingen van digitale wetgeving in een specifieke context te begrijpen. </w:t>
+              <w:t xml:space="preserve">Anderen helpen de belangrijkste bepalingen van digitale wetgeving te begrijpen, gegeven een specifieke context. </w:t>
             </w:r>
             <w:r>
               <w:rPr>
@@ -4837,7 +5047,7 @@
                 <w:color w:val="000000"/>
                 <w:sz w:val="18"/>
               </w:rPr>
-              <w:t xml:space="preserve">Digitale burgerschapsinitiatieven leiden of ontwerpen, bijvoorbeeld om maatschappelijke participatie, inclusie of empowerment te bevorderen. </w:t>
+              <w:t xml:space="preserve">Leiding geven aan of ontwerpen van digitale burgerschapsinitiatieven, bijvoorbeeld om maatschappelijke participatie, inclusie of empowerment te bevorderen. </w:t>
             </w:r>
             <w:r>
               <w:rPr>
@@ -4880,7 +5090,42 @@
             <w:tcW w:type="dxa" w:w="3627"/>
             <w:vMerge w:val="restart"/>
           </w:tcPr>
-          <w:p/>
+          <w:p>
+            <w:r>
+              <w:drawing>
+                <wp:inline xmlns:a="http://schemas.openxmlformats.org/drawingml/2006/main" xmlns:pic="http://schemas.openxmlformats.org/drawingml/2006/picture">
+                  <wp:extent cx="1368000" cy="1315803"/>
+                  <wp:docPr id="7" name="Picture 7"/>
+                  <wp:cNvGraphicFramePr>
+                    <a:graphicFrameLocks noChangeAspect="1"/>
+                  </wp:cNvGraphicFramePr>
+                  <a:graphic>
+                    <a:graphicData uri="http://schemas.openxmlformats.org/drawingml/2006/picture">
+                      <pic:pic>
+                        <pic:nvPicPr>
+                          <pic:cNvPr id="0" name="DC3_2p4.png"/>
+                          <pic:cNvPicPr/>
+                        </pic:nvPicPr>
+                        <pic:blipFill>
+                          <a:blip r:embed="rId15"/>
+                          <a:stretch>
+                            <a:fillRect/>
+                          </a:stretch>
+                        </pic:blipFill>
+                        <pic:spPr>
+                          <a:xfrm>
+                            <a:off x="0" y="0"/>
+                            <a:ext cx="1368000" cy="1315803"/>
+                          </a:xfrm>
+                          <a:prstGeom prst="rect"/>
+                        </pic:spPr>
+                      </pic:pic>
+                    </a:graphicData>
+                  </a:graphic>
+                </wp:inline>
+              </w:drawing>
+            </w:r>
+          </w:p>
           <w:p>
             <w:r>
               <w:rPr>
@@ -4902,7 +5147,7 @@
                 <w:color w:val="000000"/>
                 <w:sz w:val="22"/>
               </w:rPr>
-              <w:t>2.4 Samenwerken met behulp van digitale technologie</w:t>
+              <w:t>2.4 Samenwerken via digitale technologieën</w:t>
             </w:r>
           </w:p>
           <w:p>
@@ -4914,7 +5159,7 @@
                 <w:color w:val="000000"/>
                 <w:sz w:val="17"/>
               </w:rPr>
-              <w:t>Het ethisch en verantwoord gebruiken van digitale technologie voor samenwerkingsdoeleinden en voor co-constructie en co-creatie van informatie, bronnen en kennis.</w:t>
+              <w:t>Digitale technologieën ethisch en verantwoord gebruiken voor samenwerking, en voor de gezamenlijke opbouw en creatie van informatie, bronnen en kennis.</w:t>
             </w:r>
           </w:p>
         </w:tc>
@@ -4960,7 +5205,7 @@
                 <w:color w:val="000000"/>
                 <w:sz w:val="18"/>
               </w:rPr>
-              <w:t xml:space="preserve">Deelnemen aan samenwerkingsgroepen via digitale samenwerkingstools en daarbij bewust zijn van hun voordelen en beperkingen. </w:t>
+              <w:t xml:space="preserve">Deelnemen aan samenwerkingsgroepen via digitale samenwerkingshulpmiddelen, hun voordelen en beperkingen herkennend. </w:t>
             </w:r>
             <w:r>
               <w:rPr>
@@ -4992,7 +5237,7 @@
                 <w:color w:val="000000"/>
                 <w:sz w:val="18"/>
               </w:rPr>
-              <w:t xml:space="preserve">De aanwezigheid van AI-systemen in digitale samenwerkingstools herkennen. </w:t>
+              <w:t xml:space="preserve">De aanwezigheid van AI-systemen in digitale samenwerkingshulpmiddelen herkennen. </w:t>
             </w:r>
             <w:r>
               <w:rPr>
@@ -5024,7 +5269,7 @@
                 <w:color w:val="000000"/>
                 <w:sz w:val="18"/>
               </w:rPr>
-              <w:t xml:space="preserve">Het belang inzien van effectieve communicatievaardigheden voor succesvolle samenwerking in digitale omgevingen. </w:t>
+              <w:t xml:space="preserve">Het belang inzien van effectieve communicatieve vaardigheden voor succesvolle samenwerking in digitale omgevingen. </w:t>
             </w:r>
             <w:r>
               <w:rPr>
@@ -5061,7 +5306,7 @@
                 <w:color w:val="000000"/>
                 <w:sz w:val="18"/>
               </w:rPr>
-              <w:t>Op intermediairniveau kunnen individuen</w:t>
+              <w:t>Op gemiddeldniveau kunnen individuen</w:t>
             </w:r>
           </w:p>
         </w:tc>
@@ -5121,7 +5366,7 @@
                 <w:color w:val="000000"/>
                 <w:sz w:val="18"/>
               </w:rPr>
-              <w:t xml:space="preserve">Belangrijke kenmerken en functies van verschillende samenwerkingstools herkennen en deze selecteren om samenwerkingsdoelen te bereiken. </w:t>
+              <w:t xml:space="preserve">Belangrijkste kenmerken en functies van verschillende samenwerkingshulpmiddelen herkennen, en deze selecteren om samenwerkingsdoelen te bereiken. </w:t>
             </w:r>
             <w:r>
               <w:rPr>
@@ -5153,7 +5398,7 @@
                 <w:color w:val="000000"/>
                 <w:sz w:val="18"/>
               </w:rPr>
-              <w:t xml:space="preserve">Voorbeelden herkennen van ethische, verantwoorde en effectieve samenwerking tussen mens en AI. </w:t>
+              <w:t xml:space="preserve">Voorbeelden identificeren van ethische, verantwoordelijke en effectieve samenwerking tussen mens en AI. </w:t>
             </w:r>
             <w:r>
               <w:rPr>
@@ -5185,7 +5430,7 @@
                 <w:color w:val="000000"/>
                 <w:sz w:val="18"/>
               </w:rPr>
-              <w:t xml:space="preserve">Rekening houden met verschillende perspectieven om een gemeenschappelijk doel in digitale omgevingen te helpen bereiken. </w:t>
+              <w:t xml:space="preserve">Rekening houden met verschillende perspectieven om te helpen een gemeenschappelijk doel te bereiken in digitale omgevingen. </w:t>
             </w:r>
             <w:r>
               <w:rPr>
@@ -5222,7 +5467,7 @@
                 <w:color w:val="FFFFFF"/>
                 <w:sz w:val="18"/>
               </w:rPr>
-              <w:t>Op gevorderdniveau kunnen individuen</w:t>
+              <w:t>Op geavanceerdniveau kunnen individuen</w:t>
             </w:r>
           </w:p>
         </w:tc>
@@ -5250,7 +5495,7 @@
                 <w:color w:val="000000"/>
                 <w:sz w:val="18"/>
               </w:rPr>
-              <w:t xml:space="preserve">Verschillende digitale samenwerkingstools gebruiken en combineren en daarbij zorgen voor proportioneel en ethisch gebruik van digitale technologie en mens-AI-samenwerkingsprocessen die voldoen aan de behoeften van projecten, taken en groepen. </w:t>
+              <w:t xml:space="preserve">Verschillende digitale samenwerkingshulpmiddelen gebruiken en combineren, en daarbij zorgen voor proportioneel en ethisch gebruik van digitale technologieën en mens-AI-samenwerkingsprocessen die voldoen aan de behoeften van projecten, taken en groepen. </w:t>
             </w:r>
             <w:r>
               <w:rPr>
@@ -5282,7 +5527,7 @@
                 <w:color w:val="000000"/>
                 <w:sz w:val="18"/>
               </w:rPr>
-              <w:t xml:space="preserve">Samenwerking in digitale omgevingen leiden. </w:t>
+              <w:t xml:space="preserve">Leiding geven aan samenwerking in digitale omgevingen. </w:t>
             </w:r>
             <w:r>
               <w:rPr>
@@ -5314,7 +5559,7 @@
                 <w:color w:val="000000"/>
                 <w:sz w:val="18"/>
               </w:rPr>
-              <w:t xml:space="preserve">Anderen helpen bij het ontwikkelen van hun competenties om samen te werken in digitale omgevingen. </w:t>
+              <w:t xml:space="preserve">Anderen helpen bij het ontwikkelen van hun vaardigheden om samen te werken in digitale omgevingen. </w:t>
             </w:r>
             <w:r>
               <w:rPr>
@@ -5351,7 +5596,7 @@
                 <w:color w:val="FFFFFF"/>
                 <w:sz w:val="18"/>
               </w:rPr>
-              <w:t>Op zeer gevorderdniveau kunnen individuen</w:t>
+              <w:t>Op zeer geavanceerdniveau kunnen individuen</w:t>
             </w:r>
           </w:p>
         </w:tc>
@@ -5379,7 +5624,7 @@
                 <w:color w:val="000000"/>
                 <w:sz w:val="18"/>
               </w:rPr>
-              <w:t xml:space="preserve">Proportioneel, ethisch en effectief gebruik van digitale technologie in samenwerkingen inclusief AI-systemen bevorderen en ondersteunen. </w:t>
+              <w:t xml:space="preserve">Proportioneel, ethisch en effectief gebruik van digitale technologieën inclusief AI-systemen in samenwerkingen bevorderen en ondersteunen. </w:t>
             </w:r>
             <w:r>
               <w:rPr>
@@ -5443,7 +5688,7 @@
                 <w:color w:val="000000"/>
                 <w:sz w:val="18"/>
               </w:rPr>
-              <w:t xml:space="preserve">Anderen helpen bij het ontwikkelen van competenties om leiding te geven aan samenwerking in digitale omgevingen. </w:t>
+              <w:t xml:space="preserve">Anderen helpen bij het ontwikkelen van vaardigheden om leiding te geven aan samenwerking in digitale omgevingen. </w:t>
             </w:r>
             <w:r>
               <w:rPr>
@@ -5475,7 +5720,7 @@
                 <w:color w:val="000000"/>
                 <w:sz w:val="18"/>
               </w:rPr>
-              <w:t xml:space="preserve">Verbeteringen in of nieuwe oplossingen voor mens-AI-samenwerking leiden of hieraan bijdragen. </w:t>
+              <w:t xml:space="preserve">Leiden van of bijdragen aan verbeteringen in of nieuwe oplossingen voor mens-AI-samenwerking. </w:t>
             </w:r>
             <w:r>
               <w:rPr>
@@ -5518,7 +5763,42 @@
             <w:tcW w:type="dxa" w:w="3627"/>
             <w:vMerge w:val="restart"/>
           </w:tcPr>
-          <w:p/>
+          <w:p>
+            <w:r>
+              <w:drawing>
+                <wp:inline xmlns:a="http://schemas.openxmlformats.org/drawingml/2006/main" xmlns:pic="http://schemas.openxmlformats.org/drawingml/2006/picture">
+                  <wp:extent cx="1368000" cy="1315803"/>
+                  <wp:docPr id="8" name="Picture 8"/>
+                  <wp:cNvGraphicFramePr>
+                    <a:graphicFrameLocks noChangeAspect="1"/>
+                  </wp:cNvGraphicFramePr>
+                  <a:graphic>
+                    <a:graphicData uri="http://schemas.openxmlformats.org/drawingml/2006/picture">
+                      <pic:pic>
+                        <pic:nvPicPr>
+                          <pic:cNvPr id="0" name="DC3_2p5.png"/>
+                          <pic:cNvPicPr/>
+                        </pic:nvPicPr>
+                        <pic:blipFill>
+                          <a:blip r:embed="rId16"/>
+                          <a:stretch>
+                            <a:fillRect/>
+                          </a:stretch>
+                        </pic:blipFill>
+                        <pic:spPr>
+                          <a:xfrm>
+                            <a:off x="0" y="0"/>
+                            <a:ext cx="1368000" cy="1315803"/>
+                          </a:xfrm>
+                          <a:prstGeom prst="rect"/>
+                        </pic:spPr>
+                      </pic:pic>
+                    </a:graphicData>
+                  </a:graphic>
+                </wp:inline>
+              </w:drawing>
+            </w:r>
+          </w:p>
           <w:p>
             <w:r>
               <w:rPr>
@@ -5552,7 +5832,7 @@
                 <w:color w:val="000000"/>
                 <w:sz w:val="17"/>
               </w:rPr>
-              <w:t>Het bewust zijn van gedragsnormen en weten hoe men zich respectvol moet gedragen bij het gebruik van digitale technologie en interactie in digitale omgevingen. Het aanpassen van communicatie aan specifieke contexten en bewust zijn en respecteren van culturele, generationele en andersoortige diversiteit in digitale omgevingen.</w:t>
+              <w:t>Je bewust zijn van gedragsnormen en weten hoe je je respectvol moet gedragen bij het gebruik van digitale technologieën en interactie in digitale omgevingen. Communicatie aanpassen aan specifieke contexten en aandacht hebben voor culturele, generationele en andere diversiteit in digitale omgevingen.</w:t>
             </w:r>
           </w:p>
         </w:tc>
@@ -5598,7 +5878,7 @@
                 <w:color w:val="000000"/>
                 <w:sz w:val="18"/>
               </w:rPr>
-              <w:t xml:space="preserve">Verschillen herkennen in verbaal en non-verbaal gedrag in digitale en niet-digitale omgevingen, en erkennen dat er culturele en contextuele verschillen zijn in verbale en non-verbale digitale communicatie. </w:t>
+              <w:t xml:space="preserve">Verschillen herkennen in verbaal en non-verbaal gedrag in digitale en niet-digitale omgevingen, en dat er culturele en contextuele verschillen zijn in verbale en non-verbale digitale communicatie. </w:t>
             </w:r>
             <w:r>
               <w:rPr>
@@ -5662,7 +5942,7 @@
                 <w:color w:val="000000"/>
                 <w:sz w:val="18"/>
               </w:rPr>
-              <w:t xml:space="preserve">Erkennen dat bepaald gedrag in digitale omgevingen mogelijk niet acceptabel is voor anderen en/of juridische gevolgen kan hebben. </w:t>
+              <w:t xml:space="preserve">Herkennen dat bepaald gedrag in digitale omgevingen mogelijk niet acceptabel is voor anderen en/of juridische gevolgen kan hebben. </w:t>
             </w:r>
             <w:r>
               <w:rPr>
@@ -5694,7 +5974,7 @@
                 <w:color w:val="000000"/>
                 <w:sz w:val="18"/>
               </w:rPr>
-              <w:t xml:space="preserve">Een passende toon en visuele expressie zoals emoji's gebruiken in formele en informele digitale omgevingen. </w:t>
+              <w:t xml:space="preserve">Passende toon en visuele expressie zoals emoji gebruiken in formele en informele digitale omgevingen. </w:t>
             </w:r>
             <w:r>
               <w:rPr>
@@ -5731,7 +6011,7 @@
                 <w:color w:val="000000"/>
                 <w:sz w:val="18"/>
               </w:rPr>
-              <w:t>Op intermediairniveau kunnen individuen</w:t>
+              <w:t>Op gemiddeldniveau kunnen individuen</w:t>
             </w:r>
           </w:p>
         </w:tc>
@@ -5791,7 +6071,7 @@
                 <w:color w:val="000000"/>
                 <w:sz w:val="18"/>
               </w:rPr>
-              <w:t xml:space="preserve">Prioriteit geven aan gedrag dat inclusie en een positieve digitale reputatie van zichzelf en anderen bevordert. </w:t>
+              <w:t xml:space="preserve">Prioriteit geven aan gedrag dat inclusie en een positieve digitale reputatie van zichzelf en anderen ondersteunt. </w:t>
             </w:r>
             <w:r>
               <w:rPr>
@@ -5823,7 +6103,7 @@
                 <w:color w:val="000000"/>
                 <w:sz w:val="18"/>
               </w:rPr>
-              <w:t xml:space="preserve">Belangrijke rechten en verantwoordelijkheden van kinderen en volwassenen in relatie tot digitaal gedrag herkennen. </w:t>
+              <w:t xml:space="preserve">Belangrijke rechten en verantwoordelijkheden van kinderen en volwassenen in relatie tot digitaal gedrag identificeren. </w:t>
             </w:r>
             <w:r>
               <w:rPr>
@@ -5860,7 +6140,7 @@
                 <w:color w:val="FFFFFF"/>
                 <w:sz w:val="18"/>
               </w:rPr>
-              <w:t>Op gevorderdniveau kunnen individuen</w:t>
+              <w:t>Op geavanceerdniveau kunnen individuen</w:t>
             </w:r>
           </w:p>
         </w:tc>
@@ -5920,7 +6200,7 @@
                 <w:color w:val="000000"/>
                 <w:sz w:val="18"/>
               </w:rPr>
-              <w:t xml:space="preserve">Onderscheid maken tussen ethisch, legaal en illegaal gedrag in digitale omgevingen en daarbij erkennen dat deze onderscheiden complex kunnen zijn. </w:t>
+              <w:t xml:space="preserve">Onderscheid maken tussen ethisch, legaal en illegaal gedrag in digitale omgevingen, erkennend dat deze onderscheiden complex kunnen zijn. </w:t>
             </w:r>
             <w:r>
               <w:rPr>
@@ -5952,7 +6232,7 @@
                 <w:color w:val="000000"/>
                 <w:sz w:val="18"/>
               </w:rPr>
-              <w:t xml:space="preserve">Patronen van misbruik van specifieke groepen in digitale omgevingen en hun potentiële effecten analyseren en manieren beschrijven waarop deze kunnen worden gemeld en aangepakt. </w:t>
+              <w:t xml:space="preserve">Patronen van misbruik van specifieke groepen in digitale omgevingen en hun potentiële effecten analyseren, en manieren beschrijven waarop deze kunnen worden gemeld en aangepakt. </w:t>
             </w:r>
             <w:r>
               <w:rPr>
@@ -6053,7 +6333,7 @@
                 <w:color w:val="FFFFFF"/>
                 <w:sz w:val="18"/>
               </w:rPr>
-              <w:t>Op zeer gevorderdniveau kunnen individuen</w:t>
+              <w:t>Op zeer geavanceerdniveau kunnen individuen</w:t>
             </w:r>
           </w:p>
         </w:tc>
@@ -6113,7 +6393,7 @@
                 <w:color w:val="000000"/>
                 <w:sz w:val="18"/>
               </w:rPr>
-              <w:t xml:space="preserve">Anderen helpen belangrijke rechten en verantwoordelijkheden onder beleid of wetgeving met betrekking tot digitaal gedrag in een bepaalde context te begrijpen. </w:t>
+              <w:t xml:space="preserve">Anderen helpen belangrijke rechten en verantwoordelijkheden te begrijpen onder beleid of wetgeving met betrekking tot digitaal gedrag in een gegeven context. </w:t>
             </w:r>
             <w:r>
               <w:rPr>
@@ -6145,7 +6425,7 @@
                 <w:color w:val="000000"/>
                 <w:sz w:val="18"/>
               </w:rPr>
-              <w:t xml:space="preserve">Beleid of initiatieven op het gebied van digitaal gedrag leiden of hieraan bijdragen. </w:t>
+              <w:t xml:space="preserve">Leiding geven aan of bijdragen aan beleid of initiatieven op het gebied van digitaal gedrag. </w:t>
             </w:r>
             <w:r>
               <w:rPr>
@@ -6188,7 +6468,42 @@
             <w:tcW w:type="dxa" w:w="3627"/>
             <w:vMerge w:val="restart"/>
           </w:tcPr>
-          <w:p/>
+          <w:p>
+            <w:r>
+              <w:drawing>
+                <wp:inline xmlns:a="http://schemas.openxmlformats.org/drawingml/2006/main" xmlns:pic="http://schemas.openxmlformats.org/drawingml/2006/picture">
+                  <wp:extent cx="1368000" cy="1315803"/>
+                  <wp:docPr id="9" name="Picture 9"/>
+                  <wp:cNvGraphicFramePr>
+                    <a:graphicFrameLocks noChangeAspect="1"/>
+                  </wp:cNvGraphicFramePr>
+                  <a:graphic>
+                    <a:graphicData uri="http://schemas.openxmlformats.org/drawingml/2006/picture">
+                      <pic:pic>
+                        <pic:nvPicPr>
+                          <pic:cNvPr id="0" name="DC3_2p6.png"/>
+                          <pic:cNvPicPr/>
+                        </pic:nvPicPr>
+                        <pic:blipFill>
+                          <a:blip r:embed="rId17"/>
+                          <a:stretch>
+                            <a:fillRect/>
+                          </a:stretch>
+                        </pic:blipFill>
+                        <pic:spPr>
+                          <a:xfrm>
+                            <a:off x="0" y="0"/>
+                            <a:ext cx="1368000" cy="1315803"/>
+                          </a:xfrm>
+                          <a:prstGeom prst="rect"/>
+                        </pic:spPr>
+                      </pic:pic>
+                    </a:graphicData>
+                  </a:graphic>
+                </wp:inline>
+              </w:drawing>
+            </w:r>
+          </w:p>
           <w:p>
             <w:r>
               <w:rPr>
@@ -6210,7 +6525,7 @@
                 <w:color w:val="000000"/>
                 <w:sz w:val="22"/>
               </w:rPr>
-              <w:t>2.6 Beheren van de eigen digitale identiteit</w:t>
+              <w:t>2.6 Digitale identiteit beheren</w:t>
             </w:r>
           </w:p>
           <w:p>
@@ -6222,7 +6537,7 @@
                 <w:color w:val="000000"/>
                 <w:sz w:val="17"/>
               </w:rPr>
-              <w:t>Het beheren van één of meerdere digitale identiteiten. Het ondernemen van acties om de eigen digitale reputatie te beschermen (hoe iemand wordt waargenomen op basis van online aanwezigheid) en het beheren van de eigen digitale voetafdruk (de data die worden geproduceerd door het gebruik van digitale platforms en diensten).</w:t>
+              <w:t>Het beheren van één of meerdere digitale identiteiten. Acties ondernemen om je digitale reputatie te beschermen (hoe je wordt waargenomen op basis van online aanwezigheid) en je digitale voetafdruk beheren (de gegevens die worden geproduceerd door het gebruik van digitale platforms en diensten).</w:t>
             </w:r>
           </w:p>
         </w:tc>
@@ -6300,7 +6615,7 @@
                 <w:color w:val="000000"/>
                 <w:sz w:val="18"/>
               </w:rPr>
-              <w:t xml:space="preserve">Kenmerken van fysieke en digitale identiteiten herkennen, en aspecten van fysieke identiteit herkennen die gekoppeld kunnen worden aan digitale identiteit. </w:t>
+              <w:t xml:space="preserve">Kenmerken van fysieke en digitale identiteiten herkennen, en aspecten van fysieke identiteit identificeren die gekoppeld kunnen worden aan digitale identiteit. </w:t>
             </w:r>
             <w:r>
               <w:rPr>
@@ -6332,7 +6647,7 @@
                 <w:color w:val="000000"/>
                 <w:sz w:val="18"/>
               </w:rPr>
-              <w:t xml:space="preserve">Digitale identiteit herkennen als zowel een middel om een individu te authenticeren (valideren) als de data gegenereerd door de online activiteiten van een individu, en veelvoorkomende vormen en toepassingen van digitale identiteit herkennen. </w:t>
+              <w:t xml:space="preserve">Digitale identiteit herkennen als zowel een middel om een individu te authenticeren (valideren) als de data gegenereerd door de online activiteiten van een individu, en veelvoorkomende vormen en toepassingen van digitale identiteit identificeren. </w:t>
             </w:r>
             <w:r>
               <w:rPr>
@@ -6396,7 +6711,7 @@
                 <w:color w:val="000000"/>
                 <w:sz w:val="18"/>
               </w:rPr>
-              <w:t xml:space="preserve">Erkennen dat wetten voor de bescherming van digitale identiteit de data en privacy van individuen beschermen. </w:t>
+              <w:t xml:space="preserve">Herkennen dat wetten voor de bescherming van digitale identiteit de data en privacy van individuen beschermen. </w:t>
             </w:r>
             <w:r>
               <w:rPr>
@@ -6428,7 +6743,7 @@
                 <w:color w:val="000000"/>
                 <w:sz w:val="18"/>
               </w:rPr>
-              <w:t xml:space="preserve">Eenvoudige maatregelen herkennen en implementeren, zoals het beperken van tracking en het verwijderen van de browsegeschiedenis, om de digitale identiteit te beheren. </w:t>
+              <w:t xml:space="preserve">Eenvoudige maatregelen identificeren en implementeren, zoals het beperken van tracking en het verwijderen van de browsegeschiedenis, om de digitale identiteit te beheren. </w:t>
             </w:r>
             <w:r>
               <w:rPr>
@@ -6465,7 +6780,7 @@
                 <w:color w:val="000000"/>
                 <w:sz w:val="18"/>
               </w:rPr>
-              <w:t>Op intermediairniveau kunnen individuen</w:t>
+              <w:t>Op gemiddeldniveau kunnen individuen</w:t>
             </w:r>
           </w:p>
         </w:tc>
@@ -6525,7 +6840,7 @@
                 <w:color w:val="000000"/>
                 <w:sz w:val="18"/>
               </w:rPr>
-              <w:t xml:space="preserve">Voorbeelden herkennen van actief en passief gegenereerde informatie in relatie tot digitale identiteit. </w:t>
+              <w:t xml:space="preserve">Voorbeelden identificeren van actief en passief gegenereerde informatie in relatie tot digitale identiteit. </w:t>
             </w:r>
             <w:r>
               <w:rPr>
@@ -6621,7 +6936,7 @@
                 <w:color w:val="000000"/>
                 <w:sz w:val="18"/>
               </w:rPr>
-              <w:t xml:space="preserve">Een of meer digitale identiteiten cureren en beheren met behulp van verschillende kenmerken en functionaliteiten van digitale platforms of diensten. </w:t>
+              <w:t xml:space="preserve">Een of meer digitale identiteiten cureren en beheren met behulp van verschillende kenmerken en functionaliteiten op digitale platforms of diensten. </w:t>
             </w:r>
             <w:r>
               <w:rPr>
@@ -6658,7 +6973,7 @@
                 <w:color w:val="FFFFFF"/>
                 <w:sz w:val="18"/>
               </w:rPr>
-              <w:t>Op gevorderdniveau kunnen individuen</w:t>
+              <w:t>Op geavanceerdniveau kunnen individuen</w:t>
             </w:r>
           </w:p>
         </w:tc>
@@ -6686,7 +7001,7 @@
                 <w:color w:val="000000"/>
                 <w:sz w:val="18"/>
               </w:rPr>
-              <w:t xml:space="preserve">Manieren beschrijven om wettelijke rechten uit te oefenen bij kwesties die verband houden met digitale identiteit. </w:t>
+              <w:t xml:space="preserve">Manieren beschrijven om wettelijke rechten uit te oefenen in kwesties die verband houden met digitale identiteit. </w:t>
             </w:r>
             <w:r>
               <w:rPr>
@@ -6782,7 +7097,7 @@
                 <w:color w:val="000000"/>
                 <w:sz w:val="18"/>
               </w:rPr>
-              <w:t xml:space="preserve">Digitale identiteiten voor persoonlijke, professionele en/of organisatorische doeleinden over verschillende platforms en diensten cureren en beheren. </w:t>
+              <w:t xml:space="preserve">Digitale identiteiten cureren en beheren voor persoonlijke, professionele en/of organisatorische doeleinden over verschillende platforms en diensten. </w:t>
             </w:r>
             <w:r>
               <w:rPr>
@@ -6814,7 +7129,7 @@
                 <w:color w:val="000000"/>
                 <w:sz w:val="18"/>
               </w:rPr>
-              <w:t xml:space="preserve">Anderen helpen bij het basale beheer van hun digitale identiteit. </w:t>
+              <w:t xml:space="preserve">Anderen helpen bij het basisbeheer van hun digitale identiteit. </w:t>
             </w:r>
             <w:r>
               <w:rPr>
@@ -6851,7 +7166,7 @@
                 <w:color w:val="FFFFFF"/>
                 <w:sz w:val="18"/>
               </w:rPr>
-              <w:t>Op zeer gevorderdniveau kunnen individuen</w:t>
+              <w:t>Op zeer geavanceerdniveau kunnen individuen</w:t>
             </w:r>
           </w:p>
         </w:tc>
@@ -6879,7 +7194,7 @@
                 <w:color w:val="000000"/>
                 <w:sz w:val="18"/>
               </w:rPr>
-              <w:t xml:space="preserve">Op de hoogte blijven van ontwikkelingen in digitale technologie in relatie tot het beheer en de bescherming van de digitale identiteit. </w:t>
+              <w:t xml:space="preserve">Op de hoogte blijven van ontwikkelingen in digitale technologieën in relatie tot het beheer en de bescherming van de digitale identiteit. </w:t>
             </w:r>
             <w:r>
               <w:rPr>
@@ -6911,7 +7226,7 @@
                 <w:color w:val="000000"/>
                 <w:sz w:val="18"/>
               </w:rPr>
-              <w:t xml:space="preserve">Anderen ondersteunen bij het versterken van hun competenties in het beheer en de curatie van digitale identiteiten. </w:t>
+              <w:t xml:space="preserve">Anderen ondersteunen bij het verdiepen van hun vaardigheden in het beheer en de curatie van digitale identiteiten. </w:t>
             </w:r>
             <w:r>
               <w:rPr>
@@ -6986,7 +7301,42 @@
             <w:tcW w:type="dxa" w:w="3627"/>
             <w:vMerge w:val="restart"/>
           </w:tcPr>
-          <w:p/>
+          <w:p>
+            <w:r>
+              <w:drawing>
+                <wp:inline xmlns:a="http://schemas.openxmlformats.org/drawingml/2006/main" xmlns:pic="http://schemas.openxmlformats.org/drawingml/2006/picture">
+                  <wp:extent cx="1368000" cy="1315803"/>
+                  <wp:docPr id="10" name="Picture 10"/>
+                  <wp:cNvGraphicFramePr>
+                    <a:graphicFrameLocks noChangeAspect="1"/>
+                  </wp:cNvGraphicFramePr>
+                  <a:graphic>
+                    <a:graphicData uri="http://schemas.openxmlformats.org/drawingml/2006/picture">
+                      <pic:pic>
+                        <pic:nvPicPr>
+                          <pic:cNvPr id="0" name="DC3_3p1.png"/>
+                          <pic:cNvPicPr/>
+                        </pic:nvPicPr>
+                        <pic:blipFill>
+                          <a:blip r:embed="rId18"/>
+                          <a:stretch>
+                            <a:fillRect/>
+                          </a:stretch>
+                        </pic:blipFill>
+                        <pic:spPr>
+                          <a:xfrm>
+                            <a:off x="0" y="0"/>
+                            <a:ext cx="1368000" cy="1315803"/>
+                          </a:xfrm>
+                          <a:prstGeom prst="rect"/>
+                        </pic:spPr>
+                      </pic:pic>
+                    </a:graphicData>
+                  </a:graphic>
+                </wp:inline>
+              </w:drawing>
+            </w:r>
+          </w:p>
           <w:p>
             <w:r>
               <w:rPr>
@@ -7008,7 +7358,7 @@
                 <w:color w:val="000000"/>
                 <w:sz w:val="22"/>
               </w:rPr>
-              <w:t>3.1 Ontwikkelen van digitale content</w:t>
+              <w:t>3.1 Digitale inhoud ontwikkelen</w:t>
             </w:r>
           </w:p>
           <w:p>
@@ -7020,7 +7370,7 @@
                 <w:color w:val="000000"/>
                 <w:sz w:val="17"/>
               </w:rPr>
-              <w:t>Het ethisch en verantwoord gebruiken van digitale technologie om een verscheidenheid aan content te creëren en te bewerken. Het zichzelf uitdrukken met behulp van digitale middelen.</w:t>
+              <w:t>Digitale technologieën op een ethische en verantwoorde manier gebruiken om uiteenlopende inhoud te creëren en te bewerken. Jezelf uitdrukken via digitale middelen.</w:t>
             </w:r>
           </w:p>
         </w:tc>
@@ -7066,7 +7416,7 @@
                 <w:color w:val="000000"/>
                 <w:sz w:val="18"/>
               </w:rPr>
-              <w:t xml:space="preserve">De voordelen inzien van het verkennen van verschillende tools voor het creëren van digitale content ter ondersteuning van contentcreatiedoelen. </w:t>
+              <w:t xml:space="preserve">De voordelen inzien van het verkennen van verschillende hulpmiddelen voor het creëren van digitale inhoud ter ondersteuning van contentcreatiedoelen. </w:t>
             </w:r>
             <w:r>
               <w:rPr>
@@ -7098,7 +7448,7 @@
                 <w:color w:val="000000"/>
                 <w:sz w:val="18"/>
               </w:rPr>
-              <w:t xml:space="preserve">Het belang inzien van toegankelijke en inclusieve digitale content. </w:t>
+              <w:t xml:space="preserve">Het belang inzien van toegankelijke en inclusieve digitale inhoud. </w:t>
             </w:r>
             <w:r>
               <w:rPr>
@@ -7130,7 +7480,7 @@
                 <w:color w:val="000000"/>
                 <w:sz w:val="18"/>
               </w:rPr>
-              <w:t xml:space="preserve">Veelvoorkomende soorten digitale content en bestandsformaten herkennen, evenals veelvoorkomende operationele functies binnen tools voor het creëren van digitale content. </w:t>
+              <w:t xml:space="preserve">Veelvoorkomende soorten digitale inhoud en bestandsformaten identificeren, evenals veelvoorkomende operationele functies binnen hulpmiddelen voor het creëren van digitale inhoud. </w:t>
             </w:r>
             <w:r>
               <w:rPr>
@@ -7162,7 +7512,7 @@
                 <w:color w:val="000000"/>
                 <w:sz w:val="18"/>
               </w:rPr>
-              <w:t xml:space="preserve">Erkennen dat AI-systemen weliswaar content kunnen genereren, maar dat mensen essentieel zijn om te waarborgen dat resultaten ethisch, verantwoord en passend in de context zijn. </w:t>
+              <w:t xml:space="preserve">Herkennen dat AI-systemen weliswaar inhoud kunnen genereren, maar dat mensen essentieel zijn om ethische, verantwoordelijke en context-passende outputs te waarborgen. </w:t>
             </w:r>
             <w:r>
               <w:rPr>
@@ -7194,7 +7544,7 @@
                 <w:color w:val="000000"/>
                 <w:sz w:val="18"/>
               </w:rPr>
-              <w:t xml:space="preserve">Erkennen dat generatieve AI een specifiek type AI is en een van de verschillende digitale technologieën die gebruikt kunnen worden om contentcreatie te ondersteunen. </w:t>
+              <w:t xml:space="preserve">Herkennen dat generatieve AI een specifiek type AI is en een van de verschillende digitale technologieën die gebruikt kunnen worden om contentcreatie te ondersteunen. </w:t>
             </w:r>
             <w:r>
               <w:rPr>
@@ -7226,7 +7576,7 @@
                 <w:color w:val="000000"/>
                 <w:sz w:val="18"/>
               </w:rPr>
-              <w:t xml:space="preserve">Basale functies van tools voor contentcreatie gebruiken om digitale content te creëren en te bewerken. </w:t>
+              <w:t xml:space="preserve">Basiskenmerken van hulpmiddelen voor contentcreatie gebruiken om digitale inhoud te creëren en te bewerken. </w:t>
             </w:r>
             <w:r>
               <w:rPr>
@@ -7263,7 +7613,7 @@
                 <w:color w:val="000000"/>
                 <w:sz w:val="18"/>
               </w:rPr>
-              <w:t>Op intermediairniveau kunnen individuen</w:t>
+              <w:t>Op gemiddeldniveau kunnen individuen</w:t>
             </w:r>
           </w:p>
         </w:tc>
@@ -7291,7 +7641,7 @@
                 <w:color w:val="000000"/>
                 <w:sz w:val="18"/>
               </w:rPr>
-              <w:t xml:space="preserve">Doelgericht kenmerken en functies van tools voor het creëren van digitale content verkennen om competenties te versterken. </w:t>
+              <w:t xml:space="preserve">Doelgericht kenmerken en functies van hulpmiddelen voor het creëren van digitale inhoud verkennen om vaardigheden te verdiepen. </w:t>
             </w:r>
             <w:r>
               <w:rPr>
@@ -7323,7 +7673,7 @@
                 <w:color w:val="000000"/>
                 <w:sz w:val="18"/>
               </w:rPr>
-              <w:t xml:space="preserve">Voordelen en beperkingen bij het gebruik van digitale technologie zoals AI-systemen voor contentcreatie beschrijven en deze selectief en ethisch gebruiken. </w:t>
+              <w:t xml:space="preserve">Voordelen en beperkingen beschrijven bij het gebruik van digitale technologieën zoals AI-systemen voor contentcreatie, en deze selectief en ethisch gebruiken. </w:t>
             </w:r>
             <w:r>
               <w:rPr>
@@ -7355,7 +7705,7 @@
                 <w:color w:val="000000"/>
                 <w:sz w:val="18"/>
               </w:rPr>
-              <w:t xml:space="preserve">Verschillende tools voor contentcreatie gebruiken om digitale content te creëren en te bewerken. </w:t>
+              <w:t xml:space="preserve">Verschillende hulpmiddelen voor contentcreatie gebruiken om digitale inhoud te creëren en te bewerken. </w:t>
             </w:r>
             <w:r>
               <w:rPr>
@@ -7387,7 +7737,7 @@
                 <w:color w:val="000000"/>
                 <w:sz w:val="18"/>
               </w:rPr>
-              <w:t xml:space="preserve">Strategieën toepassen die efficiënte creatie van digitale content mogelijk maken. </w:t>
+              <w:t xml:space="preserve">Strategieën toepassen die efficiënte creatie van digitale inhoud mogelijk maken. </w:t>
             </w:r>
             <w:r>
               <w:rPr>
@@ -7419,7 +7769,7 @@
                 <w:color w:val="000000"/>
                 <w:sz w:val="18"/>
               </w:rPr>
-              <w:t xml:space="preserve">De toegankelijkheids- en inclusiviteitsbehoeften van het publiek beoordelen en digitale content dienovereenkomstig creëren en bewerken. </w:t>
+              <w:t xml:space="preserve">De toegankelijkheids- en inclusiviteitsbehoeften van het publiek beoordelen, en digitale inhoud dienovereenkomstig creëren en bewerken. </w:t>
             </w:r>
             <w:r>
               <w:rPr>
@@ -7456,7 +7806,7 @@
                 <w:color w:val="000000"/>
                 <w:sz w:val="18"/>
               </w:rPr>
-              <w:t>Op gevorderdniveau kunnen individuen</w:t>
+              <w:t>Op geavanceerdniveau kunnen individuen</w:t>
             </w:r>
           </w:p>
         </w:tc>
@@ -7484,7 +7834,7 @@
                 <w:color w:val="000000"/>
                 <w:sz w:val="18"/>
               </w:rPr>
-              <w:t xml:space="preserve">Het belang inzien van het beoordelen van mogelijkheden, beperkingen en ethische aspecten van tools voor het creëren van digitale content. </w:t>
+              <w:t xml:space="preserve">Het belang inzien van het beoordelen van mogelijkheden, beperkingen en ethische aspecten van hulpmiddelen voor het creëren van digitale inhoud. </w:t>
             </w:r>
             <w:r>
               <w:rPr>
@@ -7516,7 +7866,7 @@
                 <w:color w:val="000000"/>
                 <w:sz w:val="18"/>
               </w:rPr>
-              <w:t xml:space="preserve">Tools en methoden voor het creëren van digitale content selecteren en combineren om te voldoen aan complexe contentcreatietaken en publiekseisen. </w:t>
+              <w:t xml:space="preserve">Hulpmiddelen en methoden voor het creëren van digitale inhoud selecteren en combineren om te voldoen aan complexe contentcreatietaken en publiekseisen. </w:t>
             </w:r>
             <w:r>
               <w:rPr>
@@ -7548,7 +7898,7 @@
                 <w:color w:val="000000"/>
                 <w:sz w:val="18"/>
               </w:rPr>
-              <w:t xml:space="preserve">Complexe of gespecialiseerde digitale content creëren en bewerken, afgestemd op de doelen en het publiek. </w:t>
+              <w:t xml:space="preserve">Complexe of gespecialiseerde digitale inhoud creëren en bewerken, passend afgestemd op doelen en publiek. </w:t>
             </w:r>
             <w:r>
               <w:rPr>
@@ -7580,7 +7930,7 @@
                 <w:color w:val="000000"/>
                 <w:sz w:val="18"/>
               </w:rPr>
-              <w:t xml:space="preserve">Anderen ondersteunen bij het ontwikkelen van hun competenties in digitale contentcreatie door middel van ethische en verantwoorde benaderingen. </w:t>
+              <w:t xml:space="preserve">Anderen ondersteunen bij het ontwikkelen van hun vaardigheden in de creatie van digitale inhoud door middel van ethische en verantwoordelijke benaderingen. </w:t>
             </w:r>
             <w:r>
               <w:rPr>
@@ -7617,7 +7967,7 @@
                 <w:color w:val="000000"/>
                 <w:sz w:val="18"/>
               </w:rPr>
-              <w:t>Op zeer gevorderdniveau kunnen individuen</w:t>
+              <w:t>Op zeer geavanceerdniveau kunnen individuen</w:t>
             </w:r>
           </w:p>
         </w:tc>
@@ -7645,7 +7995,7 @@
                 <w:color w:val="000000"/>
                 <w:sz w:val="18"/>
               </w:rPr>
-              <w:t xml:space="preserve">Toegankelijkheid en inclusiviteit bij digitale contentcreatie bevorderen en ondersteunen, evenals het selectieve en ethische gebruik van AI-systemen hierbij. </w:t>
+              <w:t xml:space="preserve">Toegankelijkheid en inclusiviteit, en het selectieve en ethische gebruik van AI-systemen bij de creatie van digitale inhoud bevorderen en ondersteunen. </w:t>
             </w:r>
             <w:r>
               <w:rPr>
@@ -7677,7 +8027,7 @@
                 <w:color w:val="000000"/>
                 <w:sz w:val="18"/>
               </w:rPr>
-              <w:t xml:space="preserve">Anderen helpen geavanceerde competenties in digitale contentcreatie te ontwikkelen. </w:t>
+              <w:t xml:space="preserve">Anderen helpen bij het ontwikkelen van geavanceerde vaardigheden in de creatie van digitale inhoud. </w:t>
             </w:r>
             <w:r>
               <w:rPr>
@@ -7709,7 +8059,7 @@
                 <w:color w:val="000000"/>
                 <w:sz w:val="18"/>
               </w:rPr>
-              <w:t xml:space="preserve">Complexe of gespecialiseerde initiatieven voor digitale contentcreatie leiden of hieraan bijdragen. </w:t>
+              <w:t xml:space="preserve">Leiding geven aan of bijdragen aan complexe of gespecialiseerde initiatieven voor de creatie van digitale inhoud. </w:t>
             </w:r>
             <w:r>
               <w:rPr>
@@ -7741,7 +8091,7 @@
                 <w:color w:val="000000"/>
                 <w:sz w:val="18"/>
               </w:rPr>
-              <w:t xml:space="preserve">Verbeteringen in of nieuwe oplossingen voor complexe of gespecialiseerde digitale content leiden of hieraan bijdragen. </w:t>
+              <w:t xml:space="preserve">Leiden van of bijdragen aan verbeteringen in of nieuwe oplossingen voor complexe of gespecialiseerde digitale inhoud. </w:t>
             </w:r>
             <w:r>
               <w:rPr>
@@ -7784,7 +8134,42 @@
             <w:tcW w:type="dxa" w:w="3627"/>
             <w:vMerge w:val="restart"/>
           </w:tcPr>
-          <w:p/>
+          <w:p>
+            <w:r>
+              <w:drawing>
+                <wp:inline xmlns:a="http://schemas.openxmlformats.org/drawingml/2006/main" xmlns:pic="http://schemas.openxmlformats.org/drawingml/2006/picture">
+                  <wp:extent cx="1368000" cy="1315803"/>
+                  <wp:docPr id="11" name="Picture 11"/>
+                  <wp:cNvGraphicFramePr>
+                    <a:graphicFrameLocks noChangeAspect="1"/>
+                  </wp:cNvGraphicFramePr>
+                  <a:graphic>
+                    <a:graphicData uri="http://schemas.openxmlformats.org/drawingml/2006/picture">
+                      <pic:pic>
+                        <pic:nvPicPr>
+                          <pic:cNvPr id="0" name="DC3_3p2.png"/>
+                          <pic:cNvPicPr/>
+                        </pic:nvPicPr>
+                        <pic:blipFill>
+                          <a:blip r:embed="rId19"/>
+                          <a:stretch>
+                            <a:fillRect/>
+                          </a:stretch>
+                        </pic:blipFill>
+                        <pic:spPr>
+                          <a:xfrm>
+                            <a:off x="0" y="0"/>
+                            <a:ext cx="1368000" cy="1315803"/>
+                          </a:xfrm>
+                          <a:prstGeom prst="rect"/>
+                        </pic:spPr>
+                      </pic:pic>
+                    </a:graphicData>
+                  </a:graphic>
+                </wp:inline>
+              </w:drawing>
+            </w:r>
+          </w:p>
           <w:p>
             <w:r>
               <w:rPr>
@@ -7806,7 +8191,7 @@
                 <w:color w:val="000000"/>
                 <w:sz w:val="22"/>
               </w:rPr>
-              <w:t>3.2 Digitale content integreren en bewerken</w:t>
+              <w:t>3.2 Integreren en herwerken van digitale inhoud</w:t>
             </w:r>
           </w:p>
           <w:p>
@@ -7818,7 +8203,7 @@
                 <w:color w:val="000000"/>
                 <w:sz w:val="17"/>
               </w:rPr>
-              <w:t>Het wijzigen, verfijnen en integreren van nieuwe informatie en content in bestaande kennis en bronnen om nieuwe en originele content en kennis te creëren.</w:t>
+              <w:t>Nieuwe informatie en inhoud aanpassen, verfijnen en integreren in bestaande kennis en bronnen om nieuwe en originele inhoud en kennis te creëren.</w:t>
             </w:r>
           </w:p>
         </w:tc>
@@ -7864,7 +8249,7 @@
                 <w:color w:val="000000"/>
                 <w:sz w:val="18"/>
               </w:rPr>
-              <w:t xml:space="preserve">Het belang inzien van ethische en transparante werkwijzen bij het hergebruiken of uitbreiden van bestaande digitale content. </w:t>
+              <w:t xml:space="preserve">Het belang inzien van ethische en transparante praktijken bij het hergebruiken of uitwerken van bestaande digitale inhoud. </w:t>
             </w:r>
             <w:r>
               <w:rPr>
@@ -7896,7 +8281,7 @@
                 <w:color w:val="000000"/>
                 <w:sz w:val="18"/>
               </w:rPr>
-              <w:t xml:space="preserve">De voordelen inzien van het verkennen van tools en technieken voor de integratie en uitbreiding van digitale content. </w:t>
+              <w:t xml:space="preserve">De voordelen inzien van het verkennen van hulpmiddelen en technieken voor de integratie en uitwerking van digitale inhoud. </w:t>
             </w:r>
             <w:r>
               <w:rPr>
@@ -7928,7 +8313,7 @@
                 <w:color w:val="000000"/>
                 <w:sz w:val="18"/>
               </w:rPr>
-              <w:t xml:space="preserve">Onderscheid maken tussen bewerkbare en niet-bewerkbare digitale content. </w:t>
+              <w:t xml:space="preserve">Onderscheid maken tussen bewerkbare en niet-bewerkbare digitale inhoud. </w:t>
             </w:r>
             <w:r>
               <w:rPr>
@@ -7960,7 +8345,7 @@
                 <w:color w:val="000000"/>
                 <w:sz w:val="18"/>
               </w:rPr>
-              <w:t xml:space="preserve">Wijzigingen aanbrengen in digitale content met behulp van basale bewerkings-, formatterings- en integratiefuncties. </w:t>
+              <w:t xml:space="preserve">Wijzigingen aanbrengen in digitale inhoud met behulp van basisbewerkings-, formatterings- en integratiefuncties. </w:t>
             </w:r>
             <w:r>
               <w:rPr>
@@ -7997,7 +8382,7 @@
                 <w:color w:val="000000"/>
                 <w:sz w:val="18"/>
               </w:rPr>
-              <w:t>Op intermediairniveau kunnen individuen</w:t>
+              <w:t>Op gemiddeldniveau kunnen individuen</w:t>
             </w:r>
           </w:p>
         </w:tc>
@@ -8025,7 +8410,7 @@
                 <w:color w:val="000000"/>
                 <w:sz w:val="18"/>
               </w:rPr>
-              <w:t xml:space="preserve">Doelgericht verschillende manieren om digitale content te integreren en opnieuw vorm te geven verkennen. </w:t>
+              <w:t xml:space="preserve">Doelgericht verschillende manieren verkennen om digitale inhoud te integreren en te herbewerken. </w:t>
             </w:r>
             <w:r>
               <w:rPr>
@@ -8057,7 +8442,7 @@
                 <w:color w:val="000000"/>
                 <w:sz w:val="18"/>
               </w:rPr>
-              <w:t xml:space="preserve">Digitale content aanpassen of integreren zodat deze voldoet aan formaat-, structuur- en publiekseisen. </w:t>
+              <w:t xml:space="preserve">Digitale inhoud aanpassen of integreren om te voldoen aan formaat-, structuur- en publiekseisen. </w:t>
             </w:r>
             <w:r>
               <w:rPr>
@@ -8121,7 +8506,7 @@
                 <w:color w:val="000000"/>
                 <w:sz w:val="18"/>
               </w:rPr>
-              <w:t xml:space="preserve">Digitale technologie op een selectieve, ethische, transparante en verantwoorde manier gebruiken om verbeteringen of integraties aan te brengen in bestaande digitale content. </w:t>
+              <w:t xml:space="preserve">Digitale technologieën op een selectieve, ethische, transparante en verantwoordelijke manier gebruiken om verbeteringen of integraties aan te brengen in bestaande digitale inhoud. </w:t>
             </w:r>
             <w:r>
               <w:rPr>
@@ -8158,7 +8543,7 @@
                 <w:color w:val="000000"/>
                 <w:sz w:val="18"/>
               </w:rPr>
-              <w:t>Op gevorderdniveau kunnen individuen</w:t>
+              <w:t>Op geavanceerdniveau kunnen individuen</w:t>
             </w:r>
           </w:p>
         </w:tc>
@@ -8186,7 +8571,7 @@
                 <w:color w:val="000000"/>
                 <w:sz w:val="18"/>
               </w:rPr>
-              <w:t xml:space="preserve">Een verscheidenheid aan digitale content aanpassen of integreren zodat deze voldoet aan complexe formaat-, structuur- en publiekseisen. </w:t>
+              <w:t xml:space="preserve">Verschillende soorten digitale inhoud aanpassen of integreren om te voldoen aan complexe formaat-, structuur- en publiekseisen. </w:t>
             </w:r>
             <w:r>
               <w:rPr>
@@ -8218,7 +8603,7 @@
                 <w:color w:val="000000"/>
                 <w:sz w:val="18"/>
               </w:rPr>
-              <w:t xml:space="preserve">Digitale technologie op een selectieve, ethische en transparante manier inzetten om verbeteringen of integraties aan te brengen in complexe digitale content. </w:t>
+              <w:t xml:space="preserve">Digitale technologieën op een selectieve, ethische en transparante manier inzetten om verbeteringen of integraties aan te brengen in complexe digitale inhoud. </w:t>
             </w:r>
             <w:r>
               <w:rPr>
@@ -8250,7 +8635,7 @@
                 <w:color w:val="000000"/>
                 <w:sz w:val="18"/>
               </w:rPr>
-              <w:t xml:space="preserve">Anderen ondersteunen bij het ontwikkelen van hun competenties in het verbeteren van digitale content. </w:t>
+              <w:t xml:space="preserve">Anderen ondersteunen bij het ontwikkelen van hun vaardigheden in het verbeteren van digitale inhoud. </w:t>
             </w:r>
             <w:r>
               <w:rPr>
@@ -8287,7 +8672,7 @@
                 <w:color w:val="000000"/>
                 <w:sz w:val="18"/>
               </w:rPr>
-              <w:t>Op zeer gevorderdniveau kunnen individuen</w:t>
+              <w:t>Op zeer geavanceerdniveau kunnen individuen</w:t>
             </w:r>
           </w:p>
         </w:tc>
@@ -8315,7 +8700,7 @@
                 <w:color w:val="000000"/>
                 <w:sz w:val="18"/>
               </w:rPr>
-              <w:t xml:space="preserve">Ethische en transparante werkwijzen bij de integratie en het opnieuw vormgeven van digitale content bevorderen en ondersteunen die aansluiten bij actuele technologische ontwikkelingen. </w:t>
+              <w:t xml:space="preserve">Ethische en transparante praktijken bij de integratie en herbewerking van digitale inhoud bevorderen en ondersteunen, geïnformeerd door actuele technologische ontwikkelingen. </w:t>
             </w:r>
             <w:r>
               <w:rPr>
@@ -8347,7 +8732,7 @@
                 <w:color w:val="000000"/>
                 <w:sz w:val="18"/>
               </w:rPr>
-              <w:t xml:space="preserve">Geavanceerde ontwerp- en datavisualisatietechnieken beoordelen en toepassen op complexe of gespecialiseerde integratie en herbewerking van digitale content. </w:t>
+              <w:t xml:space="preserve">Geavanceerde ontwerp- en datavisualisatietechnieken evalueren en toepassen op complexe of gespecialiseerde integratie en herbewerking van digitale inhoud. </w:t>
             </w:r>
             <w:r>
               <w:rPr>
@@ -8379,7 +8764,7 @@
                 <w:color w:val="000000"/>
                 <w:sz w:val="18"/>
               </w:rPr>
-              <w:t xml:space="preserve">Anderen helpen bij complexe taken voor integratie en opnieuw vormgeven van digitale content. </w:t>
+              <w:t xml:space="preserve">Anderen helpen bij complexe taken voor integratie en herbewerking van digitale inhoud. </w:t>
             </w:r>
             <w:r>
               <w:rPr>
@@ -8411,7 +8796,7 @@
                 <w:color w:val="000000"/>
                 <w:sz w:val="18"/>
               </w:rPr>
-              <w:t xml:space="preserve">Complexe initiatieven voor de integratie of het opnieuw vormgeven van digitale content leiden of hieraan bijdragen, of aan verbeteringen in of nieuwe oplossingen daarvoor. </w:t>
+              <w:t xml:space="preserve">Leiding geven aan of bijdragen aan complexe initiatieven voor de integratie of herbewerking van digitale inhoud, of aan verbeteringen in of nieuwe oplossingen daarvoor. </w:t>
             </w:r>
             <w:r>
               <w:rPr>
@@ -8454,7 +8839,42 @@
             <w:tcW w:type="dxa" w:w="3627"/>
             <w:vMerge w:val="restart"/>
           </w:tcPr>
-          <w:p/>
+          <w:p>
+            <w:r>
+              <w:drawing>
+                <wp:inline xmlns:a="http://schemas.openxmlformats.org/drawingml/2006/main" xmlns:pic="http://schemas.openxmlformats.org/drawingml/2006/picture">
+                  <wp:extent cx="1368000" cy="1315803"/>
+                  <wp:docPr id="12" name="Picture 12"/>
+                  <wp:cNvGraphicFramePr>
+                    <a:graphicFrameLocks noChangeAspect="1"/>
+                  </wp:cNvGraphicFramePr>
+                  <a:graphic>
+                    <a:graphicData uri="http://schemas.openxmlformats.org/drawingml/2006/picture">
+                      <pic:pic>
+                        <pic:nvPicPr>
+                          <pic:cNvPr id="0" name="DC3_3p3.png"/>
+                          <pic:cNvPicPr/>
+                        </pic:nvPicPr>
+                        <pic:blipFill>
+                          <a:blip r:embed="rId20"/>
+                          <a:stretch>
+                            <a:fillRect/>
+                          </a:stretch>
+                        </pic:blipFill>
+                        <pic:spPr>
+                          <a:xfrm>
+                            <a:off x="0" y="0"/>
+                            <a:ext cx="1368000" cy="1315803"/>
+                          </a:xfrm>
+                          <a:prstGeom prst="rect"/>
+                        </pic:spPr>
+                      </pic:pic>
+                    </a:graphicData>
+                  </a:graphic>
+                </wp:inline>
+              </w:drawing>
+            </w:r>
+          </w:p>
           <w:p>
             <w:r>
               <w:rPr>
@@ -8488,7 +8908,7 @@
                 <w:color w:val="000000"/>
                 <w:sz w:val="17"/>
               </w:rPr>
-              <w:t>Het begrijpen hoe auteursrecht en licenties, evenals bijbehorende juridische en ethische kwesties, van toepassing zijn op digitale content, en hoe deze correct moeten worden toegepast.</w:t>
+              <w:t>Begrijpen hoe auteursrecht en licenties, evenals de bijbehorende juridische en ethische kwesties, van toepassing zijn op digitale inhoud, en hoe deze correct moeten worden toegepast.</w:t>
             </w:r>
           </w:p>
         </w:tc>
@@ -8534,7 +8954,7 @@
                 <w:color w:val="000000"/>
                 <w:sz w:val="18"/>
               </w:rPr>
-              <w:t xml:space="preserve">De algemene concepten van auteursrecht en licenties in digitale contexten herkennen, en erkennen dat op de originele digitale content van een individu automatisch auteursrecht rust. </w:t>
+              <w:t xml:space="preserve">De algemene concepten van auteursrecht en licenties herkennen in digitale contexten, en dat op de originele digitale inhoud van een individu automatisch auteursrecht rust. </w:t>
             </w:r>
             <w:r>
               <w:rPr>
@@ -8566,7 +8986,7 @@
                 <w:color w:val="000000"/>
                 <w:sz w:val="18"/>
               </w:rPr>
-              <w:t xml:space="preserve">Erkennen dat auteursrecht en licenties van toepassing kunnen zijn op digitale content, inclusief door AI gegenereerde content, en dat deze bepalen hoe content kan worden gebruikt en gedeeld. </w:t>
+              <w:t xml:space="preserve">Herkennen dat auteursrecht en licenties van toepassing kunnen zijn op digitale inhoud, inclusief door AI gegenereerde inhoud, en dat deze bepalen hoe inhoud kan worden gebruikt en gedeeld. </w:t>
             </w:r>
             <w:r>
               <w:rPr>
@@ -8598,7 +9018,7 @@
                 <w:color w:val="000000"/>
                 <w:sz w:val="18"/>
               </w:rPr>
-              <w:t xml:space="preserve">Erkennen dat door AI gegenereerde content als zodanig moet worden gelabeld om anderen te helpen de oorsprong en mogelijkheden voor gebruik te begrijpen. </w:t>
+              <w:t xml:space="preserve">Herkennen dat door AI gegenereerde inhoud als zodanig moet worden gelabeld om anderen te helpen de oorsprong en mogelijkheden voor verder gebruik te begrijpen. </w:t>
             </w:r>
             <w:r>
               <w:rPr>
@@ -8630,7 +9050,7 @@
                 <w:color w:val="000000"/>
                 <w:sz w:val="18"/>
               </w:rPr>
-              <w:t xml:space="preserve">Digitale content gebruiken en delen in overeenstemming met basale juridische en ethische richtlijnen, en digitale content herkennen die gratis kan worden gebruikt. </w:t>
+              <w:t xml:space="preserve">Digitale inhoud gebruiken en delen in overeenstemming met de basisregels van juridische en ethische richtlijnen, en digitale inhoud identificeren die gratis kan worden gebruikt. </w:t>
             </w:r>
             <w:r>
               <w:rPr>
@@ -8667,7 +9087,7 @@
                 <w:color w:val="000000"/>
                 <w:sz w:val="18"/>
               </w:rPr>
-              <w:t>Op intermediairniveau kunnen individuen</w:t>
+              <w:t>Op gemiddeldniveau kunnen individuen</w:t>
             </w:r>
           </w:p>
         </w:tc>
@@ -8695,7 +9115,7 @@
                 <w:color w:val="000000"/>
                 <w:sz w:val="18"/>
               </w:rPr>
-              <w:t xml:space="preserve">De complexiteit inzien van auteursrecht en licenties in digitale contexten en daarbij prioriteit geven aan een voorzichtige aanpak. </w:t>
+              <w:t xml:space="preserve">De complexiteit van auteursrecht en licenties in digitale contexten inzien, met prioriteit voor een voorzichtige aanpak. </w:t>
             </w:r>
             <w:r>
               <w:rPr>
@@ -8727,7 +9147,7 @@
                 <w:color w:val="000000"/>
                 <w:sz w:val="18"/>
               </w:rPr>
-              <w:t xml:space="preserve">Het concept van intellectueel eigendom definiëren en onderscheid maken tussen auteursrecht, handelsmerk, modelrecht en octrooi. </w:t>
+              <w:t xml:space="preserve">Het concept van intellectueel eigendom definiëren, en onderscheid maken tussen auteursrecht, handelsmerk, modelrecht en octrooi. </w:t>
             </w:r>
             <w:r>
               <w:rPr>
@@ -8759,7 +9179,7 @@
                 <w:color w:val="000000"/>
                 <w:sz w:val="18"/>
               </w:rPr>
-              <w:t xml:space="preserve">Veelvoorkomende soorten en doelen van licenties in digitale contexten herkennen, waaronder Creative Commons. </w:t>
+              <w:t xml:space="preserve">Veelvoorkomende soorten en doelen van licenties in digitale contexten identificeren, inclusief Creative Commons. </w:t>
             </w:r>
             <w:r>
               <w:rPr>
@@ -8823,7 +9243,7 @@
                 <w:color w:val="000000"/>
                 <w:sz w:val="18"/>
               </w:rPr>
-              <w:t xml:space="preserve">Voorbeelden herkennen van juridische en ethische uitdagingen met betrekking tot auteursrecht bij het trainen van AI-modellen. </w:t>
+              <w:t xml:space="preserve">Voorbeelden identificeren van juridische en ethische uitdagingen met betrekking tot auteursrecht bij het trainen van AI-modellen. </w:t>
             </w:r>
             <w:r>
               <w:rPr>
@@ -8855,7 +9275,7 @@
                 <w:color w:val="000000"/>
                 <w:sz w:val="18"/>
               </w:rPr>
-              <w:t xml:space="preserve">Juridische en ethische richtlijnen op een passende manier toepassen bij het gebruiken en delen van digitale content. </w:t>
+              <w:t xml:space="preserve">Juridische en ethische richtlijnen op een passende manier toepassen bij het gebruiken en delen van digitale inhoud. </w:t>
             </w:r>
             <w:r>
               <w:rPr>
@@ -8892,7 +9312,7 @@
                 <w:color w:val="000000"/>
                 <w:sz w:val="18"/>
               </w:rPr>
-              <w:t>Op gevorderdniveau kunnen individuen</w:t>
+              <w:t>Op geavanceerdniveau kunnen individuen</w:t>
             </w:r>
           </w:p>
         </w:tc>
@@ -8952,7 +9372,7 @@
                 <w:color w:val="000000"/>
                 <w:sz w:val="18"/>
               </w:rPr>
-              <w:t xml:space="preserve">Voorbeelden beschrijven van waar auteursrecht wel en niet van toepassing is in digitale contexten en daarbij onderscheid maken tussen trainingsdata voor AI-systemen en door AI gegenereerde content. </w:t>
+              <w:t xml:space="preserve">Voorbeelden beschrijven van waar auteursrecht wel en niet van toepassing is in digitale contexten, waarbij onderscheid wordt gemaakt tussen trainingsdata voor AI-systemen en door AI gegenereerde inhoud. </w:t>
             </w:r>
             <w:r>
               <w:rPr>
@@ -8984,7 +9404,7 @@
                 <w:color w:val="000000"/>
                 <w:sz w:val="18"/>
               </w:rPr>
-              <w:t xml:space="preserve">Juridische en ethische richtlijnen voor het gebruiken en delen van digitale content in complexe contexten beoordelen en correct toepassen (bijvoorbeeld in relatie tot AI-systemen). </w:t>
+              <w:t xml:space="preserve">Juridische en ethische richtlijnen voor het gebruiken en delen van digitale inhoud in complexe contexten beoordelen en correct toepassen (bijvoorbeeld in relatie tot AI-systemen). </w:t>
             </w:r>
             <w:r>
               <w:rPr>
@@ -9016,7 +9436,7 @@
                 <w:color w:val="000000"/>
                 <w:sz w:val="18"/>
               </w:rPr>
-              <w:t xml:space="preserve">Anderen helpen bij het gebruiken en delen van digitale content in overeenstemming met juridische en ethische richtlijnen. </w:t>
+              <w:t xml:space="preserve">Anderen helpen bij het gebruiken en delen van digitale inhoud in overeenstemming met de juridische en ethische richtlijnen. </w:t>
             </w:r>
             <w:r>
               <w:rPr>
@@ -9053,7 +9473,7 @@
                 <w:color w:val="000000"/>
                 <w:sz w:val="18"/>
               </w:rPr>
-              <w:t>Op zeer gevorderdniveau kunnen individuen</w:t>
+              <w:t>Op zeer geavanceerdniveau kunnen individuen</w:t>
             </w:r>
           </w:p>
         </w:tc>
@@ -9145,7 +9565,7 @@
                 <w:color w:val="000000"/>
                 <w:sz w:val="18"/>
               </w:rPr>
-              <w:t xml:space="preserve">Beleid of richtlijnen over auteursrecht en licenties in digitale contexten leiden of hieraan bijdragen. </w:t>
+              <w:t xml:space="preserve">Leiding geven aan of bijdragen aan beleid of richtlijnen over auteursrecht en licenties in digitale contexten. </w:t>
             </w:r>
             <w:r>
               <w:rPr>
@@ -9188,7 +9608,42 @@
             <w:tcW w:type="dxa" w:w="3627"/>
             <w:vMerge w:val="restart"/>
           </w:tcPr>
-          <w:p/>
+          <w:p>
+            <w:r>
+              <w:drawing>
+                <wp:inline xmlns:a="http://schemas.openxmlformats.org/drawingml/2006/main" xmlns:pic="http://schemas.openxmlformats.org/drawingml/2006/picture">
+                  <wp:extent cx="1368000" cy="1315803"/>
+                  <wp:docPr id="13" name="Picture 13"/>
+                  <wp:cNvGraphicFramePr>
+                    <a:graphicFrameLocks noChangeAspect="1"/>
+                  </wp:cNvGraphicFramePr>
+                  <a:graphic>
+                    <a:graphicData uri="http://schemas.openxmlformats.org/drawingml/2006/picture">
+                      <pic:pic>
+                        <pic:nvPicPr>
+                          <pic:cNvPr id="0" name="DC3_3p4.png"/>
+                          <pic:cNvPicPr/>
+                        </pic:nvPicPr>
+                        <pic:blipFill>
+                          <a:blip r:embed="rId21"/>
+                          <a:stretch>
+                            <a:fillRect/>
+                          </a:stretch>
+                        </pic:blipFill>
+                        <pic:spPr>
+                          <a:xfrm>
+                            <a:off x="0" y="0"/>
+                            <a:ext cx="1368000" cy="1315803"/>
+                          </a:xfrm>
+                          <a:prstGeom prst="rect"/>
+                        </pic:spPr>
+                      </pic:pic>
+                    </a:graphicData>
+                  </a:graphic>
+                </wp:inline>
+              </w:drawing>
+            </w:r>
+          </w:p>
           <w:p>
             <w:r>
               <w:rPr>
@@ -9222,7 +9677,7 @@
                 <w:color w:val="000000"/>
                 <w:sz w:val="17"/>
               </w:rPr>
-              <w:t>Het begrijpen en uitvoeren van stappen om een probleem te analyseren, deelproblemen te herkennen en een reeks instructies voor een computersysteem te plannen en te ontwikkelen om een bepaald probleem op te lossen of een specifieke taak uit te voeren.</w:t>
+              <w:t>Stappen begrijpen en uitvoeren om een probleem te analyseren, deelproblemen te herkennen en een reeks instructies te plannen en te ontwikkelen voor een computersysteem om een bepaald probleem op te lossen of een specifieke taak uit te voeren.</w:t>
             </w:r>
           </w:p>
         </w:tc>
@@ -9268,7 +9723,7 @@
                 <w:color w:val="000000"/>
                 <w:sz w:val="18"/>
               </w:rPr>
-              <w:t xml:space="preserve">De rol van programmeren in de samenleving en gangbaar gebruik van computerprogramma's en applicaties erkennen. </w:t>
+              <w:t xml:space="preserve">De rol van programmeren in de samenleving en het veelvoorkomende gebruik van computerprogramma's en applicaties herkennen. </w:t>
             </w:r>
             <w:r>
               <w:rPr>
@@ -9300,7 +9755,7 @@
                 <w:color w:val="000000"/>
                 <w:sz w:val="18"/>
               </w:rPr>
-              <w:t xml:space="preserve">Computational thinking herkennen als een menselijke activiteit die betrekking heeft op het aanwijzen van stappen die door een computer kunnen worden uitgevoerd om een probleem of taak op te lossen. </w:t>
+              <w:t xml:space="preserve">Computationeel denken herkennen als een menselijke activiteit die het identificeren van stappen omvat die door een computer kunnen worden uitgevoerd om een probleem of taak op te lossen. </w:t>
             </w:r>
             <w:r>
               <w:rPr>
@@ -9332,7 +9787,7 @@
                 <w:color w:val="000000"/>
                 <w:sz w:val="18"/>
               </w:rPr>
-              <w:t xml:space="preserve">In algemene termen herkennen wat AI is en daarbij een basaal onderscheid maken tussen wat wel en niet een AI-systeem is. </w:t>
+              <w:t xml:space="preserve">In algemene termen herkennen wat AI is, een basisonderscheid makend tussen wat wel en niet een AI-systeem is. </w:t>
             </w:r>
             <w:r>
               <w:rPr>
@@ -9364,7 +9819,7 @@
                 <w:color w:val="000000"/>
                 <w:sz w:val="18"/>
               </w:rPr>
-              <w:t xml:space="preserve">Eenvoudige reeksen symbolisch weergeven, eenvoudige symbolische reeksen interpreteren en basale instructies aan een computer geven voor het uitvoeren van eenvoudige taken. </w:t>
+              <w:t xml:space="preserve">Eenvoudige reeksen symbolisch weergeven, eenvoudige symbolische reeksen interpreteren, en basisinstructies aan een computer geven om eenvoudige taken uit te voeren. </w:t>
             </w:r>
             <w:r>
               <w:rPr>
@@ -9401,7 +9856,7 @@
                 <w:color w:val="000000"/>
                 <w:sz w:val="18"/>
               </w:rPr>
-              <w:t>Op intermediairniveau kunnen individuen</w:t>
+              <w:t>Op gemiddeldniveau kunnen individuen</w:t>
             </w:r>
           </w:p>
         </w:tc>
@@ -9493,7 +9948,7 @@
                 <w:color w:val="000000"/>
                 <w:sz w:val="18"/>
               </w:rPr>
-              <w:t xml:space="preserve">Verschillen bepalen tussen een berekenbaar probleem en een niet-berekenbaar probleem, en de algemene stappen in computational thinking. </w:t>
+              <w:t xml:space="preserve">Verschillen definiëren tussen een berekenbaar probleem en een niet-berekenbaar probleem, en de algemene stappen in computational thinking. </w:t>
             </w:r>
             <w:r>
               <w:rPr>
@@ -9525,7 +9980,7 @@
                 <w:color w:val="000000"/>
                 <w:sz w:val="18"/>
               </w:rPr>
-              <w:t xml:space="preserve">Fundamentele programmeerconcepten bepalen en erkennen dat er verschillende programmeertalen bestaan, elk met verscheidene mogelijke toepassingen. </w:t>
+              <w:t xml:space="preserve">Fundamentele programmeerconcepten definiëren en herkennen dat er verschillende programmeertalen bestaan, elk met een reeks mogelijke toepassingen. </w:t>
             </w:r>
             <w:r>
               <w:rPr>
@@ -9557,7 +10012,7 @@
                 <w:color w:val="000000"/>
                 <w:sz w:val="18"/>
               </w:rPr>
-              <w:t xml:space="preserve">Erkennen dat machine learning een vorm van programmeren is die bij AI wordt gebruikt en die algoritmen in staat stelt om van data te leren en voorspellingen te doen. </w:t>
+              <w:t xml:space="preserve">Herkennen dat machine learning een vorm van programmeren is die bij AI wordt gebruikt en die algoritmen in staat stelt om van data te leren en voorspellingen te doen. </w:t>
             </w:r>
             <w:r>
               <w:rPr>
@@ -9589,7 +10044,7 @@
                 <w:color w:val="000000"/>
                 <w:sz w:val="18"/>
               </w:rPr>
-              <w:t xml:space="preserve">Erkennen dat er stappen gevolgd moeten worden om een computerprogramma of een AI-systeem te ontwikkelen, te valideren en te implementeren. </w:t>
+              <w:t xml:space="preserve">Herkennen dat er stappen gevolgd moeten worden om een computerprogramma of een AI-systeem te ontwikkelen, te valideren en te implementeren. </w:t>
             </w:r>
             <w:r>
               <w:rPr>
@@ -9621,7 +10076,7 @@
                 <w:color w:val="000000"/>
                 <w:sz w:val="18"/>
               </w:rPr>
-              <w:t xml:space="preserve">Basale informatie vertalen naar logische bewerkingen, eenvoudige programma's met controlestructuren ontwikkelen en visuele representaties maken om basale algoritmen te illustreren. </w:t>
+              <w:t xml:space="preserve">Basisinformatie vertalen naar logische bewerkingen, eenvoudige programma's met controlestructuren ontwikkelen, en visuele representaties maken om basisalgoritmen te illustreren. </w:t>
             </w:r>
             <w:r>
               <w:rPr>
@@ -9658,7 +10113,7 @@
                 <w:color w:val="000000"/>
                 <w:sz w:val="18"/>
               </w:rPr>
-              <w:t>Op gevorderdniveau kunnen individuen</w:t>
+              <w:t>Op geavanceerdniveau kunnen individuen</w:t>
             </w:r>
           </w:p>
         </w:tc>
@@ -9750,7 +10205,7 @@
                 <w:color w:val="000000"/>
                 <w:sz w:val="18"/>
               </w:rPr>
-              <w:t xml:space="preserve">Voorbeelden beschrijven van de toepassing van computational thinking en programmeren in robotica. </w:t>
+              <w:t xml:space="preserve">Voorbeelden beschrijven van de toepassing van computational thinking en programmeren in de robotica. </w:t>
             </w:r>
             <w:r>
               <w:rPr>
@@ -9846,7 +10301,7 @@
                 <w:color w:val="000000"/>
                 <w:sz w:val="18"/>
               </w:rPr>
-              <w:t xml:space="preserve">Routinetaken herkennen en (gedeeltelijk of volledig) automatiseren met programmeertools of AI-systemen. </w:t>
+              <w:t xml:space="preserve">Routinetaken identificeren en (gedeeltelijk of volledig) automatiseren met programmeertools of AI-systemen. </w:t>
             </w:r>
             <w:r>
               <w:rPr>
@@ -9878,7 +10333,7 @@
                 <w:color w:val="000000"/>
                 <w:sz w:val="18"/>
               </w:rPr>
-              <w:t xml:space="preserve">Programmeertools of AI-systemen toepassen op complexe taken die vragen om computational thinking. </w:t>
+              <w:t xml:space="preserve">Programmeerhulpmiddelen of AI-systemen toepassen op complexe taken op het gebied van computational thinking. </w:t>
             </w:r>
             <w:r>
               <w:rPr>
@@ -9915,7 +10370,7 @@
                 <w:color w:val="000000"/>
                 <w:sz w:val="18"/>
               </w:rPr>
-              <w:t>Op zeer gevorderdniveau kunnen individuen</w:t>
+              <w:t>Op zeer geavanceerdniveau kunnen individuen</w:t>
             </w:r>
           </w:p>
         </w:tc>
@@ -9975,7 +10430,7 @@
                 <w:color w:val="000000"/>
                 <w:sz w:val="18"/>
               </w:rPr>
-              <w:t xml:space="preserve">Op de hoogte blijven van actuele ontwikkelingen in programmeertechnieken en gerelateerde toepassingen van AI-systemen, zoals robotica. </w:t>
+              <w:t xml:space="preserve">Op de hoogte blijven van de huidige ontwikkelingen in programmeertechnieken en gerelateerde toepassingen van AI-systemen, zoals robotica. </w:t>
             </w:r>
             <w:r>
               <w:rPr>
@@ -10007,7 +10462,7 @@
                 <w:color w:val="000000"/>
                 <w:sz w:val="18"/>
               </w:rPr>
-              <w:t xml:space="preserve">Complexe projecten gericht op toepassingen van computational thinking, programmeren of AI-systemen leiden of hieraan bijdragen, waaronder het ontwikkelen, valideren en implementeren van computerprogramma's of AI-systemen. </w:t>
+              <w:t xml:space="preserve">Leiding geven aan of bijdragen aan complexe projecten gericht op toepassingen van computational thinking, programmeren of AI-systemen, inclusief het ontwikkelen, valideren en implementeren van computerprogramma's of AI-systemen. </w:t>
             </w:r>
             <w:r>
               <w:rPr>
@@ -10039,7 +10494,7 @@
                 <w:color w:val="000000"/>
                 <w:sz w:val="18"/>
               </w:rPr>
-              <w:t xml:space="preserve">Anderen helpen bij het ontwikkelen van basale programmeercompetenties en/of competenties in het toepassen van AI-systemen bij taken die vragen om computational thinking. </w:t>
+              <w:t xml:space="preserve">Anderen helpen bij het ontwikkelen van basisprogrammeervaardigheden en/of vaardigheden in het toepassen van AI-systemen bij taken op het gebied van computational thinking. </w:t>
             </w:r>
             <w:r>
               <w:rPr>
@@ -10082,7 +10537,42 @@
             <w:tcW w:type="dxa" w:w="3627"/>
             <w:vMerge w:val="restart"/>
           </w:tcPr>
-          <w:p/>
+          <w:p>
+            <w:r>
+              <w:drawing>
+                <wp:inline xmlns:a="http://schemas.openxmlformats.org/drawingml/2006/main" xmlns:pic="http://schemas.openxmlformats.org/drawingml/2006/picture">
+                  <wp:extent cx="1368000" cy="1315803"/>
+                  <wp:docPr id="14" name="Picture 14"/>
+                  <wp:cNvGraphicFramePr>
+                    <a:graphicFrameLocks noChangeAspect="1"/>
+                  </wp:cNvGraphicFramePr>
+                  <a:graphic>
+                    <a:graphicData uri="http://schemas.openxmlformats.org/drawingml/2006/picture">
+                      <pic:pic>
+                        <pic:nvPicPr>
+                          <pic:cNvPr id="0" name="DC3_4p1.png"/>
+                          <pic:cNvPicPr/>
+                        </pic:nvPicPr>
+                        <pic:blipFill>
+                          <a:blip r:embed="rId22"/>
+                          <a:stretch>
+                            <a:fillRect/>
+                          </a:stretch>
+                        </pic:blipFill>
+                        <pic:spPr>
+                          <a:xfrm>
+                            <a:off x="0" y="0"/>
+                            <a:ext cx="1368000" cy="1315803"/>
+                          </a:xfrm>
+                          <a:prstGeom prst="rect"/>
+                        </pic:spPr>
+                      </pic:pic>
+                    </a:graphicData>
+                  </a:graphic>
+                </wp:inline>
+              </w:drawing>
+            </w:r>
+          </w:p>
           <w:p>
             <w:r>
               <w:rPr>
@@ -10104,7 +10594,7 @@
                 <w:color w:val="000000"/>
                 <w:sz w:val="22"/>
               </w:rPr>
-              <w:t>4.1 Beveiligen van apparaten</w:t>
+              <w:t>4.1 Apparaten beschermen</w:t>
             </w:r>
           </w:p>
           <w:p>
@@ -10116,7 +10606,7 @@
                 <w:color w:val="000000"/>
                 <w:sz w:val="17"/>
               </w:rPr>
-              <w:t>Het toepassen van veiligheids- en cybersecuritymaatregelen om digitale apparaten en content te beveiligen. Het zich bewust zijn van de veranderende aard van risico's en bedreigingen in digitale omgevingen, en het besteden van voldoende aandacht aan de beveiliging van digitale apparaten en hun inhoud.</w:t>
+              <w:t>Veiligheids- en cybersecuritymaatregelen toepassen om digitale apparaten en inhoud te beschermen. Je bewust zijn van de veranderende aard van risico's en bedreigingen in digitale omgevingen, en gepaste aandacht hebben voor de beveiliging van digitale apparaten en hun inhoud.</w:t>
             </w:r>
           </w:p>
         </w:tc>
@@ -10194,7 +10684,7 @@
                 <w:color w:val="000000"/>
                 <w:sz w:val="18"/>
               </w:rPr>
-              <w:t xml:space="preserve">Erkennen dat individuele acties en cybersecuritytools samenwerken om apparaten en hun inhoud veilig te houden. </w:t>
+              <w:t xml:space="preserve">Herkennen dat individuele acties en cybersecurityhulpmiddelen samenwerken om apparaten en hun inhoud veilig te houden. </w:t>
             </w:r>
             <w:r>
               <w:rPr>
@@ -10226,7 +10716,7 @@
                 <w:color w:val="000000"/>
                 <w:sz w:val="18"/>
               </w:rPr>
-              <w:t xml:space="preserve">Erkennen dat er cybersecuritywetgeving bestaat die helpt de veiligheid van producten en diensten te waarborgen. </w:t>
+              <w:t xml:space="preserve">Herkennen dat er cybersecuritywetgeving bestaat die helpt de veiligheid van producten en diensten te waarborgen. </w:t>
             </w:r>
             <w:r>
               <w:rPr>
@@ -10258,7 +10748,7 @@
                 <w:color w:val="000000"/>
                 <w:sz w:val="18"/>
               </w:rPr>
-              <w:t xml:space="preserve">Basale beschermingsmaatregelen voor apparaten herkennen en toepassen, zoals antivirussoftware, schermvergrendeling, sterke wachtwoorden en multifactorauthenticatie. </w:t>
+              <w:t xml:space="preserve">Basisbeschermingsmaatregelen voor apparaten identificeren en toepassen, zoals antivirussoftware, schermvergrendeling, sterke wachtwoorden en multifactorauthenticatie. </w:t>
             </w:r>
             <w:r>
               <w:rPr>
@@ -10295,7 +10785,7 @@
                 <w:color w:val="000000"/>
                 <w:sz w:val="18"/>
               </w:rPr>
-              <w:t>Op intermediairniveau kunnen individuen</w:t>
+              <w:t>Op gemiddeldniveau kunnen individuen</w:t>
             </w:r>
           </w:p>
         </w:tc>
@@ -10323,7 +10813,7 @@
                 <w:color w:val="000000"/>
                 <w:sz w:val="18"/>
               </w:rPr>
-              <w:t xml:space="preserve">Het belang inzien van het waakzaam blijven en het op de hoogte blijven van cybersecuritypraktijken. </w:t>
+              <w:t xml:space="preserve">Het belang inzien van waakzaam blijven en op de hoogte blijven van cybersecuritypraktijken. </w:t>
             </w:r>
             <w:r>
               <w:rPr>
@@ -10355,7 +10845,7 @@
                 <w:color w:val="000000"/>
                 <w:sz w:val="18"/>
               </w:rPr>
-              <w:t xml:space="preserve">Belangrijke kenmerken van malware beschrijven en verschillende technieken voor malwarepreventie toepassen om apparaten en hun inhoud te beschermen. </w:t>
+              <w:t xml:space="preserve">De belangrijkste kenmerken van malware beschrijven en verschillende technieken voor malwarepreventie toepassen om apparaten en hun inhoud te beschermen. </w:t>
             </w:r>
             <w:r>
               <w:rPr>
@@ -10387,7 +10877,7 @@
                 <w:color w:val="000000"/>
                 <w:sz w:val="18"/>
               </w:rPr>
-              <w:t xml:space="preserve">Erkennen dat recente en opkomende digitale technologieën zoals AI-systemen kunnen worden gebruikt voor zowel cyberaanvallen als cybersecurity. </w:t>
+              <w:t xml:space="preserve">Herkennen dat recente en opkomende digitale technologieën zoals AI-systemen kunnen worden gebruikt voor zowel cyberaanvallen als cybersecurity. </w:t>
             </w:r>
             <w:r>
               <w:rPr>
@@ -10424,7 +10914,7 @@
                 <w:color w:val="000000"/>
                 <w:sz w:val="18"/>
               </w:rPr>
-              <w:t>Op gevorderdniveau kunnen individuen</w:t>
+              <w:t>Op geavanceerdniveau kunnen individuen</w:t>
             </w:r>
           </w:p>
         </w:tc>
@@ -10516,7 +11006,7 @@
                 <w:color w:val="000000"/>
                 <w:sz w:val="18"/>
               </w:rPr>
-              <w:t xml:space="preserve">Voorbeelden herkennen van hoe recente en opkomende technologieën zoals AI-systemen worden gebruikt bij cyberaanvallen en cybersecurity. </w:t>
+              <w:t xml:space="preserve">Voorbeelden identificeren van hoe recente en opkomende technologieën zoals AI-systemen worden gebruikt bij cyberaanvallen en cybersecurity. </w:t>
             </w:r>
             <w:r>
               <w:rPr>
@@ -10548,7 +11038,7 @@
                 <w:color w:val="000000"/>
                 <w:sz w:val="18"/>
               </w:rPr>
-              <w:t xml:space="preserve">Anderen helpen bij het implementeren van basale beschermingsmaatregelen voor cybersecurity, zoals antivirussoftware, schermvergrendeling, sterke wachtwoorden en multifactorauthenticatie. </w:t>
+              <w:t xml:space="preserve">Anderen helpen bij het implementeren van basisbeschermingsmaatregelen voor cybersecurity, zoals antivirussoftware, schermvergrendeling, sterke wachtwoorden en multifactorauthenticatie. </w:t>
             </w:r>
             <w:r>
               <w:rPr>
@@ -10585,7 +11075,7 @@
                 <w:color w:val="000000"/>
                 <w:sz w:val="18"/>
               </w:rPr>
-              <w:t>Op zeer gevorderdniveau kunnen individuen</w:t>
+              <w:t>Op zeer geavanceerdniveau kunnen individuen</w:t>
             </w:r>
           </w:p>
         </w:tc>
@@ -10645,7 +11135,7 @@
                 <w:color w:val="000000"/>
                 <w:sz w:val="18"/>
               </w:rPr>
-              <w:t xml:space="preserve">Rechten van individuen onder relevante bepalingen van de huidige cybersecuritywetgeving beoordelen. </w:t>
+              <w:t xml:space="preserve">Rechten van individuen beoordelen onder relevante bepalingen van de huidige cybersecuritywetgeving. </w:t>
             </w:r>
             <w:r>
               <w:rPr>
@@ -10677,7 +11167,7 @@
                 <w:color w:val="000000"/>
                 <w:sz w:val="18"/>
               </w:rPr>
-              <w:t xml:space="preserve">Cybersecurity-initiatieven gericht op burgers leiden of hieraan bijdragen. </w:t>
+              <w:t xml:space="preserve">Leiding geven aan of bijdragen aan op de burger gerichte cybersecurity-initiatieven. </w:t>
             </w:r>
             <w:r>
               <w:rPr>
@@ -10709,7 +11199,7 @@
                 <w:color w:val="000000"/>
                 <w:sz w:val="18"/>
               </w:rPr>
-              <w:t xml:space="preserve">Anderen ondersteunen bij het opbouwen van hun competenties om apparaten en hun inhoud te beschermen tegen digitale dreigingen. </w:t>
+              <w:t xml:space="preserve">Anderen ondersteunen bij het opbouwen van hun vaardigheden om apparaten en hun inhoud te beschermen tegen digitale dreigingen. </w:t>
             </w:r>
             <w:r>
               <w:rPr>
@@ -10752,7 +11242,42 @@
             <w:tcW w:type="dxa" w:w="3627"/>
             <w:vMerge w:val="restart"/>
           </w:tcPr>
-          <w:p/>
+          <w:p>
+            <w:r>
+              <w:drawing>
+                <wp:inline xmlns:a="http://schemas.openxmlformats.org/drawingml/2006/main" xmlns:pic="http://schemas.openxmlformats.org/drawingml/2006/picture">
+                  <wp:extent cx="1368000" cy="1315803"/>
+                  <wp:docPr id="15" name="Picture 15"/>
+                  <wp:cNvGraphicFramePr>
+                    <a:graphicFrameLocks noChangeAspect="1"/>
+                  </wp:cNvGraphicFramePr>
+                  <a:graphic>
+                    <a:graphicData uri="http://schemas.openxmlformats.org/drawingml/2006/picture">
+                      <pic:pic>
+                        <pic:nvPicPr>
+                          <pic:cNvPr id="0" name="DC3_4p2.png"/>
+                          <pic:cNvPicPr/>
+                        </pic:nvPicPr>
+                        <pic:blipFill>
+                          <a:blip r:embed="rId23"/>
+                          <a:stretch>
+                            <a:fillRect/>
+                          </a:stretch>
+                        </pic:blipFill>
+                        <pic:spPr>
+                          <a:xfrm>
+                            <a:off x="0" y="0"/>
+                            <a:ext cx="1368000" cy="1315803"/>
+                          </a:xfrm>
+                          <a:prstGeom prst="rect"/>
+                        </pic:spPr>
+                      </pic:pic>
+                    </a:graphicData>
+                  </a:graphic>
+                </wp:inline>
+              </w:drawing>
+            </w:r>
+          </w:p>
           <w:p>
             <w:r>
               <w:rPr>
@@ -10774,7 +11299,7 @@
                 <w:color w:val="000000"/>
                 <w:sz w:val="22"/>
               </w:rPr>
-              <w:t>4.2 Beschermen van persoonlijke gegevens en privacy</w:t>
+              <w:t>4.2 Persoonsgegevens en privacy beschermen</w:t>
             </w:r>
           </w:p>
           <w:p>
@@ -10786,7 +11311,7 @@
                 <w:color w:val="000000"/>
                 <w:sz w:val="17"/>
               </w:rPr>
-              <w:t>Het zich bewust zijn van en uitoefenen van rechten met betrekking tot persoonlijke gegevens en privacy in digitale omgevingen. Het beoordelen en beheren van privacyrisico's en het beschermen van persoonlijke gegevens en privacy in digitale omgevingen. Het veilig, ethisch en verantwoord gebruik en delen van de eigen en andermans persoonlijke gegevens.</w:t>
+              <w:t>Je bewust zijn van je rechten met betrekking tot persoonsgegevens en privacy in digitale omgevingen en deze uitoefenen. Privacyrisico's evalueren en beheren en persoonsgegevens en privacy in digitale omgevingen beschermen. Je eigen persoonsgegevens en die van anderen op een veilige, ethische en verantwoorde manier gebruiken en delen.</w:t>
             </w:r>
           </w:p>
         </w:tc>
@@ -10864,7 +11389,7 @@
                 <w:color w:val="000000"/>
                 <w:sz w:val="18"/>
               </w:rPr>
-              <w:t xml:space="preserve">Erkennen dat persoonlijke data worden verzameld en gegenereerd door een grote verscheidenheid aan bronnen en processen. </w:t>
+              <w:t xml:space="preserve">Herkennen dat persoonlijke data wordt verzameld en gegenereerd via een grote verscheidenheid aan bronnen en processen. </w:t>
             </w:r>
             <w:r>
               <w:rPr>
@@ -10896,7 +11421,7 @@
                 <w:color w:val="000000"/>
                 <w:sz w:val="18"/>
               </w:rPr>
-              <w:t xml:space="preserve">Erkennen dat manipulatieve methoden in digitale omgevingen kunnen worden gebruikt om individuen te misleiden zodat zij toegang verlenen tot persoonlijke data, accounts of andere gevoelige informatie. </w:t>
+              <w:t xml:space="preserve">Herkennen dat manipulatieve methoden in digitale omgevingen kunnen worden gebruikt om individuen te misleiden om toegang te verlenen tot persoonlijke data, accounts of andere gevoelige informatie. </w:t>
             </w:r>
             <w:r>
               <w:rPr>
@@ -10928,7 +11453,7 @@
                 <w:color w:val="000000"/>
                 <w:sz w:val="18"/>
               </w:rPr>
-              <w:t xml:space="preserve">Risico's herkennen van het delen van persoonlijke data in digitale omgevingen, waaronder specifieke risico's in relatie tot AI-systemen. </w:t>
+              <w:t xml:space="preserve">Risico's identificeren van het delen van persoonlijke data in digitale omgevingen, inclusief specifieke risico's in relatie tot AI-systemen. </w:t>
             </w:r>
             <w:r>
               <w:rPr>
@@ -10960,7 +11485,7 @@
                 <w:color w:val="000000"/>
                 <w:sz w:val="18"/>
               </w:rPr>
-              <w:t xml:space="preserve">Erkennen dat individuen recht hebben op privacy en dat hun persoonlijke data beschermd zijn onder wetgeving. </w:t>
+              <w:t xml:space="preserve">Herkennen dat individuen recht hebben op privacy en dat hun persoonlijke data beschermd is onder de wetgeving. </w:t>
             </w:r>
             <w:r>
               <w:rPr>
@@ -10992,7 +11517,7 @@
                 <w:color w:val="000000"/>
                 <w:sz w:val="18"/>
               </w:rPr>
-              <w:t xml:space="preserve">Basale beveiligingsmaatregelen voor online betalingen en transacties implementeren. </w:t>
+              <w:t xml:space="preserve">Basisbeveiligingsmaatregelen implementeren voor online betalingen en transacties. </w:t>
             </w:r>
             <w:r>
               <w:rPr>
@@ -11056,7 +11581,7 @@
                 <w:color w:val="000000"/>
                 <w:sz w:val="18"/>
               </w:rPr>
-              <w:t xml:space="preserve">Tekenen van identiteitsdiefstal herkennen en er passend op reageren. </w:t>
+              <w:t xml:space="preserve">Tekenen van identiteitsfraude herkennen en er passend op reageren. </w:t>
             </w:r>
             <w:r>
               <w:rPr>
@@ -11093,7 +11618,7 @@
                 <w:color w:val="000000"/>
                 <w:sz w:val="18"/>
               </w:rPr>
-              <w:t>Op intermediairniveau kunnen individuen</w:t>
+              <w:t>Op gemiddeldniveau kunnen individuen</w:t>
             </w:r>
           </w:p>
         </w:tc>
@@ -11121,7 +11646,7 @@
                 <w:color w:val="000000"/>
                 <w:sz w:val="18"/>
               </w:rPr>
-              <w:t xml:space="preserve">Het belang erkennen van zorgvuldige omgang met persoonlijke data van zichzelf en anderen, vooral van kwetsbare individuen en kinderen. </w:t>
+              <w:t xml:space="preserve">Het belang inzien van zorgvuldige omgang met persoonlijke data van zichzelf en anderen, vooral van kwetsbare individuen en kinderen. </w:t>
             </w:r>
             <w:r>
               <w:rPr>
@@ -11185,7 +11710,7 @@
                 <w:color w:val="000000"/>
                 <w:sz w:val="18"/>
               </w:rPr>
-              <w:t xml:space="preserve">Het doel van online privacyverklaringen en belangrijke concepten van privacybeleid beschrijven. </w:t>
+              <w:t xml:space="preserve">Het doel van online privacyverklaringen en de belangrijkste concepten van privacybeleid definiëren. </w:t>
             </w:r>
             <w:r>
               <w:rPr>
@@ -11217,7 +11742,7 @@
                 <w:color w:val="000000"/>
                 <w:sz w:val="18"/>
               </w:rPr>
-              <w:t xml:space="preserve">Een datalek van persoonlijke gegevens onder de huidige gegevensbescherming- en privacywetgeving beschrijven. </w:t>
+              <w:t xml:space="preserve">Een inbreuk in verband met persoonsgegevens (datalek) definiëren onder de huidige gegevensbescherming- en privacywetgeving. </w:t>
             </w:r>
             <w:r>
               <w:rPr>
@@ -11249,7 +11774,7 @@
                 <w:color w:val="000000"/>
                 <w:sz w:val="18"/>
               </w:rPr>
-              <w:t xml:space="preserve">Privacy-implicaties beschrijven die verbonden zijn aan het gebruik van gedeelde online content, zoals om AI-systemen te trainen, en daarbij erkennen dat de regulering van eigendom van persoonlijke data van online gedeelde content complex is. </w:t>
+              <w:t xml:space="preserve">Privacy-implicaties beschrijven die verbonden zijn aan het gebruik van gedeelde online inhoud, zoals om AI-systemen te trainen, erkennend dat de regulering van eigendom van persoonlijke data van online gedeelde inhoud complex is. </w:t>
             </w:r>
             <w:r>
               <w:rPr>
@@ -11313,7 +11838,7 @@
                 <w:color w:val="000000"/>
                 <w:sz w:val="18"/>
               </w:rPr>
-              <w:t xml:space="preserve">Persoonlijke data en privacy veilig beheren in verschillende digitale omgevingen en privacytools gebruiken. </w:t>
+              <w:t xml:space="preserve">Persoonlijke data en privacy veilig beheren in verschillende digitale omgevingen, inclusief het gebruik van privacyhulpmiddelen. </w:t>
             </w:r>
             <w:r>
               <w:rPr>
@@ -11350,7 +11875,7 @@
                 <w:color w:val="000000"/>
                 <w:sz w:val="18"/>
               </w:rPr>
-              <w:t>Op gevorderdniveau kunnen individuen</w:t>
+              <w:t>Op geavanceerdniveau kunnen individuen</w:t>
             </w:r>
           </w:p>
         </w:tc>
@@ -11442,7 +11967,7 @@
                 <w:color w:val="000000"/>
                 <w:sz w:val="18"/>
               </w:rPr>
-              <w:t xml:space="preserve">Anderen helpen bij het implementeren van basale strategieën om persoonlijke gegevens te beschermen en privacy in digitale omgevingen te beheren. </w:t>
+              <w:t xml:space="preserve">Anderen helpen bij het implementeren van basisstrategieën om persoonlijke data te beschermen en privacy in digitale omgevingen te beheren. </w:t>
             </w:r>
             <w:r>
               <w:rPr>
@@ -11479,7 +12004,7 @@
                 <w:color w:val="000000"/>
                 <w:sz w:val="18"/>
               </w:rPr>
-              <w:t>Op zeer gevorderdniveau kunnen individuen</w:t>
+              <w:t>Op zeer geavanceerdniveau kunnen individuen</w:t>
             </w:r>
           </w:p>
         </w:tc>
@@ -11571,7 +12096,7 @@
                 <w:color w:val="000000"/>
                 <w:sz w:val="18"/>
               </w:rPr>
-              <w:t xml:space="preserve">Het ontwerp van strategieën voor de bescherming van persoonlijke data in digitale contexten leiden of hieraan bijdragen. </w:t>
+              <w:t xml:space="preserve">Leiding geven aan of bijdragen aan het ontwerp van strategieën voor de bescherming van persoonlijke data in digitale contexten. </w:t>
             </w:r>
             <w:r>
               <w:rPr>
@@ -11614,7 +12139,42 @@
             <w:tcW w:type="dxa" w:w="3627"/>
             <w:vMerge w:val="restart"/>
           </w:tcPr>
-          <w:p/>
+          <w:p>
+            <w:r>
+              <w:drawing>
+                <wp:inline xmlns:a="http://schemas.openxmlformats.org/drawingml/2006/main" xmlns:pic="http://schemas.openxmlformats.org/drawingml/2006/picture">
+                  <wp:extent cx="1368000" cy="1315803"/>
+                  <wp:docPr id="16" name="Picture 16"/>
+                  <wp:cNvGraphicFramePr>
+                    <a:graphicFrameLocks noChangeAspect="1"/>
+                  </wp:cNvGraphicFramePr>
+                  <a:graphic>
+                    <a:graphicData uri="http://schemas.openxmlformats.org/drawingml/2006/picture">
+                      <pic:pic>
+                        <pic:nvPicPr>
+                          <pic:cNvPr id="0" name="DC3_4p3.png"/>
+                          <pic:cNvPicPr/>
+                        </pic:nvPicPr>
+                        <pic:blipFill>
+                          <a:blip r:embed="rId24"/>
+                          <a:stretch>
+                            <a:fillRect/>
+                          </a:stretch>
+                        </pic:blipFill>
+                        <pic:spPr>
+                          <a:xfrm>
+                            <a:off x="0" y="0"/>
+                            <a:ext cx="1368000" cy="1315803"/>
+                          </a:xfrm>
+                          <a:prstGeom prst="rect"/>
+                        </pic:spPr>
+                      </pic:pic>
+                    </a:graphicData>
+                  </a:graphic>
+                </wp:inline>
+              </w:drawing>
+            </w:r>
+          </w:p>
           <w:p>
             <w:r>
               <w:rPr>
@@ -11636,7 +12196,7 @@
                 <w:color w:val="000000"/>
                 <w:sz w:val="22"/>
               </w:rPr>
-              <w:t>4.3 Het bevorderen van welzijn</w:t>
+              <w:t>4.3 Welzijn ondersteunen</w:t>
             </w:r>
           </w:p>
           <w:p>
@@ -11648,7 +12208,7 @@
                 <w:color w:val="000000"/>
                 <w:sz w:val="17"/>
               </w:rPr>
-              <w:t>Het gebruiken van digitale technologie gebruiken op manieren die welzijn en inclusie bevorderen. Het beperken van risico's en bedreigingen voor het fysieke, mentale en sociale welzijn van zichzelf en anderen bij het gebruik van digitale technologie. Het gebruik van digitale technologie afwegen tegen offline activiteiten om welzijn te bevorderen. Het ondernemen van actie om zichzelf en anderen te beschermen tegen mogelijke gevaren in digitale omgevingen (bijv. cyberpesten, schadelijke content), en weten hoe op dergelijke gevaren te reageren.</w:t>
+              <w:t>Digitale technologieën gebruiken op manieren die welzijn en inclusie ondersteunen. Risico's en bedreigingen voor het fysieke, mentale en sociale welzijn van jezelf en anderen minimaliseren bij het gebruik van digitale technologieën. Het gebruik van digitale technologieën in evenwicht brengen met offline activiteiten om welzijn te ondersteunen. Actie ondernemen om jezelf en anderen te beschermen tegen mogelijke gevaren in digitale omgevingen (bijv. cyberpesten, schadelijke inhoud), en weten hoe op dergelijke gevaren te reageren.</w:t>
             </w:r>
           </w:p>
         </w:tc>
@@ -11694,7 +12254,7 @@
                 <w:color w:val="000000"/>
                 <w:sz w:val="18"/>
               </w:rPr>
-              <w:t xml:space="preserve">De voordelen inzien van een balans tussen online en offline activiteiten, en de voordelen en risico's voor het eigen fysieke, mentale en sociale welzijn bij het gebruik van digitale technologie. </w:t>
+              <w:t xml:space="preserve">De voordelen inzien van een balans tussen online en offline activiteiten, en de voordelen en risico's voor het eigen fysieke, mentale en sociale welzijn bij het gebruik van digitale technologieën. </w:t>
             </w:r>
             <w:r>
               <w:rPr>
@@ -11790,7 +12350,7 @@
                 <w:color w:val="000000"/>
                 <w:sz w:val="18"/>
               </w:rPr>
-              <w:t xml:space="preserve">Beperkingen en risico's herkennen van het gebruik van virtuele assistenten en AI-systemen om menselijk welzijn te ondersteunen. </w:t>
+              <w:t xml:space="preserve">Beperkingen en risico's identificeren van het gebruik van virtuele assistenten en AI-systemen om menselijk welzijn te ondersteunen. </w:t>
             </w:r>
             <w:r>
               <w:rPr>
@@ -11854,7 +12414,7 @@
                 <w:color w:val="000000"/>
                 <w:sz w:val="18"/>
               </w:rPr>
-              <w:t xml:space="preserve">Een basisbeoordeling maken van de eigen digitale gewoonten in relatie tot het eigen fysieke, mentale en sociale welzijn, met bewustzijn van tekenen van problematisch gebruik, en strategieën herkennen en implementeren om het eigen welzijn te ondersteunen. </w:t>
+              <w:t xml:space="preserve">Een basisbeoordeling maken van de eigen digitale gewoonten in relatie tot het eigen fysieke, mentale en sociale welzijn, met bewustzijn van tekenen van problematisch gebruik, en strategieën identificeren en implementeren om het eigen welzijn te ondersteunen. </w:t>
             </w:r>
             <w:r>
               <w:rPr>
@@ -11891,7 +12451,7 @@
                 <w:color w:val="000000"/>
                 <w:sz w:val="18"/>
               </w:rPr>
-              <w:t>Op intermediairniveau kunnen individuen</w:t>
+              <w:t>Op gemiddeldniveau kunnen individuen</w:t>
             </w:r>
           </w:p>
         </w:tc>
@@ -11951,7 +12511,7 @@
                 <w:color w:val="000000"/>
                 <w:sz w:val="18"/>
               </w:rPr>
-              <w:t xml:space="preserve">De effecten van schadelijk gedrag, content en misleidend ontwerp (deceptive design) in digitale omgevingen op zichzelf en anderen beschrijven. </w:t>
+              <w:t xml:space="preserve">De effecten van schadelijk gedrag, inhoud en misleidend ontwerp (deceptive design) in digitale omgevingen op zichzelf en anderen beschrijven. </w:t>
             </w:r>
             <w:r>
               <w:rPr>
@@ -11983,7 +12543,7 @@
                 <w:color w:val="000000"/>
                 <w:sz w:val="18"/>
               </w:rPr>
-              <w:t xml:space="preserve">Betrouwbare informatiebronnen en inclusieve groepen en gemeenschappen in digitale omgevingen herkennen die het eigen fysieke, mentale en/of sociale welzijn kunnen ondersteunen. </w:t>
+              <w:t xml:space="preserve">Betrouwbare informatiebronnen en inclusieve groepen en gemeenschappen in digitale omgevingen identificeren die het eigen fysieke, mentale en/of sociale welzijn kunnen ondersteunen. </w:t>
             </w:r>
             <w:r>
               <w:rPr>
@@ -12015,7 +12575,7 @@
                 <w:color w:val="000000"/>
                 <w:sz w:val="18"/>
               </w:rPr>
-              <w:t xml:space="preserve">Mogelijke manieren herkennen om schadelijk gedrag of content te melden of in te grijpen als dit in digitale omgevingen wordt aangetroffen. </w:t>
+              <w:t xml:space="preserve">Mogelijke manieren identificeren om schadelijk gedrag of inhoud te melden of in te grijpen als dit in digitale omgevingen wordt aangetroffen. </w:t>
             </w:r>
             <w:r>
               <w:rPr>
@@ -12047,7 +12607,7 @@
                 <w:color w:val="000000"/>
                 <w:sz w:val="18"/>
               </w:rPr>
-              <w:t xml:space="preserve">Manieren beschrijven waarop sommige digitale technologieën, zoals sociale media, vooroordelen, stereotypering en uitsluiting versterken en in stand houden. </w:t>
+              <w:t xml:space="preserve">Manieren beschrijven waarop sommige digitale technologieën, zoals sociale media, bias, stereotypering en uitsluiting versterken en in stand houden. </w:t>
             </w:r>
             <w:r>
               <w:rPr>
@@ -12079,7 +12639,7 @@
                 <w:color w:val="000000"/>
                 <w:sz w:val="18"/>
               </w:rPr>
-              <w:t xml:space="preserve">Strategieën implementeren om te beschermen tegen en effectief te reageren op schadelijk gedrag, content en misleidend ontwerp in digitale omgevingen, en om het welzijn van zichzelf en anderen te ondersteunen en te behouden. </w:t>
+              <w:t xml:space="preserve">Strategieën implementeren om te beschermen tegen en effectief te reageren op schadelijk gedrag, inhoud en misleidend ontwerp in digitale omgevingen, en om het welzijn van zichzelf en anderen te ondersteunen en te behouden. </w:t>
             </w:r>
             <w:r>
               <w:rPr>
@@ -12148,7 +12708,7 @@
                 <w:color w:val="000000"/>
                 <w:sz w:val="18"/>
               </w:rPr>
-              <w:t>Op gevorderdniveau kunnen individuen</w:t>
+              <w:t>Op geavanceerdniveau kunnen individuen</w:t>
             </w:r>
           </w:p>
         </w:tc>
@@ -12176,7 +12736,7 @@
                 <w:color w:val="000000"/>
                 <w:sz w:val="18"/>
               </w:rPr>
-              <w:t xml:space="preserve">Voortdurend de rol van digitale technologie zoals sociale media onderzoeken bij het versterken en in stand houden van vooroordelen, stereotypering en uitsluiting. </w:t>
+              <w:t xml:space="preserve">Voortdurend de rol van digitale technologieën zoals sociale media onderzoeken bij het versterken en in stand houden van bias, stereotypering en uitsluiting. </w:t>
             </w:r>
             <w:r>
               <w:rPr>
@@ -12208,7 +12768,7 @@
                 <w:color w:val="000000"/>
                 <w:sz w:val="18"/>
               </w:rPr>
-              <w:t xml:space="preserve">Effectief melden van of ingrijpen bij gevallen van schadelijk gedrag of content in digitale omgevingen. </w:t>
+              <w:t xml:space="preserve">Effectief melden van of ingrijpen bij gevallen van schadelijk gedrag of inhoud in digitale omgevingen. </w:t>
             </w:r>
             <w:r>
               <w:rPr>
@@ -12240,7 +12800,7 @@
                 <w:color w:val="000000"/>
                 <w:sz w:val="18"/>
               </w:rPr>
-              <w:t xml:space="preserve">Anderen helpen hun gebruik van digitale technologie te herzien en aan te passen, en bewustzijn te ontwikkelen over schadelijk gedrag, content en misleidend ontwerp in digitale omgevingen. </w:t>
+              <w:t xml:space="preserve">Anderen helpen hun gebruik van digitale technologieën te herzien en aan te passen, en bewustzijn te ontwikkelen over schadelijk gedrag, inhoud en misleidend ontwerp in digitale omgevingen. </w:t>
             </w:r>
             <w:r>
               <w:rPr>
@@ -12272,7 +12832,7 @@
                 <w:color w:val="000000"/>
                 <w:sz w:val="18"/>
               </w:rPr>
-              <w:t xml:space="preserve">Anderen helpen vaardigheden op te bouwen om de rol van digitale technologie zoals sociale media bij het versterken en in stand houden van vooroordelen, stereotypering en uitsluiting tegen te gaan. </w:t>
+              <w:t xml:space="preserve">Anderen helpen vaardigheden op te bouwen om de rol van digitale technologieën zoals sociale media bij het versterken en in stand houden van bias, stereotypering en uitsluiting tegen te gaan. </w:t>
             </w:r>
             <w:r>
               <w:rPr>
@@ -12341,7 +12901,7 @@
                 <w:color w:val="000000"/>
                 <w:sz w:val="18"/>
               </w:rPr>
-              <w:t>Op zeer gevorderdniveau kunnen individuen</w:t>
+              <w:t>Op zeer geavanceerdniveau kunnen individuen</w:t>
             </w:r>
           </w:p>
         </w:tc>
@@ -12433,7 +12993,7 @@
                 <w:color w:val="000000"/>
                 <w:sz w:val="18"/>
               </w:rPr>
-              <w:t xml:space="preserve">Initiatieven die welzijn en/of inclusie in digitale omgevingen ondersteunen, leiden of hieraan bijdragen. </w:t>
+              <w:t xml:space="preserve">Leiding geven aan of bijdragen aan initiatieven die welzijn en/of inclusie in digitale omgevingen ondersteunen. </w:t>
             </w:r>
             <w:r>
               <w:rPr>
@@ -12508,7 +13068,42 @@
             <w:tcW w:type="dxa" w:w="3627"/>
             <w:vMerge w:val="restart"/>
           </w:tcPr>
-          <w:p/>
+          <w:p>
+            <w:r>
+              <w:drawing>
+                <wp:inline xmlns:a="http://schemas.openxmlformats.org/drawingml/2006/main" xmlns:pic="http://schemas.openxmlformats.org/drawingml/2006/picture">
+                  <wp:extent cx="1368000" cy="1315803"/>
+                  <wp:docPr id="17" name="Picture 17"/>
+                  <wp:cNvGraphicFramePr>
+                    <a:graphicFrameLocks noChangeAspect="1"/>
+                  </wp:cNvGraphicFramePr>
+                  <a:graphic>
+                    <a:graphicData uri="http://schemas.openxmlformats.org/drawingml/2006/picture">
+                      <pic:pic>
+                        <pic:nvPicPr>
+                          <pic:cNvPr id="0" name="DC3_4p4.png"/>
+                          <pic:cNvPicPr/>
+                        </pic:nvPicPr>
+                        <pic:blipFill>
+                          <a:blip r:embed="rId25"/>
+                          <a:stretch>
+                            <a:fillRect/>
+                          </a:stretch>
+                        </pic:blipFill>
+                        <pic:spPr>
+                          <a:xfrm>
+                            <a:off x="0" y="0"/>
+                            <a:ext cx="1368000" cy="1315803"/>
+                          </a:xfrm>
+                          <a:prstGeom prst="rect"/>
+                        </pic:spPr>
+                      </pic:pic>
+                    </a:graphicData>
+                  </a:graphic>
+                </wp:inline>
+              </w:drawing>
+            </w:r>
+          </w:p>
           <w:p>
             <w:r>
               <w:rPr>
@@ -12530,7 +13125,7 @@
                 <w:color w:val="000000"/>
                 <w:sz w:val="22"/>
               </w:rPr>
-              <w:t>4.4 Milieueffecten van digitale technologie</w:t>
+              <w:t>4.4 Milieueffecten van digitale technologieën</w:t>
             </w:r>
           </w:p>
           <w:p>
@@ -12542,7 +13137,7 @@
                 <w:color w:val="000000"/>
                 <w:sz w:val="17"/>
               </w:rPr>
-              <w:t>Het zich bewust zijn van het milieueffect van digitale technologie, waaronder de productie van apparaten, het gebruik, de reparatie, recycling, weggooien, infrastructuur voor dataopslag, energieverbruik en het gebruik van tools en applicaties. Het ondernemen van actie om dit effect te beperken en het gebruiken van digitale technologie om duurzaamheid te ondersteunen.</w:t>
+              <w:t>Je bewust zijn van de milieueffecten van digitale technologieën, waaronder de productie van apparaten, het gebruik, de reparatie, recycling, verwijdering, infrastructuur voor gegevensopslag, energieverbruik en het gebruik van middelen en applicaties. Actie ondernemen om deze impact te beperken en digitale technologieën gebruiken om duurzaamheid te ondersteunen.</w:t>
             </w:r>
           </w:p>
         </w:tc>
@@ -12588,7 +13183,7 @@
                 <w:color w:val="000000"/>
                 <w:sz w:val="18"/>
               </w:rPr>
-              <w:t xml:space="preserve">De rol inzien die individuen kunnen spelen om de milieu-impact van digitale technologie te helpen verminderen. </w:t>
+              <w:t xml:space="preserve">De rol inzien die individuen kunnen spelen om de milieu-impact van digitale technologieën te helpen verminderen. </w:t>
             </w:r>
             <w:r>
               <w:rPr>
@@ -12652,7 +13247,7 @@
                 <w:color w:val="000000"/>
                 <w:sz w:val="18"/>
               </w:rPr>
-              <w:t xml:space="preserve">Herkennen dat de volledige milieu-impact van digitale technologie niet onmiddellijk zichtbaar is voor een individuele gebruiker. </w:t>
+              <w:t xml:space="preserve">Herkennen dat de volledige milieu-impact van digitale technologieën niet onmiddellijk zichtbaar is voor een individuele gebruiker. </w:t>
             </w:r>
             <w:r>
               <w:rPr>
@@ -12684,7 +13279,7 @@
                 <w:color w:val="000000"/>
                 <w:sz w:val="18"/>
               </w:rPr>
-              <w:t xml:space="preserve">De rol van digitale technologie bij het ondersteunen van energie-efficiëntie en duurzaamheid herkennen. </w:t>
+              <w:t xml:space="preserve">De rol van digitale technologieën bij het ondersteunen van energie-efficiëntie en duurzaamheid herkennen. </w:t>
             </w:r>
             <w:r>
               <w:rPr>
@@ -12716,7 +13311,7 @@
                 <w:color w:val="000000"/>
                 <w:sz w:val="18"/>
               </w:rPr>
-              <w:t xml:space="preserve">Eenvoudige strategieën herkennen en toepassen om het energie- en datagebruik te verminderen bij het gebruik van digitale technologie. </w:t>
+              <w:t xml:space="preserve">Eenvoudige strategieën identificeren en toepassen om het energie- en datagebruik te verminderen bij het gebruik van digitale technologieën. </w:t>
             </w:r>
             <w:r>
               <w:rPr>
@@ -12753,7 +13348,7 @@
                 <w:color w:val="000000"/>
                 <w:sz w:val="18"/>
               </w:rPr>
-              <w:t>Op intermediairniveau kunnen individuen</w:t>
+              <w:t>Op gemiddeldniveau kunnen individuen</w:t>
             </w:r>
           </w:p>
         </w:tc>
@@ -12781,7 +13376,7 @@
                 <w:color w:val="000000"/>
                 <w:sz w:val="18"/>
               </w:rPr>
-              <w:t xml:space="preserve">Voortdurend de milieu-impact van het eigen gebruik van digitale technologie beoordelen. </w:t>
+              <w:t xml:space="preserve">Voortdurend de milieu-impact van het eigen gebruik van digitale technologieën beoordelen. </w:t>
             </w:r>
             <w:r>
               <w:rPr>
@@ -12813,7 +13408,7 @@
                 <w:color w:val="000000"/>
                 <w:sz w:val="18"/>
               </w:rPr>
-              <w:t xml:space="preserve">Milieu-impact van digitale technologie herkennen die optreedt tijdens productie, gebruik en afvalverwerking, evenals die van datacenters en e-commerce. </w:t>
+              <w:t xml:space="preserve">Milieu-impact van digitale technologieën identificeren die optreedt tijdens productie, gebruik en afvalverwerking, evenals die van datacenters en e-commerce. </w:t>
             </w:r>
             <w:r>
               <w:rPr>
@@ -12845,7 +13440,7 @@
                 <w:color w:val="000000"/>
                 <w:sz w:val="18"/>
               </w:rPr>
-              <w:t xml:space="preserve">Beschrijven hoe sommige digitale technologie een duurzame levensstijl kunnen ondersteunen. </w:t>
+              <w:t xml:space="preserve">Beschrijven hoe sommige digitale technologieën een duurzame levensstijl kunnen ondersteunen. </w:t>
             </w:r>
             <w:r>
               <w:rPr>
@@ -12909,7 +13504,7 @@
                 <w:color w:val="000000"/>
                 <w:sz w:val="18"/>
               </w:rPr>
-              <w:t xml:space="preserve">Verschillende strategieën beoordelen en toepassen om de milieu-impact van het eigen gebruik van digitale technologie en digitale apparaten te verminderen. </w:t>
+              <w:t xml:space="preserve">Verschillende strategieën beoordelen en toepassen om de milieu-impact van het eigen gebruik van digitale technologieën en digitale apparaten te verminderen. </w:t>
             </w:r>
             <w:r>
               <w:rPr>
@@ -12946,7 +13541,7 @@
                 <w:color w:val="000000"/>
                 <w:sz w:val="18"/>
               </w:rPr>
-              <w:t>Op gevorderdniveau kunnen individuen</w:t>
+              <w:t>Op geavanceerdniveau kunnen individuen</w:t>
             </w:r>
           </w:p>
         </w:tc>
@@ -12974,7 +13569,7 @@
                 <w:color w:val="000000"/>
                 <w:sz w:val="18"/>
               </w:rPr>
-              <w:t xml:space="preserve">Op de hoogte blijven van de milieu-impact van digitale technologie en de manieren waarop digitale technologie duurzaamheid kunnen ondersteunen. </w:t>
+              <w:t xml:space="preserve">Op de hoogte blijven van de milieu-impact van digitale technologieën en de manieren waarop digitale technologieën duurzaamheid kunnen ondersteunen. </w:t>
             </w:r>
             <w:r>
               <w:rPr>
@@ -13006,7 +13601,7 @@
                 <w:color w:val="000000"/>
                 <w:sz w:val="18"/>
               </w:rPr>
-              <w:t xml:space="preserve">De milieu-impact van digitale technologie en infrastructuren evalueren ter ondersteuning van besluitvorming of belangenbehartiging. </w:t>
+              <w:t xml:space="preserve">De milieu-impact van digitale technologieën en infrastructuren evalueren ter ondersteuning van besluitvorming of belangenbehartiging. </w:t>
             </w:r>
             <w:r>
               <w:rPr>
@@ -13038,7 +13633,7 @@
                 <w:color w:val="000000"/>
                 <w:sz w:val="18"/>
               </w:rPr>
-              <w:t xml:space="preserve">Anderen helpen hun gebruik van digitale technologie te beoordelen om manieren te herkennen waarop de milieu-impact kan worden verminderd. </w:t>
+              <w:t xml:space="preserve">Anderen helpen hun gebruik van digitale technologieën te beoordelen om manieren te identificeren waarop de milieu-impact kan worden verminderd. </w:t>
             </w:r>
             <w:r>
               <w:rPr>
@@ -13075,7 +13670,7 @@
                 <w:color w:val="000000"/>
                 <w:sz w:val="18"/>
               </w:rPr>
-              <w:t>Op zeer gevorderdniveau kunnen individuen</w:t>
+              <w:t>Op zeer geavanceerdniveau kunnen individuen</w:t>
             </w:r>
           </w:p>
         </w:tc>
@@ -13103,7 +13698,7 @@
                 <w:color w:val="000000"/>
                 <w:sz w:val="18"/>
               </w:rPr>
-              <w:t xml:space="preserve">Op de hoogte blijven van de implicaties voor milieu en duurzaamheid van digitale technologie in verschillende sectoren. </w:t>
+              <w:t xml:space="preserve">Op de hoogte blijven van de implicaties voor milieu en duurzaamheid van digitale technologieën in verschillende sectoren. </w:t>
             </w:r>
             <w:r>
               <w:rPr>
@@ -13135,7 +13730,7 @@
                 <w:color w:val="000000"/>
                 <w:sz w:val="18"/>
               </w:rPr>
-              <w:t xml:space="preserve">Acties voor milieuvriendelijk duurzaam gebruik van digitale technologie bevorderen en ondersteunen. </w:t>
+              <w:t xml:space="preserve">Acties voor milieuvriendelijk duurzaam gebruik van digitale technologieën bevorderen en ondersteunen. </w:t>
             </w:r>
             <w:r>
               <w:rPr>
@@ -13167,7 +13762,7 @@
                 <w:color w:val="000000"/>
                 <w:sz w:val="18"/>
               </w:rPr>
-              <w:t xml:space="preserve">Initiatieven voor digitale duurzaamheid leiden of hieraan bijdragen. </w:t>
+              <w:t xml:space="preserve">Leiding geven aan of bijdragen aan initiatieven voor digitale duurzaamheid. </w:t>
             </w:r>
             <w:r>
               <w:rPr>
@@ -13242,7 +13837,42 @@
             <w:tcW w:type="dxa" w:w="3627"/>
             <w:vMerge w:val="restart"/>
           </w:tcPr>
-          <w:p/>
+          <w:p>
+            <w:r>
+              <w:drawing>
+                <wp:inline xmlns:a="http://schemas.openxmlformats.org/drawingml/2006/main" xmlns:pic="http://schemas.openxmlformats.org/drawingml/2006/picture">
+                  <wp:extent cx="1368000" cy="1315803"/>
+                  <wp:docPr id="18" name="Picture 18"/>
+                  <wp:cNvGraphicFramePr>
+                    <a:graphicFrameLocks noChangeAspect="1"/>
+                  </wp:cNvGraphicFramePr>
+                  <a:graphic>
+                    <a:graphicData uri="http://schemas.openxmlformats.org/drawingml/2006/picture">
+                      <pic:pic>
+                        <pic:nvPicPr>
+                          <pic:cNvPr id="0" name="DC3_5p1.png"/>
+                          <pic:cNvPicPr/>
+                        </pic:nvPicPr>
+                        <pic:blipFill>
+                          <a:blip r:embed="rId26"/>
+                          <a:stretch>
+                            <a:fillRect/>
+                          </a:stretch>
+                        </pic:blipFill>
+                        <pic:spPr>
+                          <a:xfrm>
+                            <a:off x="0" y="0"/>
+                            <a:ext cx="1368000" cy="1315803"/>
+                          </a:xfrm>
+                          <a:prstGeom prst="rect"/>
+                        </pic:spPr>
+                      </pic:pic>
+                    </a:graphicData>
+                  </a:graphic>
+                </wp:inline>
+              </w:drawing>
+            </w:r>
+          </w:p>
           <w:p>
             <w:r>
               <w:rPr>
@@ -13252,7 +13882,7 @@
                 <w:color w:val="E26B67"/>
                 <w:sz w:val="20"/>
               </w:rPr>
-              <w:t>5. HERKENNEN EN OPLOSSEN VAN PROBLEMEN</w:t>
+              <w:t>5. PROBLEEMIDENTIFICATIE EN -OPLOSSING</w:t>
             </w:r>
           </w:p>
           <w:p>
@@ -13264,7 +13894,7 @@
                 <w:color w:val="000000"/>
                 <w:sz w:val="22"/>
               </w:rPr>
-              <w:t>5.1 Herkennen en oplossen van technische problemen</w:t>
+              <w:t>5.1 Technische problemen identificeren en oplossen</w:t>
             </w:r>
           </w:p>
           <w:p>
@@ -13276,7 +13906,7 @@
                 <w:color w:val="000000"/>
                 <w:sz w:val="17"/>
               </w:rPr>
-              <w:t>Het herkennen van technische problemen bij de bediening van digitale apparaten en in digitale omgevingen en het oplossen ervan middels verschillende manieren.</w:t>
+              <w:t>Technische problemen identificeren bij het bedienen van digitale apparaten en in digitale omgevingen, en deze op verschillende manieren oplossen.</w:t>
             </w:r>
           </w:p>
         </w:tc>
@@ -13354,7 +13984,7 @@
                 <w:color w:val="000000"/>
                 <w:sz w:val="18"/>
               </w:rPr>
-              <w:t xml:space="preserve">Onderscheid maken tussen besturingssystemen en software en de belangrijkste functies van hardware, software, connectiviteit en veelvoorkomende randapparatuur herkennen. </w:t>
+              <w:t xml:space="preserve">Onderscheid maken tussen besturingssystemen en software en de belangrijkste kenmerken van hardware, software, connectiviteit en veelvoorkomende randapparatuur identificeren. </w:t>
             </w:r>
             <w:r>
               <w:rPr>
@@ -13386,7 +14016,7 @@
                 <w:color w:val="000000"/>
                 <w:sz w:val="18"/>
               </w:rPr>
-              <w:t xml:space="preserve">Veelvoorkomende technische problemen herkennen en instructies volgen om ze te helpen oplossen. </w:t>
+              <w:t xml:space="preserve">Veelvoorkomende technische problemen identificeren en instructies volgen om ze te helpen oplossen. </w:t>
             </w:r>
             <w:r>
               <w:rPr>
@@ -13455,7 +14085,7 @@
                 <w:color w:val="000000"/>
                 <w:sz w:val="18"/>
               </w:rPr>
-              <w:t>Op intermediairniveau kunnen individuen</w:t>
+              <w:t>Op gemiddeldniveau kunnen individuen</w:t>
             </w:r>
           </w:p>
         </w:tc>
@@ -13584,7 +14214,7 @@
                 <w:color w:val="000000"/>
                 <w:sz w:val="18"/>
               </w:rPr>
-              <w:t>Op gevorderdniveau kunnen individuen</w:t>
+              <w:t>Op geavanceerdniveau kunnen individuen</w:t>
             </w:r>
           </w:p>
         </w:tc>
@@ -13713,7 +14343,7 @@
                 <w:color w:val="000000"/>
                 <w:sz w:val="18"/>
               </w:rPr>
-              <w:t>Op zeer gevorderdniveau kunnen individuen</w:t>
+              <w:t>Op zeer geavanceerdniveau kunnen individuen</w:t>
             </w:r>
           </w:p>
         </w:tc>
@@ -13816,7 +14446,42 @@
             <w:tcW w:type="dxa" w:w="3627"/>
             <w:vMerge w:val="restart"/>
           </w:tcPr>
-          <w:p/>
+          <w:p>
+            <w:r>
+              <w:drawing>
+                <wp:inline xmlns:a="http://schemas.openxmlformats.org/drawingml/2006/main" xmlns:pic="http://schemas.openxmlformats.org/drawingml/2006/picture">
+                  <wp:extent cx="1368000" cy="1315803"/>
+                  <wp:docPr id="19" name="Picture 19"/>
+                  <wp:cNvGraphicFramePr>
+                    <a:graphicFrameLocks noChangeAspect="1"/>
+                  </wp:cNvGraphicFramePr>
+                  <a:graphic>
+                    <a:graphicData uri="http://schemas.openxmlformats.org/drawingml/2006/picture">
+                      <pic:pic>
+                        <pic:nvPicPr>
+                          <pic:cNvPr id="0" name="DC3_5p2.png"/>
+                          <pic:cNvPicPr/>
+                        </pic:nvPicPr>
+                        <pic:blipFill>
+                          <a:blip r:embed="rId27"/>
+                          <a:stretch>
+                            <a:fillRect/>
+                          </a:stretch>
+                        </pic:blipFill>
+                        <pic:spPr>
+                          <a:xfrm>
+                            <a:off x="0" y="0"/>
+                            <a:ext cx="1368000" cy="1315803"/>
+                          </a:xfrm>
+                          <a:prstGeom prst="rect"/>
+                        </pic:spPr>
+                      </pic:pic>
+                    </a:graphicData>
+                  </a:graphic>
+                </wp:inline>
+              </w:drawing>
+            </w:r>
+          </w:p>
           <w:p>
             <w:r>
               <w:rPr>
@@ -13826,7 +14491,7 @@
                 <w:color w:val="E26B67"/>
                 <w:sz w:val="20"/>
               </w:rPr>
-              <w:t>5. HERKENNEN EN OPLOSSEN VAN PROBLEMEN</w:t>
+              <w:t>5. PROBLEEMIDENTIFICATIE EN -OPLOSSING</w:t>
             </w:r>
           </w:p>
           <w:p>
@@ -13838,7 +14503,7 @@
                 <w:color w:val="000000"/>
                 <w:sz w:val="22"/>
               </w:rPr>
-              <w:t>5.2 Herkennen van behoeften en technologische oplossingen</w:t>
+              <w:t>5.2 Behoeften en digitale technologische antwoorden identificeren</w:t>
             </w:r>
           </w:p>
           <w:p>
@@ -13850,7 +14515,7 @@
                 <w:color w:val="000000"/>
                 <w:sz w:val="17"/>
               </w:rPr>
-              <w:t>Het beoordelen van eigen en andermans behoeften en het beoordelen, selecteren en gebruiken van digitale technologie om aan deze behoeften te voldoen. Het aanpassen en personaliseren van digitale omgevingen aan de context, doelen en behoeften (bijv. toegankelijkheid) van zichzelf en anderen.</w:t>
+              <w:t>Behoeften van jezelf en anderen beoordelen en digitale technologieën evalueren, selecteren, gebruiken en aanpassen om aan deze behoeften te voldoen. Digitale omgevingen aanpassen en personaliseren aan de context, doelen en behoeften (bijv. toegankelijkheid) van jezelf en anderen.</w:t>
             </w:r>
           </w:p>
         </w:tc>
@@ -13960,7 +14625,7 @@
                 <w:color w:val="000000"/>
                 <w:sz w:val="18"/>
               </w:rPr>
-              <w:t xml:space="preserve">Het doel van technologische toegankelijkheid en voorbeelden van veelvoorkomende ondersteunende technologie herkennen. </w:t>
+              <w:t xml:space="preserve">Het doel van technologische toegankelijkheid en voorbeelden van veelvoorkomende ondersteunende technologieën identificeren. </w:t>
             </w:r>
             <w:r>
               <w:rPr>
@@ -13997,7 +14662,7 @@
                 <w:color w:val="000000"/>
                 <w:sz w:val="18"/>
               </w:rPr>
-              <w:t>Op intermediairniveau kunnen individuen</w:t>
+              <w:t>Op gemiddeldniveau kunnen individuen</w:t>
             </w:r>
           </w:p>
         </w:tc>
@@ -14025,7 +14690,7 @@
                 <w:color w:val="000000"/>
                 <w:sz w:val="18"/>
               </w:rPr>
-              <w:t xml:space="preserve">De voordelen inzien van het verkennen van aanpassingen aan configuraties van digitale omgevingen en functies van digitale assistentietools. </w:t>
+              <w:t xml:space="preserve">De voordelen inzien van het verkennen van aanpassingen aan configuraties van digitale omgevingen en kenmerken van digitale assistentiehulpmiddelen. </w:t>
             </w:r>
             <w:r>
               <w:rPr>
@@ -14057,7 +14722,7 @@
                 <w:color w:val="000000"/>
                 <w:sz w:val="18"/>
               </w:rPr>
-              <w:t xml:space="preserve">Geïnformeerd gebruik maken van digitale assistentietools om aan de eigen behoeften en die van anderen te voldoen, met bewustzijn van hun voordelen en beperkingen. </w:t>
+              <w:t xml:space="preserve">Geïnformeerd gebruik maken van digitale assistentiehulpmiddelen om aan de eigen behoeften en die van anderen te voldoen, met bewustzijn van hun voordelen en beperkingen. </w:t>
             </w:r>
             <w:r>
               <w:rPr>
@@ -14126,7 +14791,7 @@
                 <w:color w:val="000000"/>
                 <w:sz w:val="18"/>
               </w:rPr>
-              <w:t>Op gevorderdniveau kunnen individuen</w:t>
+              <w:t>Op geavanceerdniveau kunnen individuen</w:t>
             </w:r>
           </w:p>
         </w:tc>
@@ -14154,7 +14819,7 @@
                 <w:color w:val="000000"/>
                 <w:sz w:val="18"/>
               </w:rPr>
-              <w:t xml:space="preserve">Prioriteit geven aan een voortdurende beoordeling van hoe configuraties van de digitale omgeving, digitale assistentietools en/of ondersteunende technologie kunnen voldoen aan de behoeften van zichzelf en anderen. </w:t>
+              <w:t xml:space="preserve">Prioriteit geven aan een voortdurende beoordeling van hoe configuraties van de digitale omgeving, digitale assistentiehulpmiddelen en/of ondersteunende technologieën kunnen voldoen aan de behoeften van zichzelf en anderen. </w:t>
             </w:r>
             <w:r>
               <w:rPr>
@@ -14186,7 +14851,7 @@
                 <w:color w:val="000000"/>
                 <w:sz w:val="18"/>
               </w:rPr>
-              <w:t xml:space="preserve">Kenmerken van digitale omgevingen aanpassen, en digitale assistentietools en ondersteunende technologie gebruiken om aan de eigen behoeften en die van anderen te voldoen. </w:t>
+              <w:t xml:space="preserve">Kenmerken van digitale omgevingen aanpassen, en digitale assistentiehulpmiddelen en ondersteunende technologieën gebruiken om aan de eigen behoeften en die van anderen te voldoen. </w:t>
             </w:r>
             <w:r>
               <w:rPr>
@@ -14218,7 +14883,7 @@
                 <w:color w:val="000000"/>
                 <w:sz w:val="18"/>
               </w:rPr>
-              <w:t xml:space="preserve">De toegankelijkheid, inclusiviteit, eerlijkheid en/of rechtgevoeligheid van digitale technologie in een bepaalde context beoordelen. </w:t>
+              <w:t xml:space="preserve">De toegankelijkheid, inclusiviteit, eerlijkheid en/of rechtgevoeligheid van digitale technologieën in een gegeven context beoordelen. </w:t>
             </w:r>
             <w:r>
               <w:rPr>
@@ -14250,7 +14915,7 @@
                 <w:color w:val="000000"/>
                 <w:sz w:val="18"/>
               </w:rPr>
-              <w:t xml:space="preserve">Anderen ondersteunen bij het maken van geïnformeerd gebruik van digitale assistentietools en aanpassingen aan configuraties van de digitale omgeving. </w:t>
+              <w:t xml:space="preserve">Anderen ondersteunen bij het maken van geïnformeerd gebruik van digitale assistentiehulpmiddelen en aanpassingen aan configuraties van de digitale omgeving. </w:t>
             </w:r>
             <w:r>
               <w:rPr>
@@ -14287,7 +14952,7 @@
                 <w:color w:val="000000"/>
                 <w:sz w:val="18"/>
               </w:rPr>
-              <w:t>Op zeer gevorderdniveau kunnen individuen</w:t>
+              <w:t>Op zeer geavanceerdniveau kunnen individuen</w:t>
             </w:r>
           </w:p>
         </w:tc>
@@ -14315,7 +14980,7 @@
                 <w:color w:val="000000"/>
                 <w:sz w:val="18"/>
               </w:rPr>
-              <w:t xml:space="preserve">Het gebruik van inclusieve en toegankelijke digitale technologie bevorderen en ondersteunen. </w:t>
+              <w:t xml:space="preserve">Het gebruik van inclusieve en toegankelijke digitale technologieën bevorderen en ondersteunen. </w:t>
             </w:r>
             <w:r>
               <w:rPr>
@@ -14347,7 +15012,7 @@
                 <w:color w:val="000000"/>
                 <w:sz w:val="18"/>
               </w:rPr>
-              <w:t xml:space="preserve">Complexe behoeften van individuen beoordelen om op maat gemaakte digitale oplossingen te herkennen en/of te ontwerpen. </w:t>
+              <w:t xml:space="preserve">Complexe behoeften van individuen beoordelen om op maat gemaakte digitale oplossingen te identificeren en/of te ontwerpen. </w:t>
             </w:r>
             <w:r>
               <w:rPr>
@@ -14379,7 +15044,7 @@
                 <w:color w:val="000000"/>
                 <w:sz w:val="18"/>
               </w:rPr>
-              <w:t xml:space="preserve">Bijdragen aan verbeteringen in of oplossingen voor digitale assistentietools, toegankelijke configuraties van de digitale omgeving en/of ondersteunende technologie. </w:t>
+              <w:t xml:space="preserve">Bijdragen aan verbeteringen in of oplossingen voor digitale assistentiehulpmiddelen, toegankelijke configuraties van de digitale omgeving en/of ondersteunende technologieën. </w:t>
             </w:r>
             <w:r>
               <w:rPr>
@@ -14422,7 +15087,42 @@
             <w:tcW w:type="dxa" w:w="3627"/>
             <w:vMerge w:val="restart"/>
           </w:tcPr>
-          <w:p/>
+          <w:p>
+            <w:r>
+              <w:drawing>
+                <wp:inline xmlns:a="http://schemas.openxmlformats.org/drawingml/2006/main" xmlns:pic="http://schemas.openxmlformats.org/drawingml/2006/picture">
+                  <wp:extent cx="1368000" cy="1315803"/>
+                  <wp:docPr id="20" name="Picture 20"/>
+                  <wp:cNvGraphicFramePr>
+                    <a:graphicFrameLocks noChangeAspect="1"/>
+                  </wp:cNvGraphicFramePr>
+                  <a:graphic>
+                    <a:graphicData uri="http://schemas.openxmlformats.org/drawingml/2006/picture">
+                      <pic:pic>
+                        <pic:nvPicPr>
+                          <pic:cNvPr id="0" name="DC3_5p3.png"/>
+                          <pic:cNvPicPr/>
+                        </pic:nvPicPr>
+                        <pic:blipFill>
+                          <a:blip r:embed="rId28"/>
+                          <a:stretch>
+                            <a:fillRect/>
+                          </a:stretch>
+                        </pic:blipFill>
+                        <pic:spPr>
+                          <a:xfrm>
+                            <a:off x="0" y="0"/>
+                            <a:ext cx="1368000" cy="1315803"/>
+                          </a:xfrm>
+                          <a:prstGeom prst="rect"/>
+                        </pic:spPr>
+                      </pic:pic>
+                    </a:graphicData>
+                  </a:graphic>
+                </wp:inline>
+              </w:drawing>
+            </w:r>
+          </w:p>
           <w:p>
             <w:r>
               <w:rPr>
@@ -14432,7 +15132,7 @@
                 <w:color w:val="E26B67"/>
                 <w:sz w:val="20"/>
               </w:rPr>
-              <w:t>5. HERKENNEN EN OPLOSSEN VAN PROBLEMEN</w:t>
+              <w:t>5. PROBLEEMIDENTIFICATIE EN -OPLOSSING</w:t>
             </w:r>
           </w:p>
           <w:p>
@@ -14444,7 +15144,7 @@
                 <w:color w:val="000000"/>
                 <w:sz w:val="22"/>
               </w:rPr>
-              <w:t>5.3 Herkennen van creatieve oplossingen met behulp van digitale technologie</w:t>
+              <w:t>5.3 Creatieve oplossingen identificeren met behulp van digitale technologieën</w:t>
             </w:r>
           </w:p>
           <w:p>
@@ -14456,7 +15156,7 @@
                 <w:color w:val="000000"/>
                 <w:sz w:val="17"/>
               </w:rPr>
-              <w:t>Het gebruiken van digitale technologie om verbeteringen aan te brengen in of nieuwe oplossingen te vinden voor processen en producten, vanuit een mensgerichte benadering. Het individueel en collectief deelnemen aan kritische denkprocessen en het creatief en doelgericht gebruiken van digitale technologie om conceptuele problemen en probleemsituaties te begrijpen en op te lossen.</w:t>
+              <w:t>Digitale technologieën gebruiken om verbeteringen aan te brengen in of nieuwe oplossingen te vinden voor processen en producten, vanuit een mensgerichte benadering. Individueel en collectief deelnemen aan kritische denkprocessen en het creatief en doelgericht gebruik van digitale technologieën, om conceptuele problemen en probleemsituaties te begrijpen en op te lossen.</w:t>
             </w:r>
           </w:p>
         </w:tc>
@@ -14502,7 +15202,7 @@
                 <w:color w:val="000000"/>
                 <w:sz w:val="18"/>
               </w:rPr>
-              <w:t xml:space="preserve">Inzien dat digitale technologie de menselijke creativiteit kunnen ondersteunen, maar niet vervangen. </w:t>
+              <w:t xml:space="preserve">Inzien dat digitale technologieën de menselijke creativiteit kunnen ondersteunen, maar niet vervangen. </w:t>
             </w:r>
             <w:r>
               <w:rPr>
@@ -14534,7 +15234,7 @@
                 <w:color w:val="000000"/>
                 <w:sz w:val="18"/>
               </w:rPr>
-              <w:t xml:space="preserve">Voorbeelden herkennen van hoe digitale technologie worden gebruikt om praktijkproblemen op te lossen en verbeteringen aan te brengen in of nieuwe oplossingen, producten of diensten te creëren. </w:t>
+              <w:t xml:space="preserve">Voorbeelden identificeren van hoe digitale technologieën worden gebruikt om praktijkproblemen op te lossen en verbeteringen aan te brengen in of nieuwe oplossingen, producten of diensten te creëren. </w:t>
             </w:r>
             <w:r>
               <w:rPr>
@@ -14566,7 +15266,7 @@
                 <w:color w:val="000000"/>
                 <w:sz w:val="18"/>
               </w:rPr>
-              <w:t xml:space="preserve">Voorbeelden herkennen van waar digitale technologie menselijke creativiteit kunnen ondersteunen of versterken. </w:t>
+              <w:t xml:space="preserve">Voorbeelden identificeren van waar digitale technologieën menselijke creativiteit kunnen ondersteunen of versterken. </w:t>
             </w:r>
             <w:r>
               <w:rPr>
@@ -14603,7 +15303,7 @@
                 <w:color w:val="000000"/>
                 <w:sz w:val="18"/>
               </w:rPr>
-              <w:t>Op intermediairniveau kunnen individuen</w:t>
+              <w:t>Op gemiddeldniveau kunnen individuen</w:t>
             </w:r>
           </w:p>
         </w:tc>
@@ -14631,7 +15331,7 @@
                 <w:color w:val="000000"/>
                 <w:sz w:val="18"/>
               </w:rPr>
-              <w:t xml:space="preserve">Het concept van mensgerichtheid definiëren en de rol ervan bij de ontwikkeling en het gebruik van digitale technologie. </w:t>
+              <w:t xml:space="preserve">Het concept van mensgerichtheid definiëren en de rol ervan bij de ontwikkeling en het gebruik van digitale technologieën. </w:t>
             </w:r>
             <w:r>
               <w:rPr>
@@ -14663,7 +15363,7 @@
                 <w:color w:val="000000"/>
                 <w:sz w:val="18"/>
               </w:rPr>
-              <w:t xml:space="preserve">Sterktes, zwaktes en ethische overwegingen van digitale technologie, inclusief AI-systemen, beschrijven in relatie tot menselijke creativiteit en probleemoplossing. </w:t>
+              <w:t xml:space="preserve">Sterktes, zwaktes en ethische overwegingen van digitale technologieën, inclusief AI-systemen, beschrijven in relatie tot menselijke creativiteit en probleemoplossing. </w:t>
             </w:r>
             <w:r>
               <w:rPr>
@@ -14732,7 +15432,7 @@
                 <w:color w:val="000000"/>
                 <w:sz w:val="18"/>
               </w:rPr>
-              <w:t>Op gevorderdniveau kunnen individuen</w:t>
+              <w:t>Op geavanceerdniveau kunnen individuen</w:t>
             </w:r>
           </w:p>
         </w:tc>
@@ -14792,7 +15492,7 @@
                 <w:color w:val="000000"/>
                 <w:sz w:val="18"/>
               </w:rPr>
-              <w:t xml:space="preserve">Anderen ondersteunen bij het ontwikkelen van hun vertrouwen en competenties in het gebruik van digitale technologie om praktijkproblemen te helpen oplossen. </w:t>
+              <w:t xml:space="preserve">Anderen ondersteunen bij het ontwikkelen van hun vertrouwen en vaardigheden in het gebruik van digitale technologieën om praktijkproblemen te helpen oplossen. </w:t>
             </w:r>
             <w:r>
               <w:rPr>
@@ -14861,7 +15561,7 @@
                 <w:color w:val="000000"/>
                 <w:sz w:val="18"/>
               </w:rPr>
-              <w:t>Op zeer gevorderdniveau kunnen individuen</w:t>
+              <w:t>Op zeer geavanceerdniveau kunnen individuen</w:t>
             </w:r>
           </w:p>
         </w:tc>
@@ -14889,7 +15589,7 @@
                 <w:color w:val="000000"/>
                 <w:sz w:val="18"/>
               </w:rPr>
-              <w:t xml:space="preserve">Initiatieven gericht op de toepassing van digitale technologie voor zeer complexe of gespecialiseerde probleemoplossing leiden of hieraan bijdragen. </w:t>
+              <w:t xml:space="preserve">Leiding geven aan of bijdragen aan initiatieven gericht op de toepassing van digitale technologieën voor zeer complexe of gespecialiseerde probleemoplossing. </w:t>
             </w:r>
             <w:r>
               <w:rPr>
@@ -14921,7 +15621,7 @@
                 <w:color w:val="000000"/>
                 <w:sz w:val="18"/>
               </w:rPr>
-              <w:t xml:space="preserve">Initiatieven die digitale technologie gebruiken om verbeteringen aan te brengen in of nieuwe oplossingen te vinden voor praktijkproblemen leiden of hieraan bijdragen. </w:t>
+              <w:t xml:space="preserve">Leiding geven aan of bijdragen aan initiatieven die digitale technologieën gebruiken om verbeteringen aan te brengen in of nieuwe oplossingen te vinden voor praktijkproblemen. </w:t>
             </w:r>
             <w:r>
               <w:rPr>
@@ -14953,7 +15653,7 @@
                 <w:color w:val="000000"/>
                 <w:sz w:val="18"/>
               </w:rPr>
-              <w:t xml:space="preserve">Anderen ondersteunen bij het ontwikkelen van hun competenties om digitale technologie te gebruiken voor complexe of gespecialiseerde probleemoplossende taken. </w:t>
+              <w:t xml:space="preserve">Anderen ondersteunen bij het ontwikkelen van hun vaardigheden om digitale technologieën te gebruiken voor complexe of gespecialiseerde probleemoplossende taken. </w:t>
             </w:r>
             <w:r>
               <w:rPr>
@@ -14996,7 +15696,42 @@
             <w:tcW w:type="dxa" w:w="3627"/>
             <w:vMerge w:val="restart"/>
           </w:tcPr>
-          <w:p/>
+          <w:p>
+            <w:r>
+              <w:drawing>
+                <wp:inline xmlns:a="http://schemas.openxmlformats.org/drawingml/2006/main" xmlns:pic="http://schemas.openxmlformats.org/drawingml/2006/picture">
+                  <wp:extent cx="1368000" cy="1315803"/>
+                  <wp:docPr id="21" name="Picture 21"/>
+                  <wp:cNvGraphicFramePr>
+                    <a:graphicFrameLocks noChangeAspect="1"/>
+                  </wp:cNvGraphicFramePr>
+                  <a:graphic>
+                    <a:graphicData uri="http://schemas.openxmlformats.org/drawingml/2006/picture">
+                      <pic:pic>
+                        <pic:nvPicPr>
+                          <pic:cNvPr id="0" name="DC3_5p4.png"/>
+                          <pic:cNvPicPr/>
+                        </pic:nvPicPr>
+                        <pic:blipFill>
+                          <a:blip r:embed="rId29"/>
+                          <a:stretch>
+                            <a:fillRect/>
+                          </a:stretch>
+                        </pic:blipFill>
+                        <pic:spPr>
+                          <a:xfrm>
+                            <a:off x="0" y="0"/>
+                            <a:ext cx="1368000" cy="1315803"/>
+                          </a:xfrm>
+                          <a:prstGeom prst="rect"/>
+                        </pic:spPr>
+                      </pic:pic>
+                    </a:graphicData>
+                  </a:graphic>
+                </wp:inline>
+              </w:drawing>
+            </w:r>
+          </w:p>
           <w:p>
             <w:r>
               <w:rPr>
@@ -15006,7 +15741,7 @@
                 <w:color w:val="E26B67"/>
                 <w:sz w:val="20"/>
               </w:rPr>
-              <w:t>5. HERKENNEN EN OPLOSSEN VAN PROBLEMEN</w:t>
+              <w:t>5. PROBLEEMIDENTIFICATIE EN -OPLOSSING</w:t>
             </w:r>
           </w:p>
           <w:p>
@@ -15018,7 +15753,7 @@
                 <w:color w:val="000000"/>
                 <w:sz w:val="22"/>
               </w:rPr>
-              <w:t>5.4 Herkennen en aanpakken van behoeften op het gebied van digitale competentie</w:t>
+              <w:t>5.4 Behoeften aan digitale competenties identificeren en aanpakken</w:t>
             </w:r>
           </w:p>
           <w:p>
@@ -15030,7 +15765,7 @@
                 <w:color w:val="000000"/>
                 <w:sz w:val="17"/>
               </w:rPr>
-              <w:t>Het erkennen op welk vlak de eigen digitale competentie verbeterd of geactualiseerd moet worden. Het aanpakken van digitale competentiebehoeften binnen een breder proces van een leven lang leren en het opbouwen van bekwaamheid en autonomie. Het ondersteunen van anderen bij de ontwikkeling van hun digitale competentie. Het op de hoogte blijven van digitale technologische ontwikkelingen en de persoonlijke, professionele en maatschappelijke implicaties daarvan.</w:t>
+              <w:t>Herkennen waar de eigen digitale competentie verbeterd of geactualiseerd moet worden. Behoeften aan digitale competenties aanpakken binnen een breder proces van een leven lang leren, en bekwaamheid en autonomie opbouwen. Anderen ondersteunen bij de ontwikkeling van hun digitale competenties. Op de hoogte blijven van digitale technologische ontwikkelingen en de persoonlijke, professionele en maatschappelijke gevolgen daarvan.</w:t>
             </w:r>
           </w:p>
         </w:tc>
@@ -15140,7 +15875,7 @@
                 <w:color w:val="000000"/>
                 <w:sz w:val="18"/>
               </w:rPr>
-              <w:t xml:space="preserve">Mogelijkheden herkennen om de eigen digitale competenties te verbeteren. </w:t>
+              <w:t xml:space="preserve">Mogelijkheden identificeren om de eigen digitale competenties te verbeteren. </w:t>
             </w:r>
             <w:r>
               <w:rPr>
@@ -15177,7 +15912,7 @@
                 <w:color w:val="000000"/>
                 <w:sz w:val="18"/>
               </w:rPr>
-              <w:t>Op intermediairniveau kunnen individuen</w:t>
+              <w:t>Op gemiddeldniveau kunnen individuen</w:t>
             </w:r>
           </w:p>
         </w:tc>
@@ -15205,7 +15940,7 @@
                 <w:color w:val="000000"/>
                 <w:sz w:val="18"/>
               </w:rPr>
-              <w:t xml:space="preserve">De voordelen inzien van het op de hoogte blijven van ontwikkelingen in digitale technologie om leereisen te helpen herkennen. </w:t>
+              <w:t xml:space="preserve">De voordelen inzien van het op de hoogte blijven van ontwikkelingen in digitale technologieën om leereisen te helpen identificeren. </w:t>
             </w:r>
             <w:r>
               <w:rPr>
@@ -15306,7 +16041,7 @@
                 <w:color w:val="000000"/>
                 <w:sz w:val="18"/>
               </w:rPr>
-              <w:t>Op gevorderdniveau kunnen individuen</w:t>
+              <w:t>Op geavanceerdniveau kunnen individuen</w:t>
             </w:r>
           </w:p>
         </w:tc>
@@ -15467,7 +16202,7 @@
                 <w:color w:val="000000"/>
                 <w:sz w:val="18"/>
               </w:rPr>
-              <w:t>Op zeer gevorderdniveau kunnen individuen</w:t>
+              <w:t>Op zeer geavanceerdniveau kunnen individuen</w:t>
             </w:r>
           </w:p>
         </w:tc>
@@ -15527,7 +16262,7 @@
                 <w:color w:val="000000"/>
                 <w:sz w:val="18"/>
               </w:rPr>
-              <w:t xml:space="preserve">Anderen mentoren bij het herkennen en aanpakken van hun digitale competentiebehoeften. </w:t>
+              <w:t xml:space="preserve">Anderen mentoren bij het identificeren en aanpakken van hun digitale competentiebehoeften. </w:t>
             </w:r>
             <w:r>
               <w:rPr>

</xml_diff>